<commit_message>
RAS paper round 26: add SwarmCF-batch to Figure 4(b) (scaling panel)
Figure 4 panel (a) included SwarmCF-batch but panel (b) did not -- a consistency gap.
Re-ran the swarm-size sweep with PTF added (4 methods x 5 sizes x 8 seeds, rho=0.5).

SwarmCF-batch also scales positively, and more steeply than the online variant: unseen skill
0.098 (m=5) -> 0.576 (m=80), overtaking online SwarmCF for large teams (m>=40) as the pooled
observations sharpen its one-shot refit -- the same online/batch crossover seen along rho in
Figure 2, now appearing along team size m. This makes the two panels consistent and shows the
positive scaling is a structural property of the shared low-rank reward (both our variants), not
specific to the online update. Updated the Figure 4 caption and a Section 6.3 sentence;
regenerated figures, paper, and the Word docx. New data file committed for reproducibility.

Co-Authored-By: Claude Opus 4.7 (1M context) <noreply@anthropic.com>
</commit_message>
<xml_diff>
--- a/docs/ras_paper.docx
+++ b/docs/ras_paper.docx
@@ -12459,7 +12459,7 @@
         </m:r>
       </m:oMath>
       <w:r>
-        <w:t xml:space="preserve">): more robots feed more observations into the one shared structure, so each robot's competence on tasks it never engaged grows with the team. Structure-free learning is flat. A swarm that gets smarter as it grows, the opposite of the usual interference penalty, is a direct consequence of sharing structure.</w:t>
+        <w:t xml:space="preserve">): more robots feed more observations into the one shared structure, so each robot's competence on tasks it never engaged grows with the team. The batch variant SwarmCF-batch rises even more steeply (Figure 4b), overtaking the online variant for large teams as the pooled observations sharpen its one-shot refit (mirroring the broadcast-rate crossover of Figure 2), so the positive scaling is a structural property of the shared low-rank reward, not specific to the online update. Structure-free learning is flat. A swarm that gets smarter as it grows, the opposite of the usual interference penalty, is a direct consequence of sharing structure.</w:t>
       </w:r>
     </w:p>
     <w:p>
@@ -12480,7 +12480,7 @@
               <a:graphicData uri="http://schemas.openxmlformats.org/drawingml/2006/picture">
                 <pic:pic>
                   <pic:nvPicPr>
-                    <pic:cNvPr descr="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" id="27" name="Picture"/>
+                    <pic:cNvPr descr="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" id="27" name="Picture"/>
                     <pic:cNvPicPr>
                       <a:picLocks noChangeArrowheads="1" noChangeAspect="1"/>
                     </pic:cNvPicPr>
@@ -12575,7 +12575,7 @@
         </m:r>
       </m:oMath>
       <w:r>
-        <w:t xml:space="preserve">. Both rise for low-rank CF and are flat for structure-free. (SwarmCF-batch is a batch-refit variant of our method, shown for comparison.)</w:t>
+        <w:t xml:space="preserve">. In both panels our online SwarmCF and its batch variant SwarmCF-batch rise (the gain is structural), while structure-free learners stay flat.</w:t>
       </w:r>
     </w:p>
     <w:bookmarkEnd w:id="28"/>

</xml_diff>

<commit_message>
References: renumber by order of first appearance (elsarticle-num)
Added an automatic renumber pass to make_ras_paper.py: at build time the [n]
citations and the reference list are reordered into order of first appearance in
the text (body, then appendices), the elsarticle-num convention. Citations are
matched as [d] or [d,d,...] only, so CI/interval brackets ([0.40, 0.44], set [n])
are never touched; if citations and refs ever disagree the pass is a safe no-op.

Fixes the previously appended refs (now woven in by first use: Prorok [1], Fu [2],
Dupuy [3], Schilling [4], Zhou [5], CSIRO [6], ...) and keeps ordering correct for
any future citation. Verified: appearance order strictly 1..54, no dangling or
orphan refs. Rebuilt ras_paper.html/index.html and ras_paper.docx (54 refs, 491
OMML equations, 12 figures).

Co-Authored-By: Claude Opus 4.7 (1M context) <noreply@anthropic.com>
</commit_message>
<xml_diff>
--- a/docs/ras_paper.docx
+++ b/docs/ras_paper.docx
@@ -445,7 +445,7 @@
         <w:t xml:space="preserve">requirements</w:t>
       </w:r>
       <w:r>
-        <w:t xml:space="preserve">. This capability-requirement view is the basis of trait-based task allocation [5], and the match is typically governed by only a few underlying factors, so the full robot</w:t>
+        <w:t xml:space="preserve">. This capability-requirement view is the basis of trait-based task allocation [1], and the match is typically governed by only a few underlying factors, so the full robot</w:t>
       </w:r>
       <w:r>
         <w:t xml:space="preserve"> </w:t>
@@ -475,7 +475,7 @@
         <w:t xml:space="preserve">low-rank</w:t>
       </w:r>
       <w:r>
-        <w:t xml:space="preserve">. That a few factors suffice is borne out in practice: learned low-dimensional capability and task-requirement models predict real robotic task performance to within a few percent [52], and the analogous two-sided affinity matrix is empirically low-rank in large matching datasets [54].</w:t>
+        <w:t xml:space="preserve">. That a few factors suffice is borne out in practice: learned low-dimensional capability and task-requirement models predict real robotic task performance to within a few percent [2], and the analogous two-sided affinity matrix is empirically low-rank in large matching datasets [3].</w:t>
       </w:r>
     </w:p>
     <w:p>
@@ -545,7 +545,7 @@
         <w:t xml:space="preserve"> </w:t>
       </w:r>
       <w:r>
-        <w:t xml:space="preserve">some of what its teammates are doing and how it turned out, imperfectly, at a distance, and differently from every other robot. This is documented, not hypothetical: fielded drone swarms already coordinate from purely onboard, range- and line-of-sight-limited mutual perception with no inter-robot messaging [49,50], and heterogeneous teams routinely operate under denied or degraded communication, as across the DARPA Subterranean Challenge [51,53]. This is the regime we formalize and solve: a robot observes a</w:t>
+        <w:t xml:space="preserve">some of what its teammates are doing and how it turned out, imperfectly, at a distance, and differently from every other robot. This is documented, not hypothetical: fielded drone swarms already coordinate from purely onboard, range- and line-of-sight-limited mutual perception with no inter-robot messaging [4,5], and heterogeneous teams routinely operate under denied or degraded communication, as across the DARPA Subterranean Challenge [6,7]. This is the regime we formalize and solve: a robot observes a</w:t>
       </w:r>
       <w:r>
         <w:t xml:space="preserve"> </w:t>
@@ -1179,7 +1179,7 @@
         <w:widowControl w:val="1"/>
       </w:pPr>
       <w:r>
-        <w:t xml:space="preserve">Swarm robotics seeks collective competence from simple local rules [38,39], and coverage and patrolling control coordinate where robots</w:t>
+        <w:t xml:space="preserve">Swarm robotics seeks collective competence from simple local rules [8,9], and coverage and patrolling control coordinate where robots</w:t>
       </w:r>
       <w:r>
         <w:t xml:space="preserve"> </w:t>
@@ -1195,7 +1195,7 @@
         <w:t xml:space="preserve"> </w:t>
       </w:r>
       <w:r>
-        <w:t xml:space="preserve">[40]; we instead address which</w:t>
+        <w:t xml:space="preserve">[10]; we instead address which</w:t>
       </w:r>
       <w:r>
         <w:t xml:space="preserve"> </w:t>
@@ -1233,7 +1233,7 @@
         <w:t xml:space="preserve"> </w:t>
       </w:r>
       <w:r>
-        <w:t xml:space="preserve">The taxonomies of Gerkey and Matarić [1], Korsah et al. [2], and Nunes et al. [20] organize MRTA by single/multi-task robots, single/multi-robot tasks, and instantaneous/time-extended assignment with interrelated utilities and temporal constraints. Classical solvers, market and auction mechanisms [3], consensus-based bundle algorithms (CBBA) [4], and distributed constraint optimization achieve coordination through</w:t>
+        <w:t xml:space="preserve">The taxonomies of Gerkey and Matarić [11], Korsah et al. [12], and Nunes et al. [13] organize MRTA by single/multi-task robots, single/multi-robot tasks, and instantaneous/time-extended assignment with interrelated utilities and temporal constraints. Classical solvers, market and auction mechanisms [14], consensus-based bundle algorithms (CBBA) [15], and distributed constraint optimization achieve coordination through</w:t>
       </w:r>
       <w:r>
         <w:t xml:space="preserve"> </w:t>
@@ -1265,7 +1265,7 @@
         <w:t xml:space="preserve"> </w:t>
       </w:r>
       <w:r>
-        <w:t xml:space="preserve">task utilities or costs (surveys: [21]); even work that explicitly limits communication still relies on auctions and messages [22], and a recent review underscores how central communication remains to multi-robot systems [23]. Trait-based and heterogeneity-aware MRTA [5,24,25] matches robot capability vectors to task requirement vectors, but takes the traits as</w:t>
+        <w:t xml:space="preserve">task utilities or costs (surveys: [16]); even work that explicitly limits communication still relies on auctions and messages [17], and a recent review underscores how central communication remains to multi-robot systems [18]. Trait-based and heterogeneity-aware MRTA [1,19,20] matches robot capability vectors to task requirement vectors, but takes the traits as</w:t>
       </w:r>
       <w:r>
         <w:t xml:space="preserve"> </w:t>
@@ -1291,7 +1291,7 @@
         <w:t xml:space="preserve">unknown and learned online</w:t>
       </w:r>
       <w:r>
-        <w:t xml:space="preserve">, with neither communication nor known utilities; recent surveys [18] document the rapid growth of learning-based MRTA, but the prior-free, communication-free regime we study remains unaddressed.</w:t>
+        <w:t xml:space="preserve">, with neither communication nor known utilities; recent surveys [21] document the rapid growth of learning-based MRTA, but the prior-free, communication-free regime we study remains unaddressed.</w:t>
       </w:r>
     </w:p>
     <w:p>
@@ -1313,7 +1313,7 @@
         <w:t xml:space="preserve"> </w:t>
       </w:r>
       <w:r>
-        <w:t xml:space="preserve">Communication-free multiplayer bandits (musical chairs [6], SIC-MMAB [7], game-of-thrones [26]) break symmetry without messages but are</w:t>
+        <w:t xml:space="preserve">Communication-free multiplayer bandits (musical chairs [22], SIC-MMAB [23], game-of-thrones [24]) break symmetry without messages but are</w:t>
       </w:r>
       <w:r>
         <w:t xml:space="preserve"> </w:t>
@@ -1329,7 +1329,7 @@
         <w:t xml:space="preserve"> </w:t>
       </w:r>
       <w:r>
-        <w:t xml:space="preserve">(per-arm), so they cannot generalize to unseen arms. Cooperative multi-agent RL (CTDE: MAPPO [14], QMIX [33], VDN [34], MADDPG [35]) and learned-communication methods (CommNet [15], TarMAC [36], DIAL [37]) rely on centralized training or message passing; recent learning-based decentralized assignment (graph neural networks for goal assignment [19] and scheduling [41]) likewise presumes communication or centralized training. Federated and gossip collaborative filtering [42], and federated learning more broadly [44], coordinate by exchanging model parameters or gradients; we exchange nothing but a passively-sensed outcome stream. Decentralized partially-observable control (Dec-POMDPs [46]) addresses long-horizon coordination under shared latent-state dynamics; our rounds are one-shot offered-set choices with no shared state, so the challenge is cross-task generalization from a privately-masked stream rather than long-horizon credit assignment.</w:t>
+        <w:t xml:space="preserve">(per-arm), so they cannot generalize to unseen arms. Cooperative multi-agent RL (CTDE: MAPPO [25], QMIX [26], VDN [27], MADDPG [28]) and learned-communication methods (CommNet [29], TarMAC [30], DIAL [31]) rely on centralized training or message passing; recent learning-based decentralized assignment (graph neural networks for goal assignment [32] and scheduling [33]) likewise presumes communication or centralized training. Federated and gossip collaborative filtering [34], and federated learning more broadly [35], coordinate by exchanging model parameters or gradients; we exchange nothing but a passively-sensed outcome stream. Decentralized partially-observable control (Dec-POMDPs [36]) addresses long-horizon coordination under shared latent-state dynamics; our rounds are one-shot offered-set choices with no shared state, so the challenge is cross-task generalization from a privately-masked stream rather than long-horizon credit assignment.</w:t>
       </w:r>
     </w:p>
     <w:p>
@@ -1351,7 +1351,7 @@
         <w:t xml:space="preserve"> </w:t>
       </w:r>
       <w:r>
-        <w:t xml:space="preserve">Matrix completion gives centralized recovery guarantees under (near-)uniform sampling [8,9,27,28], with practical factorization estimators (matrix factorization [13], Bayesian PMF [11], soft-impute [12], implicit-feedback ALS [31], ranking CF [32]); low-rank and bilinear bandits (explore-then-spectral [10], bilinear [29], generalized-linear [30], clustering-of-bandits [16]) are centralized and/or phase-structured. Decentralized matrix completion [43] distributes the factorization across nodes but still exchanges factors or residuals over a connected communication graph; we forbid all such exchange and recover from passive observation alone. We make estimation decentralized, online, broadcast-only, and robust to a structured (non-uniform) per-robot observation mask, with the unseen-pair error floor turning the gap into a categorical, rather than constant-factor, separation.</w:t>
+        <w:t xml:space="preserve">Matrix completion gives centralized recovery guarantees under (near-)uniform sampling [37,38,39,40], with practical factorization estimators (matrix factorization [41], Bayesian PMF [42], soft-impute [43], implicit-feedback ALS [44], ranking CF [45]); low-rank and bilinear bandits (explore-then-spectral [46], bilinear [47], generalized-linear [48], clustering-of-bandits [49]) are centralized and/or phase-structured. Decentralized matrix completion [50] distributes the factorization across nodes but still exchanges factors or residuals over a connected communication graph; we forbid all such exchange and recover from passive observation alone. We make estimation decentralized, online, broadcast-only, and robust to a structured (non-uniform) per-robot observation mask, with the unseen-pair error floor turning the gap into a categorical, rather than constant-factor, separation.</w:t>
       </w:r>
     </w:p>
     <w:p>
@@ -1616,7 +1616,7 @@
                 <w:rFonts w:ascii="Times New Roman" w:hAnsi="Times New Roman"/>
                 <w:sz w:val="20"/>
               </w:rPr>
-              <w:t xml:space="preserve">Auction / consensus / DCOP MRTA [3,4]</w:t>
+              <w:t xml:space="preserve">Auction / consensus / DCOP MRTA [14,15]</w:t>
             </w:r>
           </w:p>
         </w:tc>
@@ -1780,7 +1780,7 @@
                 <w:rFonts w:ascii="Times New Roman" w:hAnsi="Times New Roman"/>
                 <w:sz w:val="20"/>
               </w:rPr>
-              <w:t xml:space="preserve">Cooperative MARL (CTDE) [14,33]</w:t>
+              <w:t xml:space="preserve">Cooperative MARL (CTDE) [25,26]</w:t>
             </w:r>
           </w:p>
         </w:tc>
@@ -1944,7 +1944,7 @@
                 <w:rFonts w:ascii="Times New Roman" w:hAnsi="Times New Roman"/>
                 <w:sz w:val="20"/>
               </w:rPr>
-              <w:t xml:space="preserve">No-communication multiplayer bandits [6,7]</w:t>
+              <w:t xml:space="preserve">No-communication multiplayer bandits [22,23]</w:t>
             </w:r>
           </w:p>
         </w:tc>
@@ -2108,7 +2108,7 @@
                 <w:rFonts w:ascii="Times New Roman" w:hAnsi="Times New Roman"/>
                 <w:sz w:val="20"/>
               </w:rPr>
-              <w:t xml:space="preserve">Low-rank completion / bandits [8,10]</w:t>
+              <w:t xml:space="preserve">Low-rank completion / bandits [37,46]</w:t>
             </w:r>
           </w:p>
         </w:tc>
@@ -2272,7 +2272,7 @@
                 <w:rFonts w:ascii="Times New Roman" w:hAnsi="Times New Roman"/>
                 <w:sz w:val="20"/>
               </w:rPr>
-              <w:t xml:space="preserve">Federated / gossip CF [42,44]</w:t>
+              <w:t xml:space="preserve">Federated / gossip CF [34,35]</w:t>
             </w:r>
           </w:p>
         </w:tc>
@@ -2436,7 +2436,7 @@
                 <w:rFonts w:ascii="Times New Roman" w:hAnsi="Times New Roman"/>
                 <w:sz w:val="20"/>
               </w:rPr>
-              <w:t xml:space="preserve">Trait-based MRTA [5,25]</w:t>
+              <w:t xml:space="preserve">Trait-based MRTA [1,20]</w:t>
             </w:r>
           </w:p>
         </w:tc>
@@ -4316,7 +4316,7 @@
         <w:widowControl w:val="1"/>
       </w:pPr>
       <w:r>
-        <w:t xml:space="preserve">This channel is the formal counterpart of physical sensing: a robot perceives a teammate's engagement and its outcome only when the teammate is within range (the persistent partial mask) and reads it with a fidelity that degrades with distance and with its own sensor (the per-observer noise), so it is physically realizable rather than a convenient abstraction: onboard, range-limited mutual perception without communication already drives real drone swarms [49,50]. Concretely, a robot can often assess a teammate's outcome by direct observation (for example, seeing whether a surveilled area was in fact covered, or whether a serviced target stopped emitting) without any message from the teammate; where only the teammate's action (which task it engaged), and not its scalar outcome, is observable, an action/choice channel is the natural fallback, which we develop in a follow-up. It is strictly weaker than the shared, clean broadcast usually assumed, and it makes decentralization</w:t>
+        <w:t xml:space="preserve">This channel is the formal counterpart of physical sensing: a robot perceives a teammate's engagement and its outcome only when the teammate is within range (the persistent partial mask) and reads it with a fidelity that degrades with distance and with its own sensor (the per-observer noise), so it is physically realizable rather than a convenient abstraction: onboard, range-limited mutual perception without communication already drives real drone swarms [4,5]. Concretely, a robot can often assess a teammate's outcome by direct observation (for example, seeing whether a surveilled area was in fact covered, or whether a serviced target stopped emitting) without any message from the teammate; where only the teammate's action (which task it engaged), and not its scalar outcome, is observable, an action/choice channel is the natural fallback, which we develop in a follow-up. It is strictly weaker than the shared, clean broadcast usually assumed, and it makes decentralization</w:t>
       </w:r>
       <w:r>
         <w:t xml:space="preserve"> </w:t>
@@ -4552,7 +4552,7 @@
         <w:t xml:space="preserve"> </w:t>
       </w:r>
       <w:r>
-        <w:t xml:space="preserve">(a Murphy skill score [17] / normalized return),</w:t>
+        <w:t xml:space="preserve">(a Murphy skill score [51] / normalized return),</w:t>
       </w:r>
     </w:p>
     <w:p>
@@ -4994,7 +4994,7 @@
         <w:t xml:space="preserve"> </w:t>
       </w:r>
       <w:r>
-        <w:t xml:space="preserve">(weighted ridge ALS [28,31], a standard estimator for low-rank completion) on the observed entries. The key design choice for masking-robustness: an unobserved entry receives zero</w:t>
+        <w:t xml:space="preserve">(weighted ridge ALS [40,44], a standard estimator for low-rank completion) on the observed entries. The key design choice for masking-robustness: an unobserved entry receives zero</w:t>
       </w:r>
       <w:r>
         <w:t xml:space="preserve"> </w:t>
@@ -6090,7 +6090,7 @@
           <w:b/>
           <w:bCs/>
         </w:rPr>
-        <w:t xml:space="preserve">New-task onboarding (fold-in [48]).</w:t>
+        <w:t xml:space="preserve">New-task onboarding (fold-in [52]).</w:t>
       </w:r>
       <w:r>
         <w:t xml:space="preserve"> </w:t>
@@ -10421,7 +10421,7 @@
         <w:t xml:space="preserve"> </w:t>
       </w:r>
       <w:r>
-        <w:t xml:space="preserve">The setting itself is new, so this is a controlled sweep across the low-rank design space against the genuinely external structure-free paradigm and full-information reference ceilings, not a contest of rival systems. SwarmCF is our method; structure-free learners (Independent-UCB, a per-arm UCB1 [45]; tabular) are the external paradigm; standard low-rank estimators (online MF-SGD, batch spectral and Bayesian completion) are adapted to the setting for the low-rank comparison; the Oracle and a centralized full-communication matcher are upper bounds, not competitors. We emphasize that communication-based methods (auctions/CBBA, CTDE training, federated/gossip CF) are</w:t>
+        <w:t xml:space="preserve">The setting itself is new, so this is a controlled sweep across the low-rank design space against the genuinely external structure-free paradigm and full-information reference ceilings, not a contest of rival systems. SwarmCF is our method; structure-free learners (Independent-UCB, a per-arm UCB1 [53]; tabular) are the external paradigm; standard low-rank estimators (online MF-SGD, batch spectral and Bayesian completion) are adapted to the setting for the low-rank comparison; the Oracle and a centralized full-communication matcher are upper bounds, not competitors. We emphasize that communication-based methods (auctions/CBBA, CTDE training, federated/gossip CF) are</w:t>
       </w:r>
       <w:r>
         <w:t xml:space="preserve"> </w:t>
@@ -13812,7 +13812,7 @@
         <w:t xml:space="preserve"> </w:t>
       </w:r>
       <w:r>
-        <w:t xml:space="preserve">(upper bounds, not competitors): a centralized full-communication matcher that sees every reward and computes the optimal one-to-one robot-task assignment by Hungarian matching [47], evaluated both with clean (noiseless) observation and under the realistic per-observer noise. Under limited observability (</w:t>
+        <w:t xml:space="preserve">(upper bounds, not competitors): a centralized full-communication matcher that sees every reward and computes the optimal one-to-one robot-task assignment by Hungarian matching [54], evaluated both with clean (noiseless) observation and under the realistic per-observer noise. Under limited observability (</w:t>
       </w:r>
       <m:oMath>
         <m:r>
@@ -17235,7 +17235,7 @@
         <w:t xml:space="preserve"> </w:t>
       </w:r>
       <w:r>
-        <w:t xml:space="preserve">by construction (a capability-aggregation model in the style of trait-based heterogeneous MRTA [5,24,25]); and the observation mask is a</w:t>
+        <w:t xml:space="preserve">by construction (a capability-aggregation model in the style of trait-based heterogeneous MRTA [1,19,20]); and the observation mask is a</w:t>
       </w:r>
       <w:r>
         <w:t xml:space="preserve"> </w:t>
@@ -17353,7 +17353,7 @@
         </m:sSup>
       </m:oMath>
       <w:r>
-        <w:t xml:space="preserve">, the free-space sensing law of coverage control [40]). Positions are thus load-bearing rather than inert, and visibility is persistent because the patrol geometry is quasi-static. Under capacity-1 contention and a randomly guessed rank, the categorical separation holds: SwarmCF reaches unseen-pair skill</w:t>
+        <w:t xml:space="preserve">, the free-space sensing law of coverage control [10]). Positions are thus load-bearing rather than inert, and visibility is persistent because the patrol geometry is quasi-static. Under capacity-1 contention and a randomly guessed rank, the categorical separation holds: SwarmCF reaches unseen-pair skill</w:t>
       </w:r>
       <w:r>
         <w:t xml:space="preserve"> </w:t>
@@ -18061,7 +18061,7 @@
         <w:widowControl w:val="1"/>
       </w:pPr>
       <w:r>
-        <w:t xml:space="preserve">B. P. Gerkey, M. J. Matarić. A formal analysis and taxonomy of task allocation in multi-robot systems.</w:t>
+        <w:t xml:space="preserve">A. Prorok, M. A. Hsieh, V. Kumar. The impact of diversity on optimal control policies for heterogeneous robot swarms.</w:t>
       </w:r>
       <w:r>
         <w:t xml:space="preserve"> </w:t>
@@ -18071,10 +18071,10 @@
           <w:i/>
           <w:iCs/>
         </w:rPr>
-        <w:t xml:space="preserve">Int. J. Robotics Research</w:t>
-      </w:r>
-      <w:r>
-        <w:t xml:space="preserve">, 23(9):939–954, 2004.</w:t>
+        <w:t xml:space="preserve">IEEE Trans. Robotics</w:t>
+      </w:r>
+      <w:r>
+        <w:t xml:space="preserve">, 33(2):346–358, 2017.</w:t>
       </w:r>
     </w:p>
     <w:p>
@@ -18090,7 +18090,7 @@
         <w:widowControl w:val="1"/>
       </w:pPr>
       <w:r>
-        <w:t xml:space="preserve">G. A. Korsah, A. Stentz, M. B. Dias. A comprehensive taxonomy for multi-robot task allocation.</w:t>
+        <w:t xml:space="preserve">B. Fu, W. Smith, D. Rizzo, M. Castanier, M. Ghaffari, K. Barton. Learning task requirements and agent capabilities for multi-agent task allocation.</w:t>
       </w:r>
       <w:r>
         <w:t xml:space="preserve"> </w:t>
@@ -18100,10 +18100,10 @@
           <w:i/>
           <w:iCs/>
         </w:rPr>
-        <w:t xml:space="preserve">Int. J. Robotics Research</w:t>
-      </w:r>
-      <w:r>
-        <w:t xml:space="preserve">, 32(12):1495–1512, 2013.</w:t>
+        <w:t xml:space="preserve">arXiv:2211.03286</w:t>
+      </w:r>
+      <w:r>
+        <w:t xml:space="preserve">, 2022.</w:t>
       </w:r>
     </w:p>
     <w:p>
@@ -18119,7 +18119,7 @@
         <w:widowControl w:val="1"/>
       </w:pPr>
       <w:r>
-        <w:t xml:space="preserve">M. B. Dias, R. Zlot, N. Kalra, A. Stentz. Market-based multirobot coordination: a survey and analysis.</w:t>
+        <w:t xml:space="preserve">A. Dupuy, A. Galichon. Personality traits and the marriage market.</w:t>
       </w:r>
       <w:r>
         <w:t xml:space="preserve"> </w:t>
@@ -18129,10 +18129,10 @@
           <w:i/>
           <w:iCs/>
         </w:rPr>
-        <w:t xml:space="preserve">Proc. IEEE</w:t>
-      </w:r>
-      <w:r>
-        <w:t xml:space="preserve">, 94(7):1257–1270, 2006.</w:t>
+        <w:t xml:space="preserve">Journal of Political Economy</w:t>
+      </w:r>
+      <w:r>
+        <w:t xml:space="preserve">, 122(6):1271–1319, 2014.</w:t>
       </w:r>
     </w:p>
     <w:p>
@@ -18148,7 +18148,7 @@
         <w:widowControl w:val="1"/>
       </w:pPr>
       <w:r>
-        <w:t xml:space="preserve">H.-L. Choi, L. Brunet, J. P. How. Consensus-based decentralized auctions for robust task allocation.</w:t>
+        <w:t xml:space="preserve">F. Schilling, F. Schiano, D. Floreano. Vision-based drone flocking in outdoor environments.</w:t>
       </w:r>
       <w:r>
         <w:t xml:space="preserve"> </w:t>
@@ -18158,10 +18158,10 @@
           <w:i/>
           <w:iCs/>
         </w:rPr>
-        <w:t xml:space="preserve">IEEE Trans. Robotics</w:t>
-      </w:r>
-      <w:r>
-        <w:t xml:space="preserve">, 25(4):912–926, 2009.</w:t>
+        <w:t xml:space="preserve">IEEE Robotics and Automation Letters</w:t>
+      </w:r>
+      <w:r>
+        <w:t xml:space="preserve">, 6(2):2954–2961, 2021.</w:t>
       </w:r>
     </w:p>
     <w:p>
@@ -18177,7 +18177,7 @@
         <w:widowControl w:val="1"/>
       </w:pPr>
       <w:r>
-        <w:t xml:space="preserve">A. Prorok, M. A. Hsieh, V. Kumar. The impact of diversity on optimal control policies for heterogeneous robot swarms.</w:t>
+        <w:t xml:space="preserve">X. Zhou, X. Wen, Z. Wang, Y. Gao, et al. Swarm of micro flying robots in the wild.</w:t>
       </w:r>
       <w:r>
         <w:t xml:space="preserve"> </w:t>
@@ -18187,10 +18187,10 @@
           <w:i/>
           <w:iCs/>
         </w:rPr>
-        <w:t xml:space="preserve">IEEE Trans. Robotics</w:t>
-      </w:r>
-      <w:r>
-        <w:t xml:space="preserve">, 33(2):346–358, 2017.</w:t>
+        <w:t xml:space="preserve">Science Robotics</w:t>
+      </w:r>
+      <w:r>
+        <w:t xml:space="preserve">, 7(66):eabm5954, 2022.</w:t>
       </w:r>
     </w:p>
     <w:p>
@@ -18206,7 +18206,7 @@
         <w:widowControl w:val="1"/>
       </w:pPr>
       <w:r>
-        <w:t xml:space="preserve">J. Rosenski, O. Shamir, L. Szlak. Multi-player bandits: a musical chairs approach.</w:t>
+        <w:t xml:space="preserve">N. Hudson, F. Talbot, M. Cox, et al. Heterogeneous ground and air platforms, homogeneous sensing: Team CSIRO Data61's approach to the DARPA Subterranean Challenge.</w:t>
       </w:r>
       <w:r>
         <w:t xml:space="preserve"> </w:t>
@@ -18216,10 +18216,10 @@
           <w:i/>
           <w:iCs/>
         </w:rPr>
-        <w:t xml:space="preserve">ICML</w:t>
-      </w:r>
-      <w:r>
-        <w:t xml:space="preserve">, 2016.</w:t>
+        <w:t xml:space="preserve">Field Robotics</w:t>
+      </w:r>
+      <w:r>
+        <w:t xml:space="preserve">, 2:595–636, 2022.</w:t>
       </w:r>
     </w:p>
     <w:p>
@@ -18235,7 +18235,7 @@
         <w:widowControl w:val="1"/>
       </w:pPr>
       <w:r>
-        <w:t xml:space="preserve">E. Boursier, V. Perchet. SIC-MMAB: synchronisation involves communication in multiplayer multi-armed bandits.</w:t>
+        <w:t xml:space="preserve">M. Tranzatto, M. Dharmadhikari, L. Bernreiter, et al. Team CERBERUS wins the DARPA Subterranean Challenge: technical overview and lessons learned.</w:t>
       </w:r>
       <w:r>
         <w:t xml:space="preserve"> </w:t>
@@ -18245,10 +18245,10 @@
           <w:i/>
           <w:iCs/>
         </w:rPr>
-        <w:t xml:space="preserve">NeurIPS</w:t>
-      </w:r>
-      <w:r>
-        <w:t xml:space="preserve">, 2019.</w:t>
+        <w:t xml:space="preserve">arXiv:2207.04914</w:t>
+      </w:r>
+      <w:r>
+        <w:t xml:space="preserve">, 2022.</w:t>
       </w:r>
     </w:p>
     <w:p>
@@ -18264,7 +18264,7 @@
         <w:widowControl w:val="1"/>
       </w:pPr>
       <w:r>
-        <w:t xml:space="preserve">E. J. Candès, B. Recht. Exact matrix completion via convex optimization.</w:t>
+        <w:t xml:space="preserve">M. Brambilla, E. Ferrante, M. Birattari, M. Dorigo. Swarm robotics: a review from the swarm engineering perspective.</w:t>
       </w:r>
       <w:r>
         <w:t xml:space="preserve"> </w:t>
@@ -18274,10 +18274,10 @@
           <w:i/>
           <w:iCs/>
         </w:rPr>
-        <w:t xml:space="preserve">Found. Comput. Math.</w:t>
-      </w:r>
-      <w:r>
-        <w:t xml:space="preserve">, 9(6):717–772, 2009.</w:t>
+        <w:t xml:space="preserve">Swarm Intelligence</w:t>
+      </w:r>
+      <w:r>
+        <w:t xml:space="preserve">, 7:1–41, 2013.</w:t>
       </w:r>
     </w:p>
     <w:p>
@@ -18293,7 +18293,7 @@
         <w:widowControl w:val="1"/>
       </w:pPr>
       <w:r>
-        <w:t xml:space="preserve">R. H. Keshavan, A. Montanari, S. Oh. Matrix completion from a few entries.</w:t>
+        <w:t xml:space="preserve">E. Şahin. Swarm robotics: from sources of inspiration to domains of application.</w:t>
       </w:r>
       <w:r>
         <w:t xml:space="preserve"> </w:t>
@@ -18303,10 +18303,10 @@
           <w:i/>
           <w:iCs/>
         </w:rPr>
-        <w:t xml:space="preserve">IEEE Trans. Inf. Theory</w:t>
-      </w:r>
-      <w:r>
-        <w:t xml:space="preserve">, 56(6):2980–2998, 2010.</w:t>
+        <w:t xml:space="preserve">LNCS 3342</w:t>
+      </w:r>
+      <w:r>
+        <w:t xml:space="preserve">, Springer, 2005.</w:t>
       </w:r>
     </w:p>
     <w:p>
@@ -18322,7 +18322,7 @@
         <w:widowControl w:val="1"/>
       </w:pPr>
       <w:r>
-        <w:t xml:space="preserve">Y. Kang, C.-J. Hsieh, T. C. M. Lee. Efficient frameworks for generalized low-rank matrix bandit problems.</w:t>
+        <w:t xml:space="preserve">J. Cortés, S. Martínez, T. Karatas, F. Bullo. Coverage control for mobile sensing networks.</w:t>
       </w:r>
       <w:r>
         <w:t xml:space="preserve"> </w:t>
@@ -18332,10 +18332,10 @@
           <w:i/>
           <w:iCs/>
         </w:rPr>
-        <w:t xml:space="preserve">NeurIPS</w:t>
-      </w:r>
-      <w:r>
-        <w:t xml:space="preserve">, 2022.</w:t>
+        <w:t xml:space="preserve">IEEE Trans. Robotics and Automation</w:t>
+      </w:r>
+      <w:r>
+        <w:t xml:space="preserve">, 20(2):243–255, 2004.</w:t>
       </w:r>
     </w:p>
     <w:p>
@@ -18351,7 +18351,7 @@
         <w:widowControl w:val="1"/>
       </w:pPr>
       <w:r>
-        <w:t xml:space="preserve">R. Salakhutdinov, A. Mnih. Bayesian probabilistic matrix factorization using MCMC.</w:t>
+        <w:t xml:space="preserve">B. P. Gerkey, M. J. Matarić. A formal analysis and taxonomy of task allocation in multi-robot systems.</w:t>
       </w:r>
       <w:r>
         <w:t xml:space="preserve"> </w:t>
@@ -18361,10 +18361,10 @@
           <w:i/>
           <w:iCs/>
         </w:rPr>
-        <w:t xml:space="preserve">ICML</w:t>
-      </w:r>
-      <w:r>
-        <w:t xml:space="preserve">, 2008.</w:t>
+        <w:t xml:space="preserve">Int. J. Robotics Research</w:t>
+      </w:r>
+      <w:r>
+        <w:t xml:space="preserve">, 23(9):939–954, 2004.</w:t>
       </w:r>
     </w:p>
     <w:p>
@@ -18380,7 +18380,7 @@
         <w:widowControl w:val="1"/>
       </w:pPr>
       <w:r>
-        <w:t xml:space="preserve">R. Mazumder, T. Hastie, R. Tibshirani. Spectral regularization algorithms for learning large incomplete matrices.</w:t>
+        <w:t xml:space="preserve">G. A. Korsah, A. Stentz, M. B. Dias. A comprehensive taxonomy for multi-robot task allocation.</w:t>
       </w:r>
       <w:r>
         <w:t xml:space="preserve"> </w:t>
@@ -18390,10 +18390,10 @@
           <w:i/>
           <w:iCs/>
         </w:rPr>
-        <w:t xml:space="preserve">JMLR</w:t>
-      </w:r>
-      <w:r>
-        <w:t xml:space="preserve">, 11:2287–2322, 2010.</w:t>
+        <w:t xml:space="preserve">Int. J. Robotics Research</w:t>
+      </w:r>
+      <w:r>
+        <w:t xml:space="preserve">, 32(12):1495–1512, 2013.</w:t>
       </w:r>
     </w:p>
     <w:p>
@@ -18409,7 +18409,7 @@
         <w:widowControl w:val="1"/>
       </w:pPr>
       <w:r>
-        <w:t xml:space="preserve">Y. Koren, R. Bell, C. Volinsky. Matrix factorization techniques for recommender systems.</w:t>
+        <w:t xml:space="preserve">E. Nunes, M. Manner, H. Mitiche, M. Gini. A taxonomy for task allocation problems with temporal and ordering constraints.</w:t>
       </w:r>
       <w:r>
         <w:t xml:space="preserve"> </w:t>
@@ -18419,10 +18419,10 @@
           <w:i/>
           <w:iCs/>
         </w:rPr>
-        <w:t xml:space="preserve">IEEE Computer</w:t>
-      </w:r>
-      <w:r>
-        <w:t xml:space="preserve">, 42(8):30–37, 2009.</w:t>
+        <w:t xml:space="preserve">Robotics and Autonomous Systems</w:t>
+      </w:r>
+      <w:r>
+        <w:t xml:space="preserve">, 90:55–70, 2017.</w:t>
       </w:r>
     </w:p>
     <w:p>
@@ -18438,7 +18438,7 @@
         <w:widowControl w:val="1"/>
       </w:pPr>
       <w:r>
-        <w:t xml:space="preserve">C. Yu, A. Velu, E. Vinitsky, et al. The surprising effectiveness of PPO in cooperative multi-agent games.</w:t>
+        <w:t xml:space="preserve">M. B. Dias, R. Zlot, N. Kalra, A. Stentz. Market-based multirobot coordination: a survey and analysis.</w:t>
       </w:r>
       <w:r>
         <w:t xml:space="preserve"> </w:t>
@@ -18448,10 +18448,10 @@
           <w:i/>
           <w:iCs/>
         </w:rPr>
-        <w:t xml:space="preserve">NeurIPS</w:t>
-      </w:r>
-      <w:r>
-        <w:t xml:space="preserve">, 2022.</w:t>
+        <w:t xml:space="preserve">Proc. IEEE</w:t>
+      </w:r>
+      <w:r>
+        <w:t xml:space="preserve">, 94(7):1257–1270, 2006.</w:t>
       </w:r>
     </w:p>
     <w:p>
@@ -18467,7 +18467,7 @@
         <w:widowControl w:val="1"/>
       </w:pPr>
       <w:r>
-        <w:t xml:space="preserve">S. Sukhbaatar, A. Szlam, R. Fergus. Learning multiagent communication with backpropagation.</w:t>
+        <w:t xml:space="preserve">H.-L. Choi, L. Brunet, J. P. How. Consensus-based decentralized auctions for robust task allocation.</w:t>
       </w:r>
       <w:r>
         <w:t xml:space="preserve"> </w:t>
@@ -18477,10 +18477,10 @@
           <w:i/>
           <w:iCs/>
         </w:rPr>
-        <w:t xml:space="preserve">NeurIPS</w:t>
-      </w:r>
-      <w:r>
-        <w:t xml:space="preserve">, 2016.</w:t>
+        <w:t xml:space="preserve">IEEE Trans. Robotics</w:t>
+      </w:r>
+      <w:r>
+        <w:t xml:space="preserve">, 25(4):912–926, 2009.</w:t>
       </w:r>
     </w:p>
     <w:p>
@@ -18496,7 +18496,7 @@
         <w:widowControl w:val="1"/>
       </w:pPr>
       <w:r>
-        <w:t xml:space="preserve">C. Gentile, S. Li, G. Zappella. Online clustering of bandits.</w:t>
+        <w:t xml:space="preserve">A. Khamis, A. Hussein, A. Elmogy. Multi-robot task allocation: a review of the state-of-the-art. In</w:t>
       </w:r>
       <w:r>
         <w:t xml:space="preserve"> </w:t>
@@ -18506,10 +18506,10 @@
           <w:i/>
           <w:iCs/>
         </w:rPr>
-        <w:t xml:space="preserve">ICML</w:t>
-      </w:r>
-      <w:r>
-        <w:t xml:space="preserve">, 2014.</w:t>
+        <w:t xml:space="preserve">Cooperative Robots and Sensor Networks</w:t>
+      </w:r>
+      <w:r>
+        <w:t xml:space="preserve">, Springer, 2015.</w:t>
       </w:r>
     </w:p>
     <w:p>
@@ -18525,7 +18525,7 @@
         <w:widowControl w:val="1"/>
       </w:pPr>
       <w:r>
-        <w:t xml:space="preserve">A. H. Murphy. Skill scores based on the mean square error and their relationships to the correlation coefficient.</w:t>
+        <w:t xml:space="preserve">M. Otte, M. J. Kuhlman, D. Sofge. Auctions for multi-robot task allocation in communication limited environments.</w:t>
       </w:r>
       <w:r>
         <w:t xml:space="preserve"> </w:t>
@@ -18535,10 +18535,10 @@
           <w:i/>
           <w:iCs/>
         </w:rPr>
-        <w:t xml:space="preserve">Monthly Weather Review</w:t>
-      </w:r>
-      <w:r>
-        <w:t xml:space="preserve">, 116:2417–2424, 1988.</w:t>
+        <w:t xml:space="preserve">Autonomous Robots</w:t>
+      </w:r>
+      <w:r>
+        <w:t xml:space="preserve">, 44:547–584, 2020.</w:t>
       </w:r>
     </w:p>
     <w:p>
@@ -18554,7 +18554,7 @@
         <w:widowControl w:val="1"/>
       </w:pPr>
       <w:r>
-        <w:t xml:space="preserve">Athira K. A., J. Divya Udayan, U. Subramaniam. A systematic literature review on multi-robot task allocation.</w:t>
+        <w:t xml:space="preserve">J. Gielis, A. Shankar, A. Prorok. A critical review of communications in multi-robot systems.</w:t>
       </w:r>
       <w:r>
         <w:t xml:space="preserve"> </w:t>
@@ -18564,10 +18564,10 @@
           <w:i/>
           <w:iCs/>
         </w:rPr>
-        <w:t xml:space="preserve">ACM Computing Surveys</w:t>
-      </w:r>
-      <w:r>
-        <w:t xml:space="preserve">, 2024.</w:t>
+        <w:t xml:space="preserve">Current Robotics Reports</w:t>
+      </w:r>
+      <w:r>
+        <w:t xml:space="preserve">, 3:213–225, 2022.</w:t>
       </w:r>
     </w:p>
     <w:p>
@@ -18583,7 +18583,7 @@
         <w:widowControl w:val="1"/>
       </w:pPr>
       <w:r>
-        <w:t xml:space="preserve">P. Goarin, G. Loianno. Graph neural network for decentralized multi-robot goal assignment.</w:t>
+        <w:t xml:space="preserve">G. Notomista, S. Mayya, S. Hutchinson, M. Egerstedt. An optimal task allocation strategy for heterogeneous multi-robot systems.</w:t>
       </w:r>
       <w:r>
         <w:t xml:space="preserve"> </w:t>
@@ -18593,10 +18593,10 @@
           <w:i/>
           <w:iCs/>
         </w:rPr>
-        <w:t xml:space="preserve">IEEE Robotics and Automation Letters</w:t>
-      </w:r>
-      <w:r>
-        <w:t xml:space="preserve">, 2024.</w:t>
+        <w:t xml:space="preserve">European Control Conference</w:t>
+      </w:r>
+      <w:r>
+        <w:t xml:space="preserve">, 2019.</w:t>
       </w:r>
     </w:p>
     <w:p>
@@ -18612,7 +18612,7 @@
         <w:widowControl w:val="1"/>
       </w:pPr>
       <w:r>
-        <w:t xml:space="preserve">E. Nunes, M. Manner, H. Mitiche, M. Gini. A taxonomy for task allocation problems with temporal and ordering constraints.</w:t>
+        <w:t xml:space="preserve">H. Ravichandar, K. Shaw, S. Chernova. STRATA: a unified framework for task assignments in large teams of heterogeneous agents.</w:t>
       </w:r>
       <w:r>
         <w:t xml:space="preserve"> </w:t>
@@ -18622,10 +18622,10 @@
           <w:i/>
           <w:iCs/>
         </w:rPr>
-        <w:t xml:space="preserve">Robotics and Autonomous Systems</w:t>
-      </w:r>
-      <w:r>
-        <w:t xml:space="preserve">, 90:55–70, 2017.</w:t>
+        <w:t xml:space="preserve">Autonomous Agents and Multi-Agent Systems</w:t>
+      </w:r>
+      <w:r>
+        <w:t xml:space="preserve">, 34:38, 2020.</w:t>
       </w:r>
     </w:p>
     <w:p>
@@ -18641,7 +18641,7 @@
         <w:widowControl w:val="1"/>
       </w:pPr>
       <w:r>
-        <w:t xml:space="preserve">A. Khamis, A. Hussein, A. Elmogy. Multi-robot task allocation: a review of the state-of-the-art. In</w:t>
+        <w:t xml:space="preserve">Athira K. A., J. Divya Udayan, U. Subramaniam. A systematic literature review on multi-robot task allocation.</w:t>
       </w:r>
       <w:r>
         <w:t xml:space="preserve"> </w:t>
@@ -18651,10 +18651,10 @@
           <w:i/>
           <w:iCs/>
         </w:rPr>
-        <w:t xml:space="preserve">Cooperative Robots and Sensor Networks</w:t>
-      </w:r>
-      <w:r>
-        <w:t xml:space="preserve">, Springer, 2015.</w:t>
+        <w:t xml:space="preserve">ACM Computing Surveys</w:t>
+      </w:r>
+      <w:r>
+        <w:t xml:space="preserve">, 2024.</w:t>
       </w:r>
     </w:p>
     <w:p>
@@ -18670,7 +18670,7 @@
         <w:widowControl w:val="1"/>
       </w:pPr>
       <w:r>
-        <w:t xml:space="preserve">M. Otte, M. J. Kuhlman, D. Sofge. Auctions for multi-robot task allocation in communication limited environments.</w:t>
+        <w:t xml:space="preserve">J. Rosenski, O. Shamir, L. Szlak. Multi-player bandits: a musical chairs approach.</w:t>
       </w:r>
       <w:r>
         <w:t xml:space="preserve"> </w:t>
@@ -18680,10 +18680,10 @@
           <w:i/>
           <w:iCs/>
         </w:rPr>
-        <w:t xml:space="preserve">Autonomous Robots</w:t>
-      </w:r>
-      <w:r>
-        <w:t xml:space="preserve">, 44:547–584, 2020.</w:t>
+        <w:t xml:space="preserve">ICML</w:t>
+      </w:r>
+      <w:r>
+        <w:t xml:space="preserve">, 2016.</w:t>
       </w:r>
     </w:p>
     <w:p>
@@ -18699,7 +18699,7 @@
         <w:widowControl w:val="1"/>
       </w:pPr>
       <w:r>
-        <w:t xml:space="preserve">J. Gielis, A. Shankar, A. Prorok. A critical review of communications in multi-robot systems.</w:t>
+        <w:t xml:space="preserve">E. Boursier, V. Perchet. SIC-MMAB: synchronisation involves communication in multiplayer multi-armed bandits.</w:t>
       </w:r>
       <w:r>
         <w:t xml:space="preserve"> </w:t>
@@ -18709,10 +18709,10 @@
           <w:i/>
           <w:iCs/>
         </w:rPr>
-        <w:t xml:space="preserve">Current Robotics Reports</w:t>
-      </w:r>
-      <w:r>
-        <w:t xml:space="preserve">, 3:213–225, 2022.</w:t>
+        <w:t xml:space="preserve">NeurIPS</w:t>
+      </w:r>
+      <w:r>
+        <w:t xml:space="preserve">, 2019.</w:t>
       </w:r>
     </w:p>
     <w:p>
@@ -18728,7 +18728,7 @@
         <w:widowControl w:val="1"/>
       </w:pPr>
       <w:r>
-        <w:t xml:space="preserve">G. Notomista, S. Mayya, S. Hutchinson, M. Egerstedt. An optimal task allocation strategy for heterogeneous multi-robot systems.</w:t>
+        <w:t xml:space="preserve">I. Bistritz, A. Leshem. Distributed multi-player bandits: a game of thrones approach.</w:t>
       </w:r>
       <w:r>
         <w:t xml:space="preserve"> </w:t>
@@ -18738,10 +18738,10 @@
           <w:i/>
           <w:iCs/>
         </w:rPr>
-        <w:t xml:space="preserve">European Control Conference</w:t>
-      </w:r>
-      <w:r>
-        <w:t xml:space="preserve">, 2019.</w:t>
+        <w:t xml:space="preserve">NeurIPS</w:t>
+      </w:r>
+      <w:r>
+        <w:t xml:space="preserve">, 2018.</w:t>
       </w:r>
     </w:p>
     <w:p>
@@ -18757,7 +18757,7 @@
         <w:widowControl w:val="1"/>
       </w:pPr>
       <w:r>
-        <w:t xml:space="preserve">H. Ravichandar, K. Shaw, S. Chernova. STRATA: a unified framework for task assignments in large teams of heterogeneous agents.</w:t>
+        <w:t xml:space="preserve">C. Yu, A. Velu, E. Vinitsky, et al. The surprising effectiveness of PPO in cooperative multi-agent games.</w:t>
       </w:r>
       <w:r>
         <w:t xml:space="preserve"> </w:t>
@@ -18767,10 +18767,10 @@
           <w:i/>
           <w:iCs/>
         </w:rPr>
-        <w:t xml:space="preserve">Autonomous Agents and Multi-Agent Systems</w:t>
-      </w:r>
-      <w:r>
-        <w:t xml:space="preserve">, 34:38, 2020.</w:t>
+        <w:t xml:space="preserve">NeurIPS</w:t>
+      </w:r>
+      <w:r>
+        <w:t xml:space="preserve">, 2022.</w:t>
       </w:r>
     </w:p>
     <w:p>
@@ -18786,7 +18786,7 @@
         <w:widowControl w:val="1"/>
       </w:pPr>
       <w:r>
-        <w:t xml:space="preserve">I. Bistritz, A. Leshem. Distributed multi-player bandits: a game of thrones approach.</w:t>
+        <w:t xml:space="preserve">T. Rashid, M. Samvelyan, et al. QMIX: monotonic value function factorisation for deep multi-agent reinforcement learning.</w:t>
       </w:r>
       <w:r>
         <w:t xml:space="preserve"> </w:t>
@@ -18796,7 +18796,7 @@
           <w:i/>
           <w:iCs/>
         </w:rPr>
-        <w:t xml:space="preserve">NeurIPS</w:t>
+        <w:t xml:space="preserve">ICML</w:t>
       </w:r>
       <w:r>
         <w:t xml:space="preserve">, 2018.</w:t>
@@ -18815,7 +18815,7 @@
         <w:widowControl w:val="1"/>
       </w:pPr>
       <w:r>
-        <w:t xml:space="preserve">B. Recht. A simpler approach to matrix completion.</w:t>
+        <w:t xml:space="preserve">P. Sunehag, G. Lever, et al. Value-decomposition networks for cooperative multi-agent learning.</w:t>
       </w:r>
       <w:r>
         <w:t xml:space="preserve"> </w:t>
@@ -18825,10 +18825,10 @@
           <w:i/>
           <w:iCs/>
         </w:rPr>
-        <w:t xml:space="preserve">JMLR</w:t>
-      </w:r>
-      <w:r>
-        <w:t xml:space="preserve">, 12:3413–3430, 2011.</w:t>
+        <w:t xml:space="preserve">AAMAS</w:t>
+      </w:r>
+      <w:r>
+        <w:t xml:space="preserve">, 2018.</w:t>
       </w:r>
     </w:p>
     <w:p>
@@ -18844,7 +18844,7 @@
         <w:widowControl w:val="1"/>
       </w:pPr>
       <w:r>
-        <w:t xml:space="preserve">P. Jain, P. Netrapalli, S. Sanghavi. Low-rank matrix completion using alternating minimization.</w:t>
+        <w:t xml:space="preserve">R. Lowe, Y. Wu, et al. Multi-agent actor-critic for mixed cooperative-competitive environments.</w:t>
       </w:r>
       <w:r>
         <w:t xml:space="preserve"> </w:t>
@@ -18854,10 +18854,10 @@
           <w:i/>
           <w:iCs/>
         </w:rPr>
-        <w:t xml:space="preserve">STOC</w:t>
-      </w:r>
-      <w:r>
-        <w:t xml:space="preserve">, 2013.</w:t>
+        <w:t xml:space="preserve">NeurIPS</w:t>
+      </w:r>
+      <w:r>
+        <w:t xml:space="preserve">, 2017.</w:t>
       </w:r>
     </w:p>
     <w:p>
@@ -18873,7 +18873,7 @@
         <w:widowControl w:val="1"/>
       </w:pPr>
       <w:r>
-        <w:t xml:space="preserve">K.-S. Jun, R. Willett, S. Wright, R. Nowak. Bilinear bandits with low-rank structure.</w:t>
+        <w:t xml:space="preserve">S. Sukhbaatar, A. Szlam, R. Fergus. Learning multiagent communication with backpropagation.</w:t>
       </w:r>
       <w:r>
         <w:t xml:space="preserve"> </w:t>
@@ -18883,10 +18883,10 @@
           <w:i/>
           <w:iCs/>
         </w:rPr>
-        <w:t xml:space="preserve">ICML</w:t>
-      </w:r>
-      <w:r>
-        <w:t xml:space="preserve">, 2019.</w:t>
+        <w:t xml:space="preserve">NeurIPS</w:t>
+      </w:r>
+      <w:r>
+        <w:t xml:space="preserve">, 2016.</w:t>
       </w:r>
     </w:p>
     <w:p>
@@ -18902,7 +18902,7 @@
         <w:widowControl w:val="1"/>
       </w:pPr>
       <w:r>
-        <w:t xml:space="preserve">Y. Lu, A. Meisami, A. Tewari. Low-rank generalized linear bandit problems.</w:t>
+        <w:t xml:space="preserve">A. Das, T. Gervet, et al. TarMAC: targeted multi-agent communication.</w:t>
       </w:r>
       <w:r>
         <w:t xml:space="preserve"> </w:t>
@@ -18912,10 +18912,10 @@
           <w:i/>
           <w:iCs/>
         </w:rPr>
-        <w:t xml:space="preserve">AISTATS</w:t>
-      </w:r>
-      <w:r>
-        <w:t xml:space="preserve">, 2021.</w:t>
+        <w:t xml:space="preserve">ICML</w:t>
+      </w:r>
+      <w:r>
+        <w:t xml:space="preserve">, 2019.</w:t>
       </w:r>
     </w:p>
     <w:p>
@@ -18931,7 +18931,7 @@
         <w:widowControl w:val="1"/>
       </w:pPr>
       <w:r>
-        <w:t xml:space="preserve">Y. Hu, Y. Koren, C. Volinsky. Collaborative filtering for implicit feedback datasets.</w:t>
+        <w:t xml:space="preserve">J. Foerster, Y. Assael, N. de Freitas, S. Whiteson. Learning to communicate with deep multi-agent reinforcement learning.</w:t>
       </w:r>
       <w:r>
         <w:t xml:space="preserve"> </w:t>
@@ -18941,10 +18941,10 @@
           <w:i/>
           <w:iCs/>
         </w:rPr>
-        <w:t xml:space="preserve">ICDM</w:t>
-      </w:r>
-      <w:r>
-        <w:t xml:space="preserve">, 2008.</w:t>
+        <w:t xml:space="preserve">NeurIPS</w:t>
+      </w:r>
+      <w:r>
+        <w:t xml:space="preserve">, 2016.</w:t>
       </w:r>
     </w:p>
     <w:p>
@@ -18960,7 +18960,7 @@
         <w:widowControl w:val="1"/>
       </w:pPr>
       <w:r>
-        <w:t xml:space="preserve">S. Rendle, C. Freudenthaler, Z. Gantner, L. Schmidt-Thieme. BPR: Bayesian personalized ranking from implicit feedback.</w:t>
+        <w:t xml:space="preserve">P. Goarin, G. Loianno. Graph neural network for decentralized multi-robot goal assignment.</w:t>
       </w:r>
       <w:r>
         <w:t xml:space="preserve"> </w:t>
@@ -18970,10 +18970,10 @@
           <w:i/>
           <w:iCs/>
         </w:rPr>
-        <w:t xml:space="preserve">UAI</w:t>
-      </w:r>
-      <w:r>
-        <w:t xml:space="preserve">, 2009.</w:t>
+        <w:t xml:space="preserve">IEEE Robotics and Automation Letters</w:t>
+      </w:r>
+      <w:r>
+        <w:t xml:space="preserve">, 2024.</w:t>
       </w:r>
     </w:p>
     <w:p>
@@ -18989,7 +18989,7 @@
         <w:widowControl w:val="1"/>
       </w:pPr>
       <w:r>
-        <w:t xml:space="preserve">T. Rashid, M. Samvelyan, et al. QMIX: monotonic value function factorisation for deep multi-agent reinforcement learning.</w:t>
+        <w:t xml:space="preserve">Z. Wang, M. Gombolay. Learning scheduling policies for multi-robot coordination with graph attention networks.</w:t>
       </w:r>
       <w:r>
         <w:t xml:space="preserve"> </w:t>
@@ -18999,10 +18999,10 @@
           <w:i/>
           <w:iCs/>
         </w:rPr>
-        <w:t xml:space="preserve">ICML</w:t>
-      </w:r>
-      <w:r>
-        <w:t xml:space="preserve">, 2018.</w:t>
+        <w:t xml:space="preserve">IEEE Robotics and Automation Letters</w:t>
+      </w:r>
+      <w:r>
+        <w:t xml:space="preserve">, 5(3):4509–4516, 2020.</w:t>
       </w:r>
     </w:p>
     <w:p>
@@ -19018,7 +19018,7 @@
         <w:widowControl w:val="1"/>
       </w:pPr>
       <w:r>
-        <w:t xml:space="preserve">P. Sunehag, G. Lever, et al. Value-decomposition networks for cooperative multi-agent learning.</w:t>
+        <w:t xml:space="preserve">M. Ammad-ud-din, E. Ivannikova, S. A. Khan, W. Oyomno, Q. Fu, K. E. Tan, A. Flanagan. Federated collaborative filtering for privacy-preserving personalized recommendation system.</w:t>
       </w:r>
       <w:r>
         <w:t xml:space="preserve"> </w:t>
@@ -19028,10 +19028,10 @@
           <w:i/>
           <w:iCs/>
         </w:rPr>
-        <w:t xml:space="preserve">AAMAS</w:t>
-      </w:r>
-      <w:r>
-        <w:t xml:space="preserve">, 2018.</w:t>
+        <w:t xml:space="preserve">arXiv:1901.09888</w:t>
+      </w:r>
+      <w:r>
+        <w:t xml:space="preserve">, 2019.</w:t>
       </w:r>
     </w:p>
     <w:p>
@@ -19047,7 +19047,7 @@
         <w:widowControl w:val="1"/>
       </w:pPr>
       <w:r>
-        <w:t xml:space="preserve">R. Lowe, Y. Wu, et al. Multi-agent actor-critic for mixed cooperative-competitive environments.</w:t>
+        <w:t xml:space="preserve">B. McMahan, E. Moore, D. Ramage, S. Hampson, B. Agüera y Arcas. Communication-efficient learning of deep networks from decentralized data.</w:t>
       </w:r>
       <w:r>
         <w:t xml:space="preserve"> </w:t>
@@ -19057,10 +19057,10 @@
           <w:i/>
           <w:iCs/>
         </w:rPr>
-        <w:t xml:space="preserve">NeurIPS</w:t>
-      </w:r>
-      <w:r>
-        <w:t xml:space="preserve">, 2017.</w:t>
+        <w:t xml:space="preserve">AISTATS</w:t>
+      </w:r>
+      <w:r>
+        <w:t xml:space="preserve">, 1273–1282, 2017.</w:t>
       </w:r>
     </w:p>
     <w:p>
@@ -19076,7 +19076,7 @@
         <w:widowControl w:val="1"/>
       </w:pPr>
       <w:r>
-        <w:t xml:space="preserve">A. Das, T. Gervet, et al. TarMAC: targeted multi-agent communication.</w:t>
+        <w:t xml:space="preserve">D. S. Bernstein, R. Givan, N. Immerman, S. Zilberstein. The complexity of decentralized control of Markov decision processes.</w:t>
       </w:r>
       <w:r>
         <w:t xml:space="preserve"> </w:t>
@@ -19086,10 +19086,10 @@
           <w:i/>
           <w:iCs/>
         </w:rPr>
-        <w:t xml:space="preserve">ICML</w:t>
-      </w:r>
-      <w:r>
-        <w:t xml:space="preserve">, 2019.</w:t>
+        <w:t xml:space="preserve">Mathematics of Operations Research</w:t>
+      </w:r>
+      <w:r>
+        <w:t xml:space="preserve">, 27(4):819–840, 2002.</w:t>
       </w:r>
     </w:p>
     <w:p>
@@ -19105,7 +19105,7 @@
         <w:widowControl w:val="1"/>
       </w:pPr>
       <w:r>
-        <w:t xml:space="preserve">J. Foerster, Y. Assael, N. de Freitas, S. Whiteson. Learning to communicate with deep multi-agent reinforcement learning.</w:t>
+        <w:t xml:space="preserve">E. J. Candès, B. Recht. Exact matrix completion via convex optimization.</w:t>
       </w:r>
       <w:r>
         <w:t xml:space="preserve"> </w:t>
@@ -19115,10 +19115,10 @@
           <w:i/>
           <w:iCs/>
         </w:rPr>
-        <w:t xml:space="preserve">NeurIPS</w:t>
-      </w:r>
-      <w:r>
-        <w:t xml:space="preserve">, 2016.</w:t>
+        <w:t xml:space="preserve">Found. Comput. Math.</w:t>
+      </w:r>
+      <w:r>
+        <w:t xml:space="preserve">, 9(6):717–772, 2009.</w:t>
       </w:r>
     </w:p>
     <w:p>
@@ -19134,7 +19134,7 @@
         <w:widowControl w:val="1"/>
       </w:pPr>
       <w:r>
-        <w:t xml:space="preserve">M. Brambilla, E. Ferrante, M. Birattari, M. Dorigo. Swarm robotics: a review from the swarm engineering perspective.</w:t>
+        <w:t xml:space="preserve">R. H. Keshavan, A. Montanari, S. Oh. Matrix completion from a few entries.</w:t>
       </w:r>
       <w:r>
         <w:t xml:space="preserve"> </w:t>
@@ -19144,10 +19144,10 @@
           <w:i/>
           <w:iCs/>
         </w:rPr>
-        <w:t xml:space="preserve">Swarm Intelligence</w:t>
-      </w:r>
-      <w:r>
-        <w:t xml:space="preserve">, 7:1–41, 2013.</w:t>
+        <w:t xml:space="preserve">IEEE Trans. Inf. Theory</w:t>
+      </w:r>
+      <w:r>
+        <w:t xml:space="preserve">, 56(6):2980–2998, 2010.</w:t>
       </w:r>
     </w:p>
     <w:p>
@@ -19163,7 +19163,7 @@
         <w:widowControl w:val="1"/>
       </w:pPr>
       <w:r>
-        <w:t xml:space="preserve">E. Şahin. Swarm robotics: from sources of inspiration to domains of application.</w:t>
+        <w:t xml:space="preserve">B. Recht. A simpler approach to matrix completion.</w:t>
       </w:r>
       <w:r>
         <w:t xml:space="preserve"> </w:t>
@@ -19173,10 +19173,10 @@
           <w:i/>
           <w:iCs/>
         </w:rPr>
-        <w:t xml:space="preserve">LNCS 3342</w:t>
-      </w:r>
-      <w:r>
-        <w:t xml:space="preserve">, Springer, 2005.</w:t>
+        <w:t xml:space="preserve">JMLR</w:t>
+      </w:r>
+      <w:r>
+        <w:t xml:space="preserve">, 12:3413–3430, 2011.</w:t>
       </w:r>
     </w:p>
     <w:p>
@@ -19192,7 +19192,7 @@
         <w:widowControl w:val="1"/>
       </w:pPr>
       <w:r>
-        <w:t xml:space="preserve">J. Cortés, S. Martínez, T. Karatas, F. Bullo. Coverage control for mobile sensing networks.</w:t>
+        <w:t xml:space="preserve">P. Jain, P. Netrapalli, S. Sanghavi. Low-rank matrix completion using alternating minimization.</w:t>
       </w:r>
       <w:r>
         <w:t xml:space="preserve"> </w:t>
@@ -19202,10 +19202,10 @@
           <w:i/>
           <w:iCs/>
         </w:rPr>
-        <w:t xml:space="preserve">IEEE Trans. Robotics and Automation</w:t>
-      </w:r>
-      <w:r>
-        <w:t xml:space="preserve">, 20(2):243–255, 2004.</w:t>
+        <w:t xml:space="preserve">STOC</w:t>
+      </w:r>
+      <w:r>
+        <w:t xml:space="preserve">, 2013.</w:t>
       </w:r>
     </w:p>
     <w:p>
@@ -19221,7 +19221,7 @@
         <w:widowControl w:val="1"/>
       </w:pPr>
       <w:r>
-        <w:t xml:space="preserve">Z. Wang, M. Gombolay. Learning scheduling policies for multi-robot coordination with graph attention networks.</w:t>
+        <w:t xml:space="preserve">Y. Koren, R. Bell, C. Volinsky. Matrix factorization techniques for recommender systems.</w:t>
       </w:r>
       <w:r>
         <w:t xml:space="preserve"> </w:t>
@@ -19231,10 +19231,10 @@
           <w:i/>
           <w:iCs/>
         </w:rPr>
-        <w:t xml:space="preserve">IEEE Robotics and Automation Letters</w:t>
-      </w:r>
-      <w:r>
-        <w:t xml:space="preserve">, 5(3):4509–4516, 2020.</w:t>
+        <w:t xml:space="preserve">IEEE Computer</w:t>
+      </w:r>
+      <w:r>
+        <w:t xml:space="preserve">, 42(8):30–37, 2009.</w:t>
       </w:r>
     </w:p>
     <w:p>
@@ -19250,7 +19250,7 @@
         <w:widowControl w:val="1"/>
       </w:pPr>
       <w:r>
-        <w:t xml:space="preserve">M. Ammad-ud-din, E. Ivannikova, S. A. Khan, W. Oyomno, Q. Fu, K. E. Tan, A. Flanagan. Federated collaborative filtering for privacy-preserving personalized recommendation system.</w:t>
+        <w:t xml:space="preserve">R. Salakhutdinov, A. Mnih. Bayesian probabilistic matrix factorization using MCMC.</w:t>
       </w:r>
       <w:r>
         <w:t xml:space="preserve"> </w:t>
@@ -19260,10 +19260,10 @@
           <w:i/>
           <w:iCs/>
         </w:rPr>
-        <w:t xml:space="preserve">arXiv:1901.09888</w:t>
-      </w:r>
-      <w:r>
-        <w:t xml:space="preserve">, 2019.</w:t>
+        <w:t xml:space="preserve">ICML</w:t>
+      </w:r>
+      <w:r>
+        <w:t xml:space="preserve">, 2008.</w:t>
       </w:r>
     </w:p>
     <w:p>
@@ -19279,7 +19279,7 @@
         <w:widowControl w:val="1"/>
       </w:pPr>
       <w:r>
-        <w:t xml:space="preserve">Q. Ling, Y. Xu, W. Yin, Z. Wen. Decentralized low-rank matrix completion.</w:t>
+        <w:t xml:space="preserve">R. Mazumder, T. Hastie, R. Tibshirani. Spectral regularization algorithms for learning large incomplete matrices.</w:t>
       </w:r>
       <w:r>
         <w:t xml:space="preserve"> </w:t>
@@ -19289,10 +19289,10 @@
           <w:i/>
           <w:iCs/>
         </w:rPr>
-        <w:t xml:space="preserve">IEEE ICASSP</w:t>
-      </w:r>
-      <w:r>
-        <w:t xml:space="preserve">, 2925–2928, 2012.</w:t>
+        <w:t xml:space="preserve">JMLR</w:t>
+      </w:r>
+      <w:r>
+        <w:t xml:space="preserve">, 11:2287–2322, 2010.</w:t>
       </w:r>
     </w:p>
     <w:p>
@@ -19308,7 +19308,7 @@
         <w:widowControl w:val="1"/>
       </w:pPr>
       <w:r>
-        <w:t xml:space="preserve">B. McMahan, E. Moore, D. Ramage, S. Hampson, B. Agüera y Arcas. Communication-efficient learning of deep networks from decentralized data.</w:t>
+        <w:t xml:space="preserve">Y. Hu, Y. Koren, C. Volinsky. Collaborative filtering for implicit feedback datasets.</w:t>
       </w:r>
       <w:r>
         <w:t xml:space="preserve"> </w:t>
@@ -19318,10 +19318,10 @@
           <w:i/>
           <w:iCs/>
         </w:rPr>
-        <w:t xml:space="preserve">AISTATS</w:t>
-      </w:r>
-      <w:r>
-        <w:t xml:space="preserve">, 1273–1282, 2017.</w:t>
+        <w:t xml:space="preserve">ICDM</w:t>
+      </w:r>
+      <w:r>
+        <w:t xml:space="preserve">, 2008.</w:t>
       </w:r>
     </w:p>
     <w:p>
@@ -19337,7 +19337,7 @@
         <w:widowControl w:val="1"/>
       </w:pPr>
       <w:r>
-        <w:t xml:space="preserve">P. Auer, N. Cesa-Bianchi, P. Fischer. Finite-time analysis of the multiarmed bandit problem.</w:t>
+        <w:t xml:space="preserve">S. Rendle, C. Freudenthaler, Z. Gantner, L. Schmidt-Thieme. BPR: Bayesian personalized ranking from implicit feedback.</w:t>
       </w:r>
       <w:r>
         <w:t xml:space="preserve"> </w:t>
@@ -19347,10 +19347,10 @@
           <w:i/>
           <w:iCs/>
         </w:rPr>
-        <w:t xml:space="preserve">Machine Learning</w:t>
-      </w:r>
-      <w:r>
-        <w:t xml:space="preserve">, 47(2–3):235–256, 2002.</w:t>
+        <w:t xml:space="preserve">UAI</w:t>
+      </w:r>
+      <w:r>
+        <w:t xml:space="preserve">, 2009.</w:t>
       </w:r>
     </w:p>
     <w:p>
@@ -19366,7 +19366,7 @@
         <w:widowControl w:val="1"/>
       </w:pPr>
       <w:r>
-        <w:t xml:space="preserve">D. S. Bernstein, R. Givan, N. Immerman, S. Zilberstein. The complexity of decentralized control of Markov decision processes.</w:t>
+        <w:t xml:space="preserve">Y. Kang, C.-J. Hsieh, T. C. M. Lee. Efficient frameworks for generalized low-rank matrix bandit problems.</w:t>
       </w:r>
       <w:r>
         <w:t xml:space="preserve"> </w:t>
@@ -19376,10 +19376,10 @@
           <w:i/>
           <w:iCs/>
         </w:rPr>
-        <w:t xml:space="preserve">Mathematics of Operations Research</w:t>
-      </w:r>
-      <w:r>
-        <w:t xml:space="preserve">, 27(4):819–840, 2002.</w:t>
+        <w:t xml:space="preserve">NeurIPS</w:t>
+      </w:r>
+      <w:r>
+        <w:t xml:space="preserve">, 2022.</w:t>
       </w:r>
     </w:p>
     <w:p>
@@ -19395,7 +19395,7 @@
         <w:widowControl w:val="1"/>
       </w:pPr>
       <w:r>
-        <w:t xml:space="preserve">H. W. Kuhn. The Hungarian method for the assignment problem.</w:t>
+        <w:t xml:space="preserve">K.-S. Jun, R. Willett, S. Wright, R. Nowak. Bilinear bandits with low-rank structure.</w:t>
       </w:r>
       <w:r>
         <w:t xml:space="preserve"> </w:t>
@@ -19405,10 +19405,10 @@
           <w:i/>
           <w:iCs/>
         </w:rPr>
-        <w:t xml:space="preserve">Naval Research Logistics Quarterly</w:t>
-      </w:r>
-      <w:r>
-        <w:t xml:space="preserve">, 2(1–2):83–97, 1955.</w:t>
+        <w:t xml:space="preserve">ICML</w:t>
+      </w:r>
+      <w:r>
+        <w:t xml:space="preserve">, 2019.</w:t>
       </w:r>
     </w:p>
     <w:p>
@@ -19424,7 +19424,7 @@
         <w:widowControl w:val="1"/>
       </w:pPr>
       <w:r>
-        <w:t xml:space="preserve">B. Sarwar, G. Karypis, J. Konstan, J. Riedl. Incremental singular value decomposition algorithms for highly scalable recommender systems.</w:t>
+        <w:t xml:space="preserve">Y. Lu, A. Meisami, A. Tewari. Low-rank generalized linear bandit problems.</w:t>
       </w:r>
       <w:r>
         <w:t xml:space="preserve"> </w:t>
@@ -19434,10 +19434,10 @@
           <w:i/>
           <w:iCs/>
         </w:rPr>
-        <w:t xml:space="preserve">Proc. 5th Int. Conf. Computer and Information Technology</w:t>
-      </w:r>
-      <w:r>
-        <w:t xml:space="preserve">, 2002.</w:t>
+        <w:t xml:space="preserve">AISTATS</w:t>
+      </w:r>
+      <w:r>
+        <w:t xml:space="preserve">, 2021.</w:t>
       </w:r>
     </w:p>
     <w:p>
@@ -19453,7 +19453,7 @@
         <w:widowControl w:val="1"/>
       </w:pPr>
       <w:r>
-        <w:t xml:space="preserve">F. Schilling, F. Schiano, D. Floreano. Vision-based drone flocking in outdoor environments.</w:t>
+        <w:t xml:space="preserve">C. Gentile, S. Li, G. Zappella. Online clustering of bandits.</w:t>
       </w:r>
       <w:r>
         <w:t xml:space="preserve"> </w:t>
@@ -19463,10 +19463,10 @@
           <w:i/>
           <w:iCs/>
         </w:rPr>
-        <w:t xml:space="preserve">IEEE Robotics and Automation Letters</w:t>
-      </w:r>
-      <w:r>
-        <w:t xml:space="preserve">, 6(2):2954–2961, 2021.</w:t>
+        <w:t xml:space="preserve">ICML</w:t>
+      </w:r>
+      <w:r>
+        <w:t xml:space="preserve">, 2014.</w:t>
       </w:r>
     </w:p>
     <w:p>
@@ -19482,7 +19482,7 @@
         <w:widowControl w:val="1"/>
       </w:pPr>
       <w:r>
-        <w:t xml:space="preserve">X. Zhou, X. Wen, Z. Wang, Y. Gao, et al. Swarm of micro flying robots in the wild.</w:t>
+        <w:t xml:space="preserve">Q. Ling, Y. Xu, W. Yin, Z. Wen. Decentralized low-rank matrix completion.</w:t>
       </w:r>
       <w:r>
         <w:t xml:space="preserve"> </w:t>
@@ -19492,10 +19492,10 @@
           <w:i/>
           <w:iCs/>
         </w:rPr>
-        <w:t xml:space="preserve">Science Robotics</w:t>
-      </w:r>
-      <w:r>
-        <w:t xml:space="preserve">, 7(66):eabm5954, 2022.</w:t>
+        <w:t xml:space="preserve">IEEE ICASSP</w:t>
+      </w:r>
+      <w:r>
+        <w:t xml:space="preserve">, 2925–2928, 2012.</w:t>
       </w:r>
     </w:p>
     <w:p>
@@ -19511,7 +19511,7 @@
         <w:widowControl w:val="1"/>
       </w:pPr>
       <w:r>
-        <w:t xml:space="preserve">N. Hudson, F. Talbot, M. Cox, et al. Heterogeneous ground and air platforms, homogeneous sensing: Team CSIRO Data61's approach to the DARPA Subterranean Challenge.</w:t>
+        <w:t xml:space="preserve">A. H. Murphy. Skill scores based on the mean square error and their relationships to the correlation coefficient.</w:t>
       </w:r>
       <w:r>
         <w:t xml:space="preserve"> </w:t>
@@ -19521,10 +19521,10 @@
           <w:i/>
           <w:iCs/>
         </w:rPr>
-        <w:t xml:space="preserve">Field Robotics</w:t>
-      </w:r>
-      <w:r>
-        <w:t xml:space="preserve">, 2:595–636, 2022.</w:t>
+        <w:t xml:space="preserve">Monthly Weather Review</w:t>
+      </w:r>
+      <w:r>
+        <w:t xml:space="preserve">, 116:2417–2424, 1988.</w:t>
       </w:r>
     </w:p>
     <w:p>
@@ -19540,7 +19540,7 @@
         <w:widowControl w:val="1"/>
       </w:pPr>
       <w:r>
-        <w:t xml:space="preserve">B. Fu, W. Smith, D. Rizzo, M. Castanier, M. Ghaffari, K. Barton. Learning task requirements and agent capabilities for multi-agent task allocation.</w:t>
+        <w:t xml:space="preserve">B. Sarwar, G. Karypis, J. Konstan, J. Riedl. Incremental singular value decomposition algorithms for highly scalable recommender systems.</w:t>
       </w:r>
       <w:r>
         <w:t xml:space="preserve"> </w:t>
@@ -19550,10 +19550,10 @@
           <w:i/>
           <w:iCs/>
         </w:rPr>
-        <w:t xml:space="preserve">arXiv:2211.03286</w:t>
-      </w:r>
-      <w:r>
-        <w:t xml:space="preserve">, 2022.</w:t>
+        <w:t xml:space="preserve">Proc. 5th Int. Conf. Computer and Information Technology</w:t>
+      </w:r>
+      <w:r>
+        <w:t xml:space="preserve">, 2002.</w:t>
       </w:r>
     </w:p>
     <w:p>
@@ -19569,7 +19569,7 @@
         <w:widowControl w:val="1"/>
       </w:pPr>
       <w:r>
-        <w:t xml:space="preserve">M. Tranzatto, M. Dharmadhikari, L. Bernreiter, et al. Team CERBERUS wins the DARPA Subterranean Challenge: technical overview and lessons learned.</w:t>
+        <w:t xml:space="preserve">P. Auer, N. Cesa-Bianchi, P. Fischer. Finite-time analysis of the multiarmed bandit problem.</w:t>
       </w:r>
       <w:r>
         <w:t xml:space="preserve"> </w:t>
@@ -19579,10 +19579,10 @@
           <w:i/>
           <w:iCs/>
         </w:rPr>
-        <w:t xml:space="preserve">arXiv:2207.04914</w:t>
-      </w:r>
-      <w:r>
-        <w:t xml:space="preserve">, 2022.</w:t>
+        <w:t xml:space="preserve">Machine Learning</w:t>
+      </w:r>
+      <w:r>
+        <w:t xml:space="preserve">, 47(2–3):235–256, 2002.</w:t>
       </w:r>
     </w:p>
     <w:p>
@@ -19598,7 +19598,7 @@
         <w:widowControl w:val="1"/>
       </w:pPr>
       <w:r>
-        <w:t xml:space="preserve">A. Dupuy, A. Galichon. Personality traits and the marriage market.</w:t>
+        <w:t xml:space="preserve">H. W. Kuhn. The Hungarian method for the assignment problem.</w:t>
       </w:r>
       <w:r>
         <w:t xml:space="preserve"> </w:t>
@@ -19608,10 +19608,10 @@
           <w:i/>
           <w:iCs/>
         </w:rPr>
-        <w:t xml:space="preserve">Journal of Political Economy</w:t>
-      </w:r>
-      <w:r>
-        <w:t xml:space="preserve">, 122(6):1271–1319, 2014.</w:t>
+        <w:t xml:space="preserve">Naval Research Logistics Quarterly</w:t>
+      </w:r>
+      <w:r>
+        <w:t xml:space="preserve">, 2(1–2):83–97, 1955.</w:t>
       </w:r>
     </w:p>
     <w:bookmarkEnd w:id="54"/>

</xml_diff>

<commit_message>
C1: reconcile theory regime with the headline experiments
Adds a "Relation to the experiments" paragraph at the end of Section 5. Theorem
2's recovery time (T_rec = O(nd/rho*m log n), order 1e3 rounds at the headline)
and Theorem 1(b)'s rho*m = omega(cd log n) condition are SUFFICIENT conditions
for EXACT recovery of EVERY pair and a GUARANTEED categorical gap; the
experiments run at T=50, an order of magnitude below T_rec, so recovery is
partial by construction. This suffices because skill rewards correct RANKING of
each offered set rather than exact reconstruction of the whole row, and recovery
is graded in the local spanning rank (Appendix C); the empirical separation
therefore appears well outside the conservative omega(cd log n) regime.

Rebuilt ras_paper.html/index.html and ras_paper.docx (54 refs, native OMML, 12
figures).

Co-Authored-By: Claude Opus 4.7 (1M context) <noreply@anthropic.com>
</commit_message>
<xml_diff>
--- a/docs/ras_paper.docx
+++ b/docs/ras_paper.docx
@@ -9979,6 +9979,405 @@
       </w:pPr>
       <w:r>
         <w:t xml:space="preserve">Theorems 2-3 are, to our knowledge, the first results that pin decentralized low-rank recovery from a persistent, private, per-robot mask to an explicit condition and tie its rate to team size; they are what make the categorical claim self-contained rather than imported from centralized theory. Full proofs are given in Appendix A.</w:t>
+      </w:r>
+    </w:p>
+    <w:p>
+      <w:pPr>
+        <w:pStyle w:val="BodyText"/>
+        <w:jc w:val="both"/>
+        <w:keepNext w:val="0"/>
+        <w:keepLines w:val="0"/>
+        <w:widowControl w:val="1"/>
+      </w:pPr>
+      <w:r>
+        <w:rPr>
+          <w:b/>
+          <w:bCs/>
+        </w:rPr>
+        <w:t xml:space="preserve">Relation to the experiments.</w:t>
+      </w:r>
+      <w:r>
+        <w:t xml:space="preserve"> </w:t>
+      </w:r>
+      <w:r>
+        <w:t xml:space="preserve">Theorem 2's recovery time and Theorem 1(b)'s team-size condition are</w:t>
+      </w:r>
+      <w:r>
+        <w:t xml:space="preserve"> </w:t>
+      </w:r>
+      <w:r>
+        <w:rPr>
+          <w:i/>
+          <w:iCs/>
+        </w:rPr>
+        <w:t xml:space="preserve">sufficient</w:t>
+      </w:r>
+      <w:r>
+        <w:t xml:space="preserve"> </w:t>
+      </w:r>
+      <w:r>
+        <w:t xml:space="preserve">conditions for</w:t>
+      </w:r>
+      <w:r>
+        <w:t xml:space="preserve"> </w:t>
+      </w:r>
+      <w:r>
+        <w:rPr>
+          <w:i/>
+          <w:iCs/>
+        </w:rPr>
+        <w:t xml:space="preserve">exact</w:t>
+      </w:r>
+      <w:r>
+        <w:t xml:space="preserve"> </w:t>
+      </w:r>
+      <w:r>
+        <w:t xml:space="preserve">recovery of</w:t>
+      </w:r>
+      <w:r>
+        <w:t xml:space="preserve"> </w:t>
+      </w:r>
+      <w:r>
+        <w:rPr>
+          <w:i/>
+          <w:iCs/>
+        </w:rPr>
+        <w:t xml:space="preserve">every</w:t>
+      </w:r>
+      <w:r>
+        <w:t xml:space="preserve"> </w:t>
+      </w:r>
+      <w:r>
+        <w:t xml:space="preserve">pair and a guaranteed categorical gap; the experiments deliberately sit well inside them and still earn strong skill. At the headline setting (</w:t>
+      </w:r>
+      <m:oMath>
+        <m:r>
+          <m:t>ρ</m:t>
+        </m:r>
+        <m:r>
+          <m:rPr>
+            <m:sty m:val="p"/>
+          </m:rPr>
+          <m:t>=</m:t>
+        </m:r>
+        <m:r>
+          <m:t>0.25</m:t>
+        </m:r>
+      </m:oMath>
+      <w:r>
+        <w:t xml:space="preserve">,</w:t>
+      </w:r>
+      <w:r>
+        <w:t xml:space="preserve"> </w:t>
+      </w:r>
+      <m:oMath>
+        <m:r>
+          <m:t>m</m:t>
+        </m:r>
+        <m:r>
+          <m:rPr>
+            <m:sty m:val="p"/>
+          </m:rPr>
+          <m:t>=</m:t>
+        </m:r>
+        <m:r>
+          <m:t>30</m:t>
+        </m:r>
+      </m:oMath>
+      <w:r>
+        <w:t xml:space="preserve">,</w:t>
+      </w:r>
+      <w:r>
+        <w:t xml:space="preserve"> </w:t>
+      </w:r>
+      <m:oMath>
+        <m:r>
+          <m:t>d</m:t>
+        </m:r>
+        <m:r>
+          <m:rPr>
+            <m:sty m:val="p"/>
+          </m:rPr>
+          <m:t>=</m:t>
+        </m:r>
+        <m:r>
+          <m:t>5</m:t>
+        </m:r>
+      </m:oMath>
+      <w:r>
+        <w:t xml:space="preserve">,</w:t>
+      </w:r>
+      <w:r>
+        <w:t xml:space="preserve"> </w:t>
+      </w:r>
+      <m:oMath>
+        <m:r>
+          <m:t>n</m:t>
+        </m:r>
+        <m:r>
+          <m:rPr>
+            <m:sty m:val="p"/>
+          </m:rPr>
+          <m:t>=</m:t>
+        </m:r>
+        <m:r>
+          <m:t>240</m:t>
+        </m:r>
+      </m:oMath>
+      <w:r>
+        <w:t xml:space="preserve">) the full-recovery horizon</w:t>
+      </w:r>
+      <w:r>
+        <w:t xml:space="preserve"> </w:t>
+      </w:r>
+      <m:oMath>
+        <m:sSub>
+          <m:e>
+            <m:r>
+              <m:t>T</m:t>
+            </m:r>
+          </m:e>
+          <m:sub>
+            <m:r>
+              <m:rPr>
+                <m:sty m:val="p"/>
+              </m:rPr>
+              <m:t>r</m:t>
+            </m:r>
+            <m:r>
+              <m:rPr>
+                <m:sty m:val="p"/>
+              </m:rPr>
+              <m:t>e</m:t>
+            </m:r>
+            <m:r>
+              <m:rPr>
+                <m:sty m:val="p"/>
+              </m:rPr>
+              <m:t>c</m:t>
+            </m:r>
+          </m:sub>
+        </m:sSub>
+        <m:r>
+          <m:rPr>
+            <m:sty m:val="p"/>
+          </m:rPr>
+          <m:t>=</m:t>
+        </m:r>
+        <m:r>
+          <m:t>O</m:t>
+        </m:r>
+        <m:r>
+          <m:rPr>
+            <m:sty m:val="p"/>
+          </m:rPr>
+          <m:t>(</m:t>
+        </m:r>
+        <m:f>
+          <m:fPr>
+            <m:type m:val="lin"/>
+          </m:fPr>
+          <m:num>
+            <m:r>
+              <m:t>n</m:t>
+            </m:r>
+            <m:r>
+              <m:t>d</m:t>
+            </m:r>
+          </m:num>
+          <m:den>
+            <m:r>
+              <m:t>ρ</m:t>
+            </m:r>
+            <m:r>
+              <m:t>m</m:t>
+            </m:r>
+          </m:den>
+        </m:f>
+        <m:r>
+          <m:rPr>
+            <m:sty m:val="p"/>
+          </m:rPr>
+          <m:t>log</m:t>
+        </m:r>
+        <m:r>
+          <m:t>n</m:t>
+        </m:r>
+        <m:r>
+          <m:rPr>
+            <m:sty m:val="p"/>
+          </m:rPr>
+          <m:t>)</m:t>
+        </m:r>
+      </m:oMath>
+      <w:r>
+        <w:t xml:space="preserve"> </w:t>
+      </w:r>
+      <w:r>
+        <w:t xml:space="preserve">scales to order</w:t>
+      </w:r>
+      <w:r>
+        <w:t xml:space="preserve"> </w:t>
+      </w:r>
+      <m:oMath>
+        <m:sSup>
+          <m:e>
+            <m:r>
+              <m:t>10</m:t>
+            </m:r>
+          </m:e>
+          <m:sup>
+            <m:r>
+              <m:t>3</m:t>
+            </m:r>
+          </m:sup>
+        </m:sSup>
+      </m:oMath>
+      <w:r>
+        <w:t xml:space="preserve"> </w:t>
+      </w:r>
+      <w:r>
+        <w:t xml:space="preserve">rounds, more than an order of magnitude beyond the</w:t>
+      </w:r>
+      <w:r>
+        <w:t xml:space="preserve"> </w:t>
+      </w:r>
+      <m:oMath>
+        <m:r>
+          <m:t>T</m:t>
+        </m:r>
+        <m:r>
+          <m:rPr>
+            <m:sty m:val="p"/>
+          </m:rPr>
+          <m:t>=</m:t>
+        </m:r>
+        <m:r>
+          <m:t>50</m:t>
+        </m:r>
+      </m:oMath>
+      <w:r>
+        <w:t xml:space="preserve"> </w:t>
+      </w:r>
+      <w:r>
+        <w:t xml:space="preserve">we run, so recovery is</w:t>
+      </w:r>
+      <w:r>
+        <w:t xml:space="preserve"> </w:t>
+      </w:r>
+      <w:r>
+        <w:rPr>
+          <w:b/>
+          <w:bCs/>
+        </w:rPr>
+        <w:t xml:space="preserve">partial</w:t>
+      </w:r>
+      <w:r>
+        <w:t xml:space="preserve"> </w:t>
+      </w:r>
+      <w:r>
+        <w:t xml:space="preserve">by construction. This suffices because the skill metric rewards correct</w:t>
+      </w:r>
+      <w:r>
+        <w:t xml:space="preserve"> </w:t>
+      </w:r>
+      <w:r>
+        <w:rPr>
+          <w:i/>
+          <w:iCs/>
+        </w:rPr>
+        <w:t xml:space="preserve">ranking</w:t>
+      </w:r>
+      <w:r>
+        <w:t xml:space="preserve"> </w:t>
+      </w:r>
+      <w:r>
+        <w:t xml:space="preserve">of each offered set rather than exact reconstruction of the whole row, and recovery is</w:t>
+      </w:r>
+      <w:r>
+        <w:t xml:space="preserve"> </w:t>
+      </w:r>
+      <w:r>
+        <w:rPr>
+          <w:i/>
+          <w:iCs/>
+        </w:rPr>
+        <w:t xml:space="preserve">graded</w:t>
+      </w:r>
+      <w:r>
+        <w:t xml:space="preserve"> </w:t>
+      </w:r>
+      <w:r>
+        <w:t xml:space="preserve">in the local spanning rank (Appendix C): a robot acts well on a task as soon as enough similar teammates have been observed engaging it, long before its entire row becomes identifiable. For the same reason the categorical separation is observed well outside the</w:t>
+      </w:r>
+      <w:r>
+        <w:t xml:space="preserve"> </w:t>
+      </w:r>
+      <m:oMath>
+        <m:r>
+          <m:t>ρ</m:t>
+        </m:r>
+        <m:r>
+          <m:t>m</m:t>
+        </m:r>
+        <m:r>
+          <m:rPr>
+            <m:sty m:val="p"/>
+          </m:rPr>
+          <m:t>=</m:t>
+        </m:r>
+        <m:r>
+          <m:t>ω</m:t>
+        </m:r>
+        <m:r>
+          <m:rPr>
+            <m:sty m:val="p"/>
+          </m:rPr>
+          <m:t>(</m:t>
+        </m:r>
+        <m:r>
+          <m:t>c</m:t>
+        </m:r>
+        <m:r>
+          <m:t>d</m:t>
+        </m:r>
+        <m:r>
+          <m:rPr>
+            <m:sty m:val="p"/>
+          </m:rPr>
+          <m:t>log</m:t>
+        </m:r>
+        <m:r>
+          <m:t>n</m:t>
+        </m:r>
+        <m:r>
+          <m:rPr>
+            <m:sty m:val="p"/>
+          </m:rPr>
+          <m:t>)</m:t>
+        </m:r>
+      </m:oMath>
+      <w:r>
+        <w:t xml:space="preserve"> </w:t>
+      </w:r>
+      <w:r>
+        <w:t xml:space="preserve">regime that Theorem 1(b) requires for a</w:t>
+      </w:r>
+      <w:r>
+        <w:t xml:space="preserve"> </w:t>
+      </w:r>
+      <w:r>
+        <w:rPr>
+          <w:i/>
+          <w:iCs/>
+        </w:rPr>
+        <w:t xml:space="preserve">guaranteed</w:t>
+      </w:r>
+      <w:r>
+        <w:t xml:space="preserve"> </w:t>
+      </w:r>
+      <w:r>
+        <w:t xml:space="preserve">gap, so that condition is conservative rather than tight.</w:t>
       </w:r>
     </w:p>
     <w:bookmarkEnd w:id="16"/>

</xml_diff>

<commit_message>
M2: state that the structure-free floor is by construction; recoverability carries the claim
Recasts the post-Theorem-1 paragraph in Section 5: the zero side of the
"categorical" separation is by construction (a structure-free learner is defined
to fall back on the prior off its own engagements, so its unseen-pair floor
characterizes that class -- per-task bandits, tabular -- rather than reflecting a
contest), and the weight of the claim therefore rests on the nonzero side, that
SwarmCF can in fact recover and act (Theorem 2 + Appendix C) and scale
(Theorem 3), which is not automatic. Avoids overselling "categorical/provably
cannot" while keeping Proposition 1 as a genuine impossibility result for the
structure-free class.

Rebuilt ras_paper.html/index.html and ras_paper.docx.

Co-Authored-By: Claude Opus 4.7 (1M context) <noreply@anthropic.com>
</commit_message>
<xml_diff>
--- a/docs/ras_paper.docx
+++ b/docs/ras_paper.docx
@@ -8463,7 +8463,36 @@
         <w:widowControl w:val="1"/>
       </w:pPr>
       <w:r>
-        <w:t xml:space="preserve">Proposition 1, Lemma 1, and Theorem 1 make the separation categorical (zero versus nonzero) and operational (it shows up in reward earned while learning), but Lemma 1 assumes</w:t>
+        <w:t xml:space="preserve">Proposition 1, Lemma 1, and Theorem 1 make the separation categorical (zero versus nonzero) and operational (it shows up in reward earned while learning). The zero side is</w:t>
+      </w:r>
+      <w:r>
+        <w:t xml:space="preserve"> </w:t>
+      </w:r>
+      <w:r>
+        <w:rPr>
+          <w:b/>
+          <w:bCs/>
+        </w:rPr>
+        <w:t xml:space="preserve">by construction</w:t>
+      </w:r>
+      <w:r>
+        <w:t xml:space="preserve">: a structure-free learner is</w:t>
+      </w:r>
+      <w:r>
+        <w:t xml:space="preserve"> </w:t>
+      </w:r>
+      <w:r>
+        <w:rPr>
+          <w:i/>
+          <w:iCs/>
+        </w:rPr>
+        <w:t xml:space="preserve">defined</w:t>
+      </w:r>
+      <w:r>
+        <w:t xml:space="preserve"> </w:t>
+      </w:r>
+      <w:r>
+        <w:t xml:space="preserve">to fall back on the prior off its own engagements, so its floor on unseen pairs characterizes that class (independent per-task bandits, tabular value tables) rather than reflecting a contest; the weight of the claim rests on the nonzero side, that SwarmCF can in fact recover and act, which is not automatic. Since Lemma 1 still assumes</w:t>
       </w:r>
       <w:r>
         <w:t xml:space="preserve"> </w:t>
@@ -8477,7 +8506,7 @@
         <w:t xml:space="preserve"> </w:t>
       </w:r>
       <w:r>
-        <w:t xml:space="preserve">is known. The remaining question, the central problem of the decentralized setting, is whether each robot can</w:t>
+        <w:t xml:space="preserve">is known, the remaining question, the central problem of the decentralized setting, is whether each robot can</w:t>
       </w:r>
       <w:r>
         <w:t xml:space="preserve"> </w:t>

</xml_diff>

<commit_message>
Refine and reposition the emergent-low-rank subsection; rebuild HTML + docx
Tighten the wording (consistent task terminology, a sharper "not low-rank by
construction" statement) and move the subsection to follow the
approximate-low-rank robustness, so the emergent reward is Figures 11-12 and
recovery-versus-horizon becomes Figure 13. Rebuild ras_paper.html/index.html
and ras_paper.docx (574 native OMML equations, 13 centered figures).

Co-Authored-By: Claude Opus 4.7 (1M context) <noreply@anthropic.com>
</commit_message>
<xml_diff>
--- a/docs/ras_paper.docx
+++ b/docs/ras_paper.docx
@@ -30,7 +30,7 @@
         </w:r>
       </w:hyperlink>
     </w:p>
-    <w:bookmarkStart w:id="70" w:name="Xa8f2687664d6e7bb57f7cb64826b407761b7295"/>
+    <w:bookmarkStart w:id="76" w:name="Xa8f2687664d6e7bb57f7cb64826b407761b7295"/>
     <w:p>
       <w:pPr>
         <w:pStyle w:val="Title"/>
@@ -11095,7 +11095,7 @@
         </m:r>
       </m:oMath>
       <w:r>
-        <w:t xml:space="preserve">-floor corollary of Appendix A makes the rate finite (not merely asymptotic) for the exploiting policy we actually run, and the recovery-versus-horizon sweep (Appendix E, Figure 11) confirms the picture directly: under the non-adaptive exploration the theorem assumes, recovery reaches</w:t>
+        <w:t xml:space="preserve">-floor corollary of Appendix A makes the rate finite (not merely asymptotic) for the exploiting policy we actually run, and the recovery-versus-horizon sweep (Appendix E, Figure 13) confirms the picture directly: under the non-adaptive exploration the theorem assumes, recovery reaches</w:t>
       </w:r>
       <w:r>
         <w:t xml:space="preserve"> </w:t>
@@ -15849,7 +15849,7 @@
         <w:t xml:space="preserve"> </w:t>
       </w:r>
       <w:r>
-        <w:t xml:space="preserve">The reward is assumed (approximately) low-rank and stationary, the standard trait-based premise; the categorical advantage degrades gracefully as the structure becomes only approximately low-rank or the rank grows toward full, vanishing only when there is no exploitable structure (Appendix E, Figure 10). All our evidence is in simulation: as no existing benchmark captures this regime (Section 6) we evaluate on our own released LatentSwarm simulator, and the low-rank premise, though standard for trait-based MRTA, is an assumption rather than a measured property of any specific deployment; building a higher-fidelity or physical instantiation of the regime is itself an open problem. Rewards are real-valued and bilinear in latent traits; and the recovery rate of Theorem 2 is established for non-adaptive exploration; the finite-time rate under the strongly exploiting</w:t>
+        <w:t xml:space="preserve">The reward is assumed (approximately) low-rank and stationary, the standard trait-based premise; the categorical advantage degrades gracefully as the structure becomes only approximately low-rank or the rank grows toward full, vanishing only when there is no exploitable structure (Appendix E, Figure 10). All our evidence is in simulation: as no existing benchmark captures this regime (Section 6) we evaluate on our own released LatentSwarm simulator. The low-rank premise, though standard for trait-based MRTA, is an assumption for any specific deployment; Appendix E shows it emerges from a physically grounded multi-sensor detection model (low rank measured, not merely posited) on which communication-free low-rank collaborative filtering remains the strongest unseen-pair predictor, but validating the premise on a physical platform remains an open problem. Rewards are real-valued and bilinear in latent traits; and the recovery rate of Theorem 2 is established for non-adaptive exploration; the finite-time rate under the strongly exploiting</w:t>
       </w:r>
       <w:r>
         <w:t xml:space="preserve"> </w:t>
@@ -21220,7 +21220,7 @@
         <w:t xml:space="preserve"> </w:t>
       </w:r>
       <w:r>
-        <w:t xml:space="preserve">of each offered set (graded recovery of the high-value tasks), not full recovery of every task. The recovery-versus-horizon experiment (Appendix E, Figure 11) makes this concrete: under uniform exploration the recovery fraction reaches</w:t>
+        <w:t xml:space="preserve">of each offered set (graded recovery of the high-value tasks), not full recovery of every task. The recovery-versus-horizon experiment (Appendix E, Figure 13) makes this concrete: under uniform exploration the recovery fraction reaches</w:t>
       </w:r>
       <w:r>
         <w:t xml:space="preserve"> </w:t>
@@ -28289,7 +28289,7 @@
       </w:r>
     </w:p>
     <w:bookmarkEnd w:id="53"/>
-    <w:bookmarkStart w:id="69" w:name="Xfb5c0374fbe4b046648dbebaecd6d725ff79941"/>
+    <w:bookmarkStart w:id="75" w:name="Xfb5c0374fbe4b046648dbebaecd6d725ff79941"/>
     <w:p>
       <w:pPr>
         <w:pStyle w:val="Heading2"/>
@@ -30196,6 +30196,916 @@
       </m:oMath>
       <w:r>
         <w:t xml:space="preserve">. Means with bootstrap 95% CIs over 16 seeds.</w:t>
+      </w:r>
+    </w:p>
+    <w:p>
+      <w:pPr>
+        <w:pStyle w:val="BodyText"/>
+        <w:jc w:val="both"/>
+        <w:keepNext w:val="0"/>
+        <w:keepLines w:val="0"/>
+        <w:widowControl w:val="1"/>
+      </w:pPr>
+      <w:r>
+        <w:rPr>
+          <w:b/>
+          <w:bCs/>
+        </w:rPr>
+        <w:t xml:space="preserve">The low-rank premise is emergent.</w:t>
+      </w:r>
+      <w:r>
+        <w:t xml:space="preserve"> </w:t>
+      </w:r>
+      <w:r>
+        <w:t xml:space="preserve">The body builds the reward by construction as</w:t>
+      </w:r>
+      <w:r>
+        <w:t xml:space="preserve"> </w:t>
+      </w:r>
+      <m:oMath>
+        <m:r>
+          <m:t>R</m:t>
+        </m:r>
+        <m:r>
+          <m:rPr>
+            <m:sty m:val="p"/>
+          </m:rPr>
+          <m:t>=</m:t>
+        </m:r>
+        <m:r>
+          <m:t>P</m:t>
+        </m:r>
+        <m:sSup>
+          <m:e>
+            <m:r>
+              <m:t>U</m:t>
+            </m:r>
+          </m:e>
+          <m:sup>
+            <m:r>
+              <m:rPr>
+                <m:sty m:val="p"/>
+              </m:rPr>
+              <m:t>⊤</m:t>
+            </m:r>
+          </m:sup>
+        </m:sSup>
+      </m:oMath>
+      <w:r>
+        <w:t xml:space="preserve">, so a reader may ask whether low rank is an artifact of that choice rather than a property of physical sensing. To check, we assemble a robot-by-task reward from an independent multi-sensor detection model that never factorizes it, and measure its singular spectrum. Each robot has a continuous non-negative gain profile over</w:t>
+      </w:r>
+      <w:r>
+        <w:t xml:space="preserve"> </w:t>
+      </w:r>
+      <m:oMath>
+        <m:r>
+          <m:t>S</m:t>
+        </m:r>
+      </m:oMath>
+      <w:r>
+        <w:t xml:space="preserve"> </w:t>
+      </w:r>
+      <w:r>
+        <w:t xml:space="preserve">sensing modalities and a position; each task has a modality signature and a position. The per-modality detection probability is a rectified-linear function of the matched-filter SNR (the modality match</w:t>
+      </w:r>
+      <w:r>
+        <w:t xml:space="preserve"> </w:t>
+      </w:r>
+      <m:oMath>
+        <m:sSub>
+          <m:e>
+            <m:r>
+              <m:t>a</m:t>
+            </m:r>
+          </m:e>
+          <m:sub>
+            <m:r>
+              <m:t>i</m:t>
+            </m:r>
+            <m:r>
+              <m:t>s</m:t>
+            </m:r>
+          </m:sub>
+        </m:sSub>
+        <m:sSub>
+          <m:e>
+            <m:r>
+              <m:t>b</m:t>
+            </m:r>
+          </m:e>
+          <m:sub>
+            <m:r>
+              <m:t>j</m:t>
+            </m:r>
+            <m:r>
+              <m:t>s</m:t>
+            </m:r>
+          </m:sub>
+        </m:sSub>
+      </m:oMath>
+      <w:r>
+        <w:t xml:space="preserve"> </w:t>
+      </w:r>
+      <w:r>
+        <w:t xml:space="preserve">attenuated by a smooth range falloff), and the reward is the probability that at least one modality fires,</w:t>
+      </w:r>
+      <w:r>
+        <w:t xml:space="preserve"> </w:t>
+      </w:r>
+      <m:oMath>
+        <m:sSub>
+          <m:e>
+            <m:r>
+              <m:t>R</m:t>
+            </m:r>
+          </m:e>
+          <m:sub>
+            <m:r>
+              <m:t>i</m:t>
+            </m:r>
+            <m:r>
+              <m:t>j</m:t>
+            </m:r>
+          </m:sub>
+        </m:sSub>
+        <m:r>
+          <m:rPr>
+            <m:sty m:val="p"/>
+          </m:rPr>
+          <m:t>=</m:t>
+        </m:r>
+        <m:r>
+          <m:t>1</m:t>
+        </m:r>
+        <m:r>
+          <m:rPr>
+            <m:sty m:val="p"/>
+          </m:rPr>
+          <m:t>−</m:t>
+        </m:r>
+        <m:nary>
+          <m:naryPr>
+            <m:chr m:val="∏"/>
+            <m:limLoc m:val="undOvr"/>
+            <m:subHide m:val="off"/>
+            <m:supHide m:val="on"/>
+          </m:naryPr>
+          <m:sub>
+            <m:r>
+              <m:t>s</m:t>
+            </m:r>
+          </m:sub>
+          <m:sup>
+            <m:r>
+              <m:t>​</m:t>
+            </m:r>
+          </m:sup>
+          <m:e>
+            <m:r>
+              <m:rPr>
+                <m:sty m:val="p"/>
+              </m:rPr>
+              <m:t>(</m:t>
+            </m:r>
+          </m:e>
+        </m:nary>
+        <m:r>
+          <m:t>1</m:t>
+        </m:r>
+        <m:r>
+          <m:rPr>
+            <m:sty m:val="p"/>
+          </m:rPr>
+          <m:t>−</m:t>
+        </m:r>
+        <m:sSub>
+          <m:e>
+            <m:r>
+              <m:t>p</m:t>
+            </m:r>
+          </m:e>
+          <m:sub>
+            <m:r>
+              <m:t>i</m:t>
+            </m:r>
+            <m:r>
+              <m:t>j</m:t>
+            </m:r>
+            <m:r>
+              <m:t>s</m:t>
+            </m:r>
+          </m:sub>
+        </m:sSub>
+        <m:r>
+          <m:rPr>
+            <m:sty m:val="p"/>
+          </m:rPr>
+          <m:t>)</m:t>
+        </m:r>
+      </m:oMath>
+      <w:r>
+        <w:t xml:space="preserve">: a product of misses with a nonlinear range term, not an inner product, so nothing forces it to be low-rank, yet it is low-rank in practice. The spectrum decays fast (Figure 11a): at</w:t>
+      </w:r>
+      <w:r>
+        <w:t xml:space="preserve"> </w:t>
+      </w:r>
+      <m:oMath>
+        <m:r>
+          <m:t>S</m:t>
+        </m:r>
+        <m:r>
+          <m:rPr>
+            <m:sty m:val="p"/>
+          </m:rPr>
+          <m:t>=</m:t>
+        </m:r>
+        <m:r>
+          <m:t>4</m:t>
+        </m:r>
+      </m:oMath>
+      <w:r>
+        <w:t xml:space="preserve"> </w:t>
+      </w:r>
+      <w:r>
+        <w:t xml:space="preserve">about five singular values carry 95% of the energy out of</w:t>
+      </w:r>
+      <w:r>
+        <w:t xml:space="preserve"> </w:t>
+      </w:r>
+      <m:oMath>
+        <m:r>
+          <m:rPr>
+            <m:sty m:val="p"/>
+          </m:rPr>
+          <m:t>min</m:t>
+        </m:r>
+        <m:r>
+          <m:rPr>
+            <m:sty m:val="p"/>
+          </m:rPr>
+          <m:t>(</m:t>
+        </m:r>
+        <m:r>
+          <m:t>m</m:t>
+        </m:r>
+        <m:r>
+          <m:rPr>
+            <m:sty m:val="p"/>
+          </m:rPr>
+          <m:t>,</m:t>
+        </m:r>
+        <m:r>
+          <m:t>n</m:t>
+        </m:r>
+        <m:r>
+          <m:rPr>
+            <m:sty m:val="p"/>
+          </m:rPr>
+          <m:t>)</m:t>
+        </m:r>
+        <m:r>
+          <m:rPr>
+            <m:sty m:val="p"/>
+          </m:rPr>
+          <m:t>=</m:t>
+        </m:r>
+        <m:r>
+          <m:t>30</m:t>
+        </m:r>
+      </m:oMath>
+      <w:r>
+        <w:t xml:space="preserve">. The measured effective rank tracks the number of sensing modalities, rising roughly as</w:t>
+      </w:r>
+      <w:r>
+        <w:t xml:space="preserve"> </w:t>
+      </w:r>
+      <m:oMath>
+        <m:r>
+          <m:t>S</m:t>
+        </m:r>
+        <m:r>
+          <m:rPr>
+            <m:sty m:val="p"/>
+          </m:rPr>
+          <m:t>+</m:t>
+        </m:r>
+        <m:r>
+          <m:t>1</m:t>
+        </m:r>
+      </m:oMath>
+      <w:r>
+        <w:t xml:space="preserve"> </w:t>
+      </w:r>
+      <w:r>
+        <w:t xml:space="preserve">and staying far below the ambient dimension from</w:t>
+      </w:r>
+      <w:r>
+        <w:t xml:space="preserve"> </w:t>
+      </w:r>
+      <m:oMath>
+        <m:r>
+          <m:t>S</m:t>
+        </m:r>
+        <m:r>
+          <m:rPr>
+            <m:sty m:val="p"/>
+          </m:rPr>
+          <m:t>=</m:t>
+        </m:r>
+        <m:r>
+          <m:t>2</m:t>
+        </m:r>
+      </m:oMath>
+      <w:r>
+        <w:t xml:space="preserve"> </w:t>
+      </w:r>
+      <w:r>
+        <w:t xml:space="preserve">to</w:t>
+      </w:r>
+      <w:r>
+        <w:t xml:space="preserve"> </w:t>
+      </w:r>
+      <m:oMath>
+        <m:r>
+          <m:t>8</m:t>
+        </m:r>
+      </m:oMath>
+      <w:r>
+        <w:t xml:space="preserve"> </w:t>
+      </w:r>
+      <w:r>
+        <w:t xml:space="preserve">(Figure 11b); a pure Gaussian coverage kernel behaves the same way (released data). Low rank is therefore a measured consequence of heterogeneous sensing (a few modalities and a smooth coverage geometry), not an artifact of the construction, and is the physically grounded counterpart to the approximate-low-rank robustness above.</w:t>
+      </w:r>
+    </w:p>
+    <w:p>
+      <w:pPr>
+        <w:pStyle w:val="BodyText"/>
+        <w:jc w:val="center"/>
+        <w:keepNext/>
+        <w:keepLines/>
+        <w:widowControl w:val="1"/>
+      </w:pPr>
+      <w:r>
+        <w:drawing>
+          <wp:inline>
+            <wp:extent cx="5943600" cy="2112308"/>
+            <wp:effectExtent b="0" l="0" r="0" t="0"/>
+            <wp:docPr descr="emergent low-rank spectrum" title="" id="67" name="Picture"/>
+            <a:graphic>
+              <a:graphicData uri="http://schemas.openxmlformats.org/drawingml/2006/picture">
+                <pic:pic>
+                  <pic:nvPicPr>
+                    <pic:cNvPr descr="figures/F_emergent_rank.png" id="68" name="Picture"/>
+                    <pic:cNvPicPr>
+                      <a:picLocks noChangeArrowheads="1" noChangeAspect="1"/>
+                    </pic:cNvPicPr>
+                  </pic:nvPicPr>
+                  <pic:blipFill>
+                    <a:blip r:embed="rId66"/>
+                    <a:stretch>
+                      <a:fillRect/>
+                    </a:stretch>
+                  </pic:blipFill>
+                  <pic:spPr bwMode="auto">
+                    <a:xfrm>
+                      <a:off x="0" y="0"/>
+                      <a:ext cx="5943600" cy="2112308"/>
+                    </a:xfrm>
+                    <a:prstGeom prst="rect">
+                      <a:avLst/>
+                    </a:prstGeom>
+                    <a:noFill/>
+                    <a:ln w="9525">
+                      <a:noFill/>
+                      <a:headEnd/>
+                      <a:tailEnd/>
+                    </a:ln>
+                  </pic:spPr>
+                </pic:pic>
+              </a:graphicData>
+            </a:graphic>
+          </wp:inline>
+        </w:drawing>
+      </w:r>
+    </w:p>
+    <w:p>
+      <w:pPr>
+        <w:pStyle w:val="ImageCaption"/>
+        <w:spacing w:before="80" w:after="120" w:line="240" w:lineRule="auto"/>
+        <w:jc w:val="center"/>
+        <w:keepNext w:val="0"/>
+        <w:keepLines/>
+        <w:widowControl w:val="1"/>
+      </w:pPr>
+      <w:r>
+        <w:rPr>
+          <w:b/>
+          <w:bCs/>
+        </w:rPr>
+        <w:t xml:space="preserve">Figure 11.</w:t>
+      </w:r>
+      <w:r>
+        <w:t xml:space="preserve"> </w:t>
+      </w:r>
+      <w:r>
+        <w:t xml:space="preserve">The low-rank reward is emergent. A robot-by-task reward is assembled from an independent multi-sensor detection model (</w:t>
+      </w:r>
+      <m:oMath>
+        <m:r>
+          <m:t>S</m:t>
+        </m:r>
+      </m:oMath>
+      <w:r>
+        <w:t xml:space="preserve"> </w:t>
+      </w:r>
+      <w:r>
+        <w:t xml:space="preserve">modalities, product-of-misses detection with a smooth range falloff, never factorized). (a) Its singular spectrum at</w:t>
+      </w:r>
+      <w:r>
+        <w:t xml:space="preserve"> </w:t>
+      </w:r>
+      <m:oMath>
+        <m:r>
+          <m:t>S</m:t>
+        </m:r>
+        <m:r>
+          <m:rPr>
+            <m:sty m:val="p"/>
+          </m:rPr>
+          <m:t>=</m:t>
+        </m:r>
+        <m:r>
+          <m:t>4</m:t>
+        </m:r>
+      </m:oMath>
+      <w:r>
+        <w:t xml:space="preserve"> </w:t>
+      </w:r>
+      <w:r>
+        <w:t xml:space="preserve">decays fast, about five of</w:t>
+      </w:r>
+      <w:r>
+        <w:t xml:space="preserve"> </w:t>
+      </w:r>
+      <m:oMath>
+        <m:r>
+          <m:rPr>
+            <m:sty m:val="p"/>
+          </m:rPr>
+          <m:t>min</m:t>
+        </m:r>
+        <m:r>
+          <m:rPr>
+            <m:sty m:val="p"/>
+          </m:rPr>
+          <m:t>(</m:t>
+        </m:r>
+        <m:r>
+          <m:t>m</m:t>
+        </m:r>
+        <m:r>
+          <m:rPr>
+            <m:sty m:val="p"/>
+          </m:rPr>
+          <m:t>,</m:t>
+        </m:r>
+        <m:r>
+          <m:t>n</m:t>
+        </m:r>
+        <m:r>
+          <m:rPr>
+            <m:sty m:val="p"/>
+          </m:rPr>
+          <m:t>)</m:t>
+        </m:r>
+        <m:r>
+          <m:rPr>
+            <m:sty m:val="p"/>
+          </m:rPr>
+          <m:t>=</m:t>
+        </m:r>
+        <m:r>
+          <m:t>30</m:t>
+        </m:r>
+      </m:oMath>
+      <w:r>
+        <w:t xml:space="preserve"> </w:t>
+      </w:r>
+      <w:r>
+        <w:t xml:space="preserve">singular values carrying 95% of the energy; (b) the measured effective rank grows roughly as the modality count (</w:t>
+      </w:r>
+      <m:oMath>
+        <m:r>
+          <m:t>S</m:t>
+        </m:r>
+        <m:r>
+          <m:rPr>
+            <m:sty m:val="p"/>
+          </m:rPr>
+          <m:t>+</m:t>
+        </m:r>
+        <m:r>
+          <m:t>1</m:t>
+        </m:r>
+      </m:oMath>
+      <w:r>
+        <w:t xml:space="preserve">) and stays far below the ambient dimension. Low rank is a measured property of heterogeneous sensing, not an artifact of the construction.</w:t>
+      </w:r>
+    </w:p>
+    <w:p>
+      <w:pPr>
+        <w:pStyle w:val="BodyText"/>
+        <w:jc w:val="both"/>
+        <w:keepNext w:val="0"/>
+        <w:keepLines w:val="0"/>
+        <w:widowControl w:val="1"/>
+      </w:pPr>
+      <w:r>
+        <w:rPr>
+          <w:b/>
+          <w:bCs/>
+        </w:rPr>
+        <w:t xml:space="preserve">Methods on the emergent reward.</w:t>
+      </w:r>
+      <w:r>
+        <w:t xml:space="preserve"> </w:t>
+      </w:r>
+      <w:r>
+        <w:t xml:space="preserve">We run the masked bake-off directly on this physically assembled reward (16 seeds). Unlike the body's centered</w:t>
+      </w:r>
+      <w:r>
+        <w:t xml:space="preserve"> </w:t>
+      </w:r>
+      <m:oMath>
+        <m:r>
+          <m:t>R</m:t>
+        </m:r>
+      </m:oMath>
+      <w:r>
+        <w:t xml:space="preserve">, the detection reward has a nonzero additive level (some tasks are intrinsically easier to detect, some robots are better detectors), so each robot uses the standard bias-augmented collaborative filter, predicting</w:t>
+      </w:r>
+      <w:r>
+        <w:t xml:space="preserve"> </w:t>
+      </w:r>
+      <m:oMath>
+        <m:r>
+          <m:t>μ</m:t>
+        </m:r>
+        <m:r>
+          <m:rPr>
+            <m:sty m:val="p"/>
+          </m:rPr>
+          <m:t>+</m:t>
+        </m:r>
+        <m:sSub>
+          <m:e>
+            <m:r>
+              <m:t>b</m:t>
+            </m:r>
+          </m:e>
+          <m:sub>
+            <m:r>
+              <m:t>i</m:t>
+            </m:r>
+          </m:sub>
+        </m:sSub>
+        <m:r>
+          <m:rPr>
+            <m:sty m:val="p"/>
+          </m:rPr>
+          <m:t>+</m:t>
+        </m:r>
+        <m:sSub>
+          <m:e>
+            <m:r>
+              <m:t>c</m:t>
+            </m:r>
+          </m:e>
+          <m:sub>
+            <m:r>
+              <m:t>j</m:t>
+            </m:r>
+          </m:sub>
+        </m:sSub>
+        <m:r>
+          <m:rPr>
+            <m:sty m:val="p"/>
+          </m:rPr>
+          <m:t>+</m:t>
+        </m:r>
+        <m:r>
+          <m:rPr>
+            <m:sty m:val="p"/>
+          </m:rPr>
+          <m:t>⟨</m:t>
+        </m:r>
+        <m:sSub>
+          <m:e>
+            <m:r>
+              <m:t>p</m:t>
+            </m:r>
+          </m:e>
+          <m:sub>
+            <m:r>
+              <m:t>i</m:t>
+            </m:r>
+          </m:sub>
+        </m:sSub>
+        <m:r>
+          <m:rPr>
+            <m:sty m:val="p"/>
+          </m:rPr>
+          <m:t>,</m:t>
+        </m:r>
+        <m:sSub>
+          <m:e>
+            <m:r>
+              <m:t>u</m:t>
+            </m:r>
+          </m:e>
+          <m:sub>
+            <m:r>
+              <m:t>j</m:t>
+            </m:r>
+          </m:sub>
+        </m:sSub>
+        <m:r>
+          <m:rPr>
+            <m:sty m:val="p"/>
+          </m:rPr>
+          <m:t>⟩</m:t>
+        </m:r>
+      </m:oMath>
+      <w:r>
+        <w:t xml:space="preserve"> </w:t>
+      </w:r>
+      <w:r>
+        <w:t xml:space="preserve">[41]: the per-robot and per-task biases absorb that level and the rank-</w:t>
+      </w:r>
+      <m:oMath>
+        <m:acc>
+          <m:accPr>
+            <m:chr m:val="̂"/>
+          </m:accPr>
+          <m:e>
+            <m:r>
+              <m:t>d</m:t>
+            </m:r>
+          </m:e>
+        </m:acc>
+      </m:oMath>
+      <w:r>
+        <w:t xml:space="preserve"> </w:t>
+      </w:r>
+      <w:r>
+        <w:t xml:space="preserve">factors model the residual interaction. This is the general form of the estimator, and it reduces to the body's SwarmCF on a centered reward (the biases vanish), so the body's results are unaffected. Figure 12 reports held-out unseen-pair skill at two operating points: the headline channel (</w:t>
+      </w:r>
+      <m:oMath>
+        <m:r>
+          <m:t>ρ</m:t>
+        </m:r>
+        <m:r>
+          <m:rPr>
+            <m:sty m:val="p"/>
+          </m:rPr>
+          <m:t>=</m:t>
+        </m:r>
+        <m:r>
+          <m:t>0.25</m:t>
+        </m:r>
+      </m:oMath>
+      <w:r>
+        <w:t xml:space="preserve">,</w:t>
+      </w:r>
+      <w:r>
+        <w:t xml:space="preserve"> </w:t>
+      </w:r>
+      <m:oMath>
+        <m:r>
+          <m:t>S</m:t>
+        </m:r>
+        <m:r>
+          <m:rPr>
+            <m:sty m:val="p"/>
+          </m:rPr>
+          <m:t>=</m:t>
+        </m:r>
+        <m:r>
+          <m:t>4</m:t>
+        </m:r>
+      </m:oMath>
+      <w:r>
+        <w:t xml:space="preserve">) and a sparser, lower-rank, longer-range point (</w:t>
+      </w:r>
+      <m:oMath>
+        <m:r>
+          <m:t>ρ</m:t>
+        </m:r>
+        <m:r>
+          <m:rPr>
+            <m:sty m:val="p"/>
+          </m:rPr>
+          <m:t>=</m:t>
+        </m:r>
+        <m:r>
+          <m:t>0.15</m:t>
+        </m:r>
+      </m:oMath>
+      <w:r>
+        <w:t xml:space="preserve">,</w:t>
+      </w:r>
+      <w:r>
+        <w:t xml:space="preserve"> </w:t>
+      </w:r>
+      <m:oMath>
+        <m:r>
+          <m:t>S</m:t>
+        </m:r>
+        <m:r>
+          <m:rPr>
+            <m:sty m:val="p"/>
+          </m:rPr>
+          <m:t>=</m:t>
+        </m:r>
+        <m:r>
+          <m:t>3</m:t>
+        </m:r>
+      </m:oMath>
+      <w:r>
+        <w:t xml:space="preserve">) typical of a communication-starved swarm sensing by signature at range. At both, bias-augmented SwarmCF attains the highest skill in the field, above memory-based kNN-CF, convex SoftImpute, discrete-clustering CLUB, additive BiasModel, and the structure-free floor; at the sparser point the margin is pronounced (</w:t>
+      </w:r>
+      <m:oMath>
+        <m:r>
+          <m:t>0.247</m:t>
+        </m:r>
+      </m:oMath>
+      <w:r>
+        <w:t xml:space="preserve"> </w:t>
+      </w:r>
+      <w:r>
+        <w:t xml:space="preserve">versus</w:t>
+      </w:r>
+      <w:r>
+        <w:t xml:space="preserve"> </w:t>
+      </w:r>
+      <m:oMath>
+        <m:r>
+          <m:t>0.177</m:t>
+        </m:r>
+      </m:oMath>
+      <w:r>
+        <w:t xml:space="preserve"> </w:t>
+      </w:r>
+      <w:r>
+        <w:t xml:space="preserve">for the next-best baseline, with non-overlapping 95% intervals). The bias term is load-bearing here: without it the plain estimator falls below kNN-CF, because the ridge shrinks the sparsely observed task factors toward zero rather than toward the reward's level. Communication-free low-rank collaborative filtering is thus the strongest unseen-pair predictor on an emergent, physically grounded low-rank reward, not only on the constructed one.</w:t>
+      </w:r>
+    </w:p>
+    <w:p>
+      <w:pPr>
+        <w:pStyle w:val="BodyText"/>
+        <w:jc w:val="center"/>
+        <w:keepNext/>
+        <w:keepLines/>
+        <w:widowControl w:val="1"/>
+      </w:pPr>
+      <w:r>
+        <w:drawing>
+          <wp:inline>
+            <wp:extent cx="5943600" cy="1923833"/>
+            <wp:effectExtent b="0" l="0" r="0" t="0"/>
+            <wp:docPr descr="emergent-reward bake-off" title="" id="70" name="Picture"/>
+            <a:graphic>
+              <a:graphicData uri="http://schemas.openxmlformats.org/drawingml/2006/picture">
+                <pic:pic>
+                  <pic:nvPicPr>
+                    <pic:cNvPr descr="figures/F_emergent_bakeoff.png" id="71" name="Picture"/>
+                    <pic:cNvPicPr>
+                      <a:picLocks noChangeArrowheads="1" noChangeAspect="1"/>
+                    </pic:cNvPicPr>
+                  </pic:nvPicPr>
+                  <pic:blipFill>
+                    <a:blip r:embed="rId69"/>
+                    <a:stretch>
+                      <a:fillRect/>
+                    </a:stretch>
+                  </pic:blipFill>
+                  <pic:spPr bwMode="auto">
+                    <a:xfrm>
+                      <a:off x="0" y="0"/>
+                      <a:ext cx="5943600" cy="1923833"/>
+                    </a:xfrm>
+                    <a:prstGeom prst="rect">
+                      <a:avLst/>
+                    </a:prstGeom>
+                    <a:noFill/>
+                    <a:ln w="9525">
+                      <a:noFill/>
+                      <a:headEnd/>
+                      <a:tailEnd/>
+                    </a:ln>
+                  </pic:spPr>
+                </pic:pic>
+              </a:graphicData>
+            </a:graphic>
+          </wp:inline>
+        </w:drawing>
+      </w:r>
+    </w:p>
+    <w:p>
+      <w:pPr>
+        <w:pStyle w:val="ImageCaption"/>
+        <w:spacing w:before="80" w:after="120" w:line="240" w:lineRule="auto"/>
+        <w:jc w:val="center"/>
+        <w:keepNext w:val="0"/>
+        <w:keepLines/>
+        <w:widowControl w:val="1"/>
+      </w:pPr>
+      <w:r>
+        <w:rPr>
+          <w:b/>
+          <w:bCs/>
+        </w:rPr>
+        <w:t xml:space="preserve">Figure 12.</w:t>
+      </w:r>
+      <w:r>
+        <w:t xml:space="preserve"> </w:t>
+      </w:r>
+      <w:r>
+        <w:t xml:space="preserve">Held-out unseen-pair skill on the emergent physical sensing reward (16 seeds, bootstrap 95% CIs) at two operating points: (a) the headline channel (</w:t>
+      </w:r>
+      <m:oMath>
+        <m:r>
+          <m:t>ρ</m:t>
+        </m:r>
+        <m:r>
+          <m:rPr>
+            <m:sty m:val="p"/>
+          </m:rPr>
+          <m:t>=</m:t>
+        </m:r>
+        <m:r>
+          <m:t>0.25</m:t>
+        </m:r>
+      </m:oMath>
+      <w:r>
+        <w:t xml:space="preserve">,</w:t>
+      </w:r>
+      <w:r>
+        <w:t xml:space="preserve"> </w:t>
+      </w:r>
+      <m:oMath>
+        <m:r>
+          <m:t>S</m:t>
+        </m:r>
+        <m:r>
+          <m:rPr>
+            <m:sty m:val="p"/>
+          </m:rPr>
+          <m:t>=</m:t>
+        </m:r>
+        <m:r>
+          <m:t>4</m:t>
+        </m:r>
+      </m:oMath>
+      <w:r>
+        <w:t xml:space="preserve">) and (b) a sparser, lower-rank, longer-range point (</w:t>
+      </w:r>
+      <m:oMath>
+        <m:r>
+          <m:t>ρ</m:t>
+        </m:r>
+        <m:r>
+          <m:rPr>
+            <m:sty m:val="p"/>
+          </m:rPr>
+          <m:t>=</m:t>
+        </m:r>
+        <m:r>
+          <m:t>0.15</m:t>
+        </m:r>
+      </m:oMath>
+      <w:r>
+        <w:t xml:space="preserve">,</w:t>
+      </w:r>
+      <w:r>
+        <w:t xml:space="preserve"> </w:t>
+      </w:r>
+      <m:oMath>
+        <m:r>
+          <m:t>S</m:t>
+        </m:r>
+        <m:r>
+          <m:rPr>
+            <m:sty m:val="p"/>
+          </m:rPr>
+          <m:t>=</m:t>
+        </m:r>
+        <m:r>
+          <m:t>3</m:t>
+        </m:r>
+      </m:oMath>
+      <w:r>
+        <w:t xml:space="preserve">). The bias-augmented SwarmCF (the general form of the estimator, which reduces to the body's SwarmCF on a centered reward) attains the highest skill in the field at both points, while the structure-free learners stay at the floor.</w:t>
       </w:r>
     </w:p>
     <w:p>
@@ -31880,7 +32790,7 @@
         </m:r>
       </m:oMath>
       <w:r>
-        <w:t xml:space="preserve">). Sweeping the horizon (Figure 11), the Theorem 2 recovery fraction (share of pairs whose spanning condition holds) under the non-adaptive uniform-exploration policy the theorem assumes climbs to</w:t>
+        <w:t xml:space="preserve">). Sweeping the horizon (Figure 13), the Theorem 2 recovery fraction (share of pairs whose spanning condition holds) under the non-adaptive uniform-exploration policy the theorem assumes climbs to</w:t>
       </w:r>
       <w:r>
         <w:t xml:space="preserve"> </w:t>
@@ -32107,18 +33017,18 @@
           <wp:inline>
             <wp:extent cx="5937504" cy="3846576"/>
             <wp:effectExtent b="0" l="0" r="0" t="0"/>
-            <wp:docPr descr="recovery versus horizon" title="" id="67" name="Picture"/>
+            <wp:docPr descr="recovery versus horizon" title="" id="73" name="Picture"/>
             <a:graphic>
               <a:graphicData uri="http://schemas.openxmlformats.org/drawingml/2006/picture">
                 <pic:pic>
                   <pic:nvPicPr>
-                    <pic:cNvPr descr="figures/F_recoveryT.png" id="68" name="Picture"/>
+                    <pic:cNvPr descr="figures/F_recoveryT.png" id="74" name="Picture"/>
                     <pic:cNvPicPr>
                       <a:picLocks noChangeArrowheads="1" noChangeAspect="1"/>
                     </pic:cNvPicPr>
                   </pic:nvPicPr>
                   <pic:blipFill>
-                    <a:blip r:embed="rId66"/>
+                    <a:blip r:embed="rId72"/>
                     <a:stretch>
                       <a:fillRect/>
                     </a:stretch>
@@ -32159,7 +33069,7 @@
           <w:b/>
           <w:bCs/>
         </w:rPr>
-        <w:t xml:space="preserve">Figure 11.</w:t>
+        <w:t xml:space="preserve">Figure 13.</w:t>
       </w:r>
       <w:r>
         <w:t xml:space="preserve"> </w:t>
@@ -32362,8 +33272,8 @@
         <w:t xml:space="preserve">(dotted), where graded recovery already yields accurate ranking. Means with bootstrap 95% CIs over 16 seeds.</w:t>
       </w:r>
     </w:p>
-    <w:bookmarkEnd w:id="69"/>
-    <w:bookmarkEnd w:id="70"/>
+    <w:bookmarkEnd w:id="75"/>
+    <w:bookmarkEnd w:id="76"/>
     <w:sectPr>
       <w:footerReference w:type="default" r:id="rId11"/>
       <w:pgSz w:h="15840" w:w="12240"/>

</xml_diff>

<commit_message>
Cross-link Section 6.7 and Appendix E; note emergent low rank in abstract + contributions
Differentiate the two grounded instances so they read as complementary rather
than redundant: Section 6.7 grounds the observation channel (line-of-sight mask,
contention) with a reward that is rank-d by construction, while Appendix E
grounds the reward itself, where low rank is emergent rather than constructed.
Add forward/back cross-references between them, and update the abstract closing
clause and the grounded-instance contribution to state the low-rank premise is
emergent (measured) rather than assumed. Rebuild HTML + docx.

Co-Authored-By: Claude Opus 4.7 (1M context) <noreply@anthropic.com>
</commit_message>
<xml_diff>
--- a/docs/ras_paper.docx
+++ b/docs/ras_paper.docx
@@ -398,7 +398,7 @@
         </m:r>
       </m:oMath>
       <w:r>
-        <w:t xml:space="preserve">), an anytime (cumulative-reward) separation under task scarcity, and a deterministic condition under which decentralized recovery from the masked broadcast is exact (validated empirically). Experiments quantify the value of the broadcast, a positive scaling law (per-robot unseen-pair skill rises with team size), and a strong masking-robustness and anytime profile among low-rank methods (the anytime lead holds under the body's restricted task menu and narrows under an unrestricted all-tasks menu), with the advantage over discrete-clustering and batch baselines persisting (and widening) when the latent traits are continuous rather than type-clustered, and holding under capacity-1 contention and in a robotics-grounded sensing instance.</w:t>
+        <w:t xml:space="preserve">), an anytime (cumulative-reward) separation under task scarcity, and a deterministic condition under which decentralized recovery from the masked broadcast is exact (validated empirically). Experiments quantify the value of the broadcast, a positive scaling law (per-robot unseen-pair skill rises with team size), and a strong masking-robustness and anytime profile among low-rank methods (the anytime lead holds under the body's restricted task menu and narrows under an unrestricted all-tasks menu), with the advantage over discrete-clustering and batch baselines persisting (and widening) when the latent traits are continuous rather than type-clustered, and holding under capacity-1 contention and in physically grounded sensing instances, including one where the low-rank structure is emergent (measured from a multi-sensor detection model) rather than assumed.</w:t>
       </w:r>
     </w:p>
     <w:p>
@@ -1148,7 +1148,7 @@
         <w:t xml:space="preserve"> </w:t>
       </w:r>
       <w:r>
-        <w:t xml:space="preserve">with heterogeneous sensing traits and a range-limited line-of-sight mask (Section 6.7).</w:t>
+        <w:t xml:space="preserve">with heterogeneous sensing traits and a range-limited line-of-sight mask (Section 6.7), including a physically assembled detection reward whose low rank is emergent rather than assumed (Appendix E).</w:t>
       </w:r>
     </w:p>
     <w:p>
@@ -15717,7 +15717,18 @@
         </m:r>
       </m:oMath>
       <w:r>
-        <w:t xml:space="preserve">), while structure-free Independent-UCB and MF-SGD sit at the floor (Figure 6). The absolute skill is lower than in the body because line-of-sight visibility is a harsher channel, so these are a separate grounded instance, not a restatement of Table 2; the separation is a property of the shared low-rank structure, not of the trait or mask model.</w:t>
+        <w:t xml:space="preserve">), while structure-free Independent-UCB and MF-SGD sit at the floor (Figure 6). The absolute skill is lower than in the body because line-of-sight visibility is a harsher channel, so these are a separate grounded instance, not a restatement of Table 2; the separation is a property of the shared low-rank structure, not of the trait or mask model. Here the reward is still rank-</w:t>
+      </w:r>
+      <m:oMath>
+        <m:r>
+          <m:t>d</m:t>
+        </m:r>
+      </m:oMath>
+      <w:r>
+        <w:t xml:space="preserve"> </w:t>
+      </w:r>
+      <w:r>
+        <w:t xml:space="preserve">by construction (a modality inner product); Appendix E complements this by grounding the reward itself, assembling it from a non-factorized detection model whose low rank is emergent rather than constructed.</w:t>
       </w:r>
     </w:p>
     <w:p>
@@ -30252,7 +30263,18 @@
         </m:sSup>
       </m:oMath>
       <w:r>
-        <w:t xml:space="preserve">, so a reader may ask whether low rank is an artifact of that choice rather than a property of physical sensing. To check, we assemble a robot-by-task reward from an independent multi-sensor detection model that never factorizes it, and measure its singular spectrum. Each robot has a continuous non-negative gain profile over</w:t>
+        <w:t xml:space="preserve">, so a reader may ask whether low rank is an artifact of that choice rather than a property of physical sensing. The grounded instance of Section 6.7 still builds the reward as a rank-</w:t>
+      </w:r>
+      <m:oMath>
+        <m:r>
+          <m:t>d</m:t>
+        </m:r>
+      </m:oMath>
+      <w:r>
+        <w:t xml:space="preserve"> </w:t>
+      </w:r>
+      <w:r>
+        <w:t xml:space="preserve">modality match; here we drop that and assemble a robot-by-task reward from an independent multi-sensor detection model that never factorizes it, then measure its singular spectrum. Each robot has a continuous non-negative gain profile over</w:t>
       </w:r>
       <w:r>
         <w:t xml:space="preserve"> </w:t>

</xml_diff>

<commit_message>
Fix Appendix C uniform-world overclaim; note the bias term is reward-dependent
Appendix C now says the "headline experiments" draw uniform traits and flags that
the grounded instance (Section 6.7) and the Appendix E studies deliberately vary
the reward model. This follows a full audit confirming every headline figure and
table is uniform_cosine; the only non-uniform results are the explicitly labeled
grounded, emergent, approximate-low-rank, and Table-4 controls. The emergent
subsection now states the bias terms carry no signal on the body's zero-mean
rewards (and marginally increase variance), so the body keeps the plain form and
biases are added only on the nonzero-mean detection reward. Rebuild HTML + docx.

Co-Authored-By: Claude Opus 4.7 (1M context) <noreply@anthropic.com>
</commit_message>
<xml_diff>
--- a/docs/ras_paper.docx
+++ b/docs/ras_paper.docx
@@ -23112,7 +23112,7 @@
         <w:widowControl w:val="1"/>
       </w:pPr>
       <w:r>
-        <w:t xml:space="preserve">All experiments draw the latent traits i.i.d. and uniformly on the unit sphere (no discrete robot or task types), giving the signed low-rank reward of Section 3, and report bootstrap 95% confidence intervals; the broadcast-rate, anytime, bake-off (Table 2), contention (Section 6.5), and scaling sweeps all use 16 random seeds; each reported number is averaged over the per-seed runs. The code and per-seed data needed to regenerate every figure and table are openly available (see Data availability).</w:t>
+        <w:t xml:space="preserve">The headline experiments draw the latent traits i.i.d. and uniformly on the unit sphere (no discrete robot or task types), giving the signed low-rank reward of Section 3 (the grounded instance of Section 6.7 and the robustness studies of Appendix E deliberately vary the reward model, as noted there), and report bootstrap 95% confidence intervals; the broadcast-rate, anytime, bake-off (Table 2), contention (Section 6.5), and scaling sweeps all use 16 random seeds; each reported number is averaged over the per-seed runs. The code and per-seed data needed to regenerate every figure and table are openly available (see Data availability).</w:t>
       </w:r>
     </w:p>
     <w:p>
@@ -30880,7 +30880,7 @@
         <w:t xml:space="preserve"> </w:t>
       </w:r>
       <w:r>
-        <w:t xml:space="preserve">factors model the residual interaction. This is the general form of the estimator, and it reduces to the body's SwarmCF on a centered reward (the biases vanish), so the body's results are unaffected. Figure 12 reports held-out unseen-pair skill at two operating points: the headline channel (</w:t>
+        <w:t xml:space="preserve">factors model the residual interaction. This is the general form of the estimator, and it reduces to the body's SwarmCF on a centered reward (the biases vanish), so the body's results are unaffected; conversely, on the body's zero-mean rewards the explicit biases carry no signal and marginally increase variance, so the body retains the plain form and the bias terms are added only here, where the detection reward's nonzero level makes them load-bearing. Figure 12 reports held-out unseen-pair skill at two operating points: the headline channel (</w:t>
       </w:r>
       <m:oMath>
         <m:r>

</xml_diff>

<commit_message>
Bibliography: add stable archival URL to Sarwar 2002 incremental-SVD reference
The Sarwar/Karypis/Konstan/Riedl ICCIT 2002 paper is real but its proceedings
venue is poorly indexed in Crossref/OpenAlex, so the bibtest skill's
multi-source title matcher cannot reliably resolve it above the 0.80 gate.
Adding the canonical GroupLens archive URL (verified 200 OK, application/pdf)
lets the validator confirm via URL liveness instead of returning not_found.

Net result: native bibtest check-html now passes the full 54-reference
bibliography (53 valid + 1 skipped, EXIT=0). Rebuild HTML + docx.

Co-Authored-By: Claude Opus 4.7 (1M context) <noreply@anthropic.com>
</commit_message>
<xml_diff>
--- a/docs/ras_paper.docx
+++ b/docs/ras_paper.docx
@@ -30,7 +30,7 @@
         </w:r>
       </w:hyperlink>
     </w:p>
-    <w:bookmarkStart w:id="76" w:name="Xa8f2687664d6e7bb57f7cb64826b407761b7295"/>
+    <w:bookmarkStart w:id="77" w:name="Xa8f2687664d6e7bb57f7cb64826b407761b7295"/>
     <w:p>
       <w:pPr>
         <w:pStyle w:val="Title"/>
@@ -1459,9 +1459,9 @@
           <w:tcPr>
             <w:shd w:fill="EEF3F7"/>
             <w:tcBorders>
-              <w:left w:val="single" w:sz="4" w:color="D9E1E8"/>
-              <w:right w:val="single" w:sz="4" w:color="D9E1E8"/>
-              <w:top w:val="single" w:sz="4" w:color="D9E1E8"/>
+              <w:left w:val="nil"/>
+              <w:right w:val="nil"/>
+              <w:top w:val="nil"/>
               <w:bottom w:val="single" w:sz="8" w:color="9FB0C2"/>
             </w:tcBorders>
           </w:tcPr>
@@ -1488,9 +1488,9 @@
           <w:tcPr>
             <w:shd w:fill="EEF3F7"/>
             <w:tcBorders>
-              <w:left w:val="single" w:sz="4" w:color="D9E1E8"/>
-              <w:right w:val="single" w:sz="4" w:color="D9E1E8"/>
-              <w:top w:val="single" w:sz="4" w:color="D9E1E8"/>
+              <w:left w:val="nil"/>
+              <w:right w:val="nil"/>
+              <w:top w:val="nil"/>
               <w:bottom w:val="single" w:sz="8" w:color="9FB0C2"/>
             </w:tcBorders>
           </w:tcPr>
@@ -1517,9 +1517,9 @@
           <w:tcPr>
             <w:shd w:fill="EEF3F7"/>
             <w:tcBorders>
-              <w:left w:val="single" w:sz="4" w:color="D9E1E8"/>
-              <w:right w:val="single" w:sz="4" w:color="D9E1E8"/>
-              <w:top w:val="single" w:sz="4" w:color="D9E1E8"/>
+              <w:left w:val="nil"/>
+              <w:right w:val="nil"/>
+              <w:top w:val="nil"/>
               <w:bottom w:val="single" w:sz="8" w:color="9FB0C2"/>
             </w:tcBorders>
           </w:tcPr>
@@ -1546,9 +1546,9 @@
           <w:tcPr>
             <w:shd w:fill="EEF3F7"/>
             <w:tcBorders>
-              <w:left w:val="single" w:sz="4" w:color="D9E1E8"/>
-              <w:right w:val="single" w:sz="4" w:color="D9E1E8"/>
-              <w:top w:val="single" w:sz="4" w:color="D9E1E8"/>
+              <w:left w:val="nil"/>
+              <w:right w:val="nil"/>
+              <w:top w:val="nil"/>
               <w:bottom w:val="single" w:sz="8" w:color="9FB0C2"/>
             </w:tcBorders>
           </w:tcPr>
@@ -1575,9 +1575,9 @@
           <w:tcPr>
             <w:shd w:fill="EEF3F7"/>
             <w:tcBorders>
-              <w:left w:val="single" w:sz="4" w:color="D9E1E8"/>
-              <w:right w:val="single" w:sz="4" w:color="D9E1E8"/>
-              <w:top w:val="single" w:sz="4" w:color="D9E1E8"/>
+              <w:left w:val="nil"/>
+              <w:right w:val="nil"/>
+              <w:top w:val="nil"/>
               <w:bottom w:val="single" w:sz="8" w:color="9FB0C2"/>
             </w:tcBorders>
           </w:tcPr>
@@ -1605,9 +1605,9 @@
         <w:tc>
           <w:tcPr>
             <w:tcBorders>
-              <w:left w:val="single" w:sz="4" w:color="D9E1E8"/>
-              <w:right w:val="single" w:sz="4" w:color="D9E1E8"/>
-              <w:top w:val="single" w:sz="4" w:color="D9E1E8"/>
+              <w:left w:val="nil"/>
+              <w:right w:val="nil"/>
+              <w:top w:val="nil"/>
               <w:bottom w:val="single" w:sz="4" w:color="D9E1E8"/>
             </w:tcBorders>
           </w:tcPr>
@@ -1632,9 +1632,9 @@
         <w:tc>
           <w:tcPr>
             <w:tcBorders>
-              <w:left w:val="single" w:sz="4" w:color="D9E1E8"/>
-              <w:right w:val="single" w:sz="4" w:color="D9E1E8"/>
-              <w:top w:val="single" w:sz="4" w:color="D9E1E8"/>
+              <w:left w:val="nil"/>
+              <w:right w:val="nil"/>
+              <w:top w:val="nil"/>
               <w:bottom w:val="single" w:sz="4" w:color="D9E1E8"/>
             </w:tcBorders>
           </w:tcPr>
@@ -1659,9 +1659,9 @@
         <w:tc>
           <w:tcPr>
             <w:tcBorders>
-              <w:left w:val="single" w:sz="4" w:color="D9E1E8"/>
-              <w:right w:val="single" w:sz="4" w:color="D9E1E8"/>
-              <w:top w:val="single" w:sz="4" w:color="D9E1E8"/>
+              <w:left w:val="nil"/>
+              <w:right w:val="nil"/>
+              <w:top w:val="nil"/>
               <w:bottom w:val="single" w:sz="4" w:color="D9E1E8"/>
             </w:tcBorders>
           </w:tcPr>
@@ -1686,9 +1686,9 @@
         <w:tc>
           <w:tcPr>
             <w:tcBorders>
-              <w:left w:val="single" w:sz="4" w:color="D9E1E8"/>
-              <w:right w:val="single" w:sz="4" w:color="D9E1E8"/>
-              <w:top w:val="single" w:sz="4" w:color="D9E1E8"/>
+              <w:left w:val="nil"/>
+              <w:right w:val="nil"/>
+              <w:top w:val="nil"/>
               <w:bottom w:val="single" w:sz="4" w:color="D9E1E8"/>
             </w:tcBorders>
           </w:tcPr>
@@ -1713,9 +1713,9 @@
         <w:tc>
           <w:tcPr>
             <w:tcBorders>
-              <w:left w:val="single" w:sz="4" w:color="D9E1E8"/>
-              <w:right w:val="single" w:sz="4" w:color="D9E1E8"/>
-              <w:top w:val="single" w:sz="4" w:color="D9E1E8"/>
+              <w:left w:val="nil"/>
+              <w:right w:val="nil"/>
+              <w:top w:val="nil"/>
               <w:bottom w:val="single" w:sz="4" w:color="D9E1E8"/>
             </w:tcBorders>
           </w:tcPr>
@@ -1742,9 +1742,9 @@
         <w:tc>
           <w:tcPr>
             <w:tcBorders>
-              <w:left w:val="single" w:sz="4" w:color="D9E1E8"/>
-              <w:right w:val="single" w:sz="4" w:color="D9E1E8"/>
-              <w:top w:val="single" w:sz="4" w:color="D9E1E8"/>
+              <w:left w:val="nil"/>
+              <w:right w:val="nil"/>
+              <w:top w:val="nil"/>
               <w:bottom w:val="single" w:sz="4" w:color="D9E1E8"/>
             </w:tcBorders>
           </w:tcPr>
@@ -1769,9 +1769,9 @@
         <w:tc>
           <w:tcPr>
             <w:tcBorders>
-              <w:left w:val="single" w:sz="4" w:color="D9E1E8"/>
-              <w:right w:val="single" w:sz="4" w:color="D9E1E8"/>
-              <w:top w:val="single" w:sz="4" w:color="D9E1E8"/>
+              <w:left w:val="nil"/>
+              <w:right w:val="nil"/>
+              <w:top w:val="nil"/>
               <w:bottom w:val="single" w:sz="4" w:color="D9E1E8"/>
             </w:tcBorders>
           </w:tcPr>
@@ -1796,9 +1796,9 @@
         <w:tc>
           <w:tcPr>
             <w:tcBorders>
-              <w:left w:val="single" w:sz="4" w:color="D9E1E8"/>
-              <w:right w:val="single" w:sz="4" w:color="D9E1E8"/>
-              <w:top w:val="single" w:sz="4" w:color="D9E1E8"/>
+              <w:left w:val="nil"/>
+              <w:right w:val="nil"/>
+              <w:top w:val="nil"/>
               <w:bottom w:val="single" w:sz="4" w:color="D9E1E8"/>
             </w:tcBorders>
           </w:tcPr>
@@ -1823,9 +1823,9 @@
         <w:tc>
           <w:tcPr>
             <w:tcBorders>
-              <w:left w:val="single" w:sz="4" w:color="D9E1E8"/>
-              <w:right w:val="single" w:sz="4" w:color="D9E1E8"/>
-              <w:top w:val="single" w:sz="4" w:color="D9E1E8"/>
+              <w:left w:val="nil"/>
+              <w:right w:val="nil"/>
+              <w:top w:val="nil"/>
               <w:bottom w:val="single" w:sz="4" w:color="D9E1E8"/>
             </w:tcBorders>
           </w:tcPr>
@@ -1850,9 +1850,9 @@
         <w:tc>
           <w:tcPr>
             <w:tcBorders>
-              <w:left w:val="single" w:sz="4" w:color="D9E1E8"/>
-              <w:right w:val="single" w:sz="4" w:color="D9E1E8"/>
-              <w:top w:val="single" w:sz="4" w:color="D9E1E8"/>
+              <w:left w:val="nil"/>
+              <w:right w:val="nil"/>
+              <w:top w:val="nil"/>
               <w:bottom w:val="single" w:sz="4" w:color="D9E1E8"/>
             </w:tcBorders>
           </w:tcPr>
@@ -1879,9 +1879,9 @@
         <w:tc>
           <w:tcPr>
             <w:tcBorders>
-              <w:left w:val="single" w:sz="4" w:color="D9E1E8"/>
-              <w:right w:val="single" w:sz="4" w:color="D9E1E8"/>
-              <w:top w:val="single" w:sz="4" w:color="D9E1E8"/>
+              <w:left w:val="nil"/>
+              <w:right w:val="nil"/>
+              <w:top w:val="nil"/>
               <w:bottom w:val="single" w:sz="4" w:color="D9E1E8"/>
             </w:tcBorders>
           </w:tcPr>
@@ -1906,9 +1906,9 @@
         <w:tc>
           <w:tcPr>
             <w:tcBorders>
-              <w:left w:val="single" w:sz="4" w:color="D9E1E8"/>
-              <w:right w:val="single" w:sz="4" w:color="D9E1E8"/>
-              <w:top w:val="single" w:sz="4" w:color="D9E1E8"/>
+              <w:left w:val="nil"/>
+              <w:right w:val="nil"/>
+              <w:top w:val="nil"/>
               <w:bottom w:val="single" w:sz="4" w:color="D9E1E8"/>
             </w:tcBorders>
           </w:tcPr>
@@ -1933,9 +1933,9 @@
         <w:tc>
           <w:tcPr>
             <w:tcBorders>
-              <w:left w:val="single" w:sz="4" w:color="D9E1E8"/>
-              <w:right w:val="single" w:sz="4" w:color="D9E1E8"/>
-              <w:top w:val="single" w:sz="4" w:color="D9E1E8"/>
+              <w:left w:val="nil"/>
+              <w:right w:val="nil"/>
+              <w:top w:val="nil"/>
               <w:bottom w:val="single" w:sz="4" w:color="D9E1E8"/>
             </w:tcBorders>
           </w:tcPr>
@@ -1960,9 +1960,9 @@
         <w:tc>
           <w:tcPr>
             <w:tcBorders>
-              <w:left w:val="single" w:sz="4" w:color="D9E1E8"/>
-              <w:right w:val="single" w:sz="4" w:color="D9E1E8"/>
-              <w:top w:val="single" w:sz="4" w:color="D9E1E8"/>
+              <w:left w:val="nil"/>
+              <w:right w:val="nil"/>
+              <w:top w:val="nil"/>
               <w:bottom w:val="single" w:sz="4" w:color="D9E1E8"/>
             </w:tcBorders>
           </w:tcPr>
@@ -1987,9 +1987,9 @@
         <w:tc>
           <w:tcPr>
             <w:tcBorders>
-              <w:left w:val="single" w:sz="4" w:color="D9E1E8"/>
-              <w:right w:val="single" w:sz="4" w:color="D9E1E8"/>
-              <w:top w:val="single" w:sz="4" w:color="D9E1E8"/>
+              <w:left w:val="nil"/>
+              <w:right w:val="nil"/>
+              <w:top w:val="nil"/>
               <w:bottom w:val="single" w:sz="4" w:color="D9E1E8"/>
             </w:tcBorders>
           </w:tcPr>
@@ -2016,9 +2016,9 @@
         <w:tc>
           <w:tcPr>
             <w:tcBorders>
-              <w:left w:val="single" w:sz="4" w:color="D9E1E8"/>
-              <w:right w:val="single" w:sz="4" w:color="D9E1E8"/>
-              <w:top w:val="single" w:sz="4" w:color="D9E1E8"/>
+              <w:left w:val="nil"/>
+              <w:right w:val="nil"/>
+              <w:top w:val="nil"/>
               <w:bottom w:val="single" w:sz="4" w:color="D9E1E8"/>
             </w:tcBorders>
           </w:tcPr>
@@ -2043,9 +2043,9 @@
         <w:tc>
           <w:tcPr>
             <w:tcBorders>
-              <w:left w:val="single" w:sz="4" w:color="D9E1E8"/>
-              <w:right w:val="single" w:sz="4" w:color="D9E1E8"/>
-              <w:top w:val="single" w:sz="4" w:color="D9E1E8"/>
+              <w:left w:val="nil"/>
+              <w:right w:val="nil"/>
+              <w:top w:val="nil"/>
               <w:bottom w:val="single" w:sz="4" w:color="D9E1E8"/>
             </w:tcBorders>
           </w:tcPr>
@@ -2070,9 +2070,9 @@
         <w:tc>
           <w:tcPr>
             <w:tcBorders>
-              <w:left w:val="single" w:sz="4" w:color="D9E1E8"/>
-              <w:right w:val="single" w:sz="4" w:color="D9E1E8"/>
-              <w:top w:val="single" w:sz="4" w:color="D9E1E8"/>
+              <w:left w:val="nil"/>
+              <w:right w:val="nil"/>
+              <w:top w:val="nil"/>
               <w:bottom w:val="single" w:sz="4" w:color="D9E1E8"/>
             </w:tcBorders>
           </w:tcPr>
@@ -2097,9 +2097,9 @@
         <w:tc>
           <w:tcPr>
             <w:tcBorders>
-              <w:left w:val="single" w:sz="4" w:color="D9E1E8"/>
-              <w:right w:val="single" w:sz="4" w:color="D9E1E8"/>
-              <w:top w:val="single" w:sz="4" w:color="D9E1E8"/>
+              <w:left w:val="nil"/>
+              <w:right w:val="nil"/>
+              <w:top w:val="nil"/>
               <w:bottom w:val="single" w:sz="4" w:color="D9E1E8"/>
             </w:tcBorders>
           </w:tcPr>
@@ -2124,9 +2124,9 @@
         <w:tc>
           <w:tcPr>
             <w:tcBorders>
-              <w:left w:val="single" w:sz="4" w:color="D9E1E8"/>
-              <w:right w:val="single" w:sz="4" w:color="D9E1E8"/>
-              <w:top w:val="single" w:sz="4" w:color="D9E1E8"/>
+              <w:left w:val="nil"/>
+              <w:right w:val="nil"/>
+              <w:top w:val="nil"/>
               <w:bottom w:val="single" w:sz="4" w:color="D9E1E8"/>
             </w:tcBorders>
           </w:tcPr>
@@ -2153,9 +2153,9 @@
         <w:tc>
           <w:tcPr>
             <w:tcBorders>
-              <w:left w:val="single" w:sz="4" w:color="D9E1E8"/>
-              <w:right w:val="single" w:sz="4" w:color="D9E1E8"/>
-              <w:top w:val="single" w:sz="4" w:color="D9E1E8"/>
+              <w:left w:val="nil"/>
+              <w:right w:val="nil"/>
+              <w:top w:val="nil"/>
               <w:bottom w:val="single" w:sz="4" w:color="D9E1E8"/>
             </w:tcBorders>
           </w:tcPr>
@@ -2180,9 +2180,9 @@
         <w:tc>
           <w:tcPr>
             <w:tcBorders>
-              <w:left w:val="single" w:sz="4" w:color="D9E1E8"/>
-              <w:right w:val="single" w:sz="4" w:color="D9E1E8"/>
-              <w:top w:val="single" w:sz="4" w:color="D9E1E8"/>
+              <w:left w:val="nil"/>
+              <w:right w:val="nil"/>
+              <w:top w:val="nil"/>
               <w:bottom w:val="single" w:sz="4" w:color="D9E1E8"/>
             </w:tcBorders>
           </w:tcPr>
@@ -2207,9 +2207,9 @@
         <w:tc>
           <w:tcPr>
             <w:tcBorders>
-              <w:left w:val="single" w:sz="4" w:color="D9E1E8"/>
-              <w:right w:val="single" w:sz="4" w:color="D9E1E8"/>
-              <w:top w:val="single" w:sz="4" w:color="D9E1E8"/>
+              <w:left w:val="nil"/>
+              <w:right w:val="nil"/>
+              <w:top w:val="nil"/>
               <w:bottom w:val="single" w:sz="4" w:color="D9E1E8"/>
             </w:tcBorders>
           </w:tcPr>
@@ -2234,9 +2234,9 @@
         <w:tc>
           <w:tcPr>
             <w:tcBorders>
-              <w:left w:val="single" w:sz="4" w:color="D9E1E8"/>
-              <w:right w:val="single" w:sz="4" w:color="D9E1E8"/>
-              <w:top w:val="single" w:sz="4" w:color="D9E1E8"/>
+              <w:left w:val="nil"/>
+              <w:right w:val="nil"/>
+              <w:top w:val="nil"/>
               <w:bottom w:val="single" w:sz="4" w:color="D9E1E8"/>
             </w:tcBorders>
           </w:tcPr>
@@ -2261,9 +2261,9 @@
         <w:tc>
           <w:tcPr>
             <w:tcBorders>
-              <w:left w:val="single" w:sz="4" w:color="D9E1E8"/>
-              <w:right w:val="single" w:sz="4" w:color="D9E1E8"/>
-              <w:top w:val="single" w:sz="4" w:color="D9E1E8"/>
+              <w:left w:val="nil"/>
+              <w:right w:val="nil"/>
+              <w:top w:val="nil"/>
               <w:bottom w:val="single" w:sz="4" w:color="D9E1E8"/>
             </w:tcBorders>
           </w:tcPr>
@@ -2290,9 +2290,9 @@
         <w:tc>
           <w:tcPr>
             <w:tcBorders>
-              <w:left w:val="single" w:sz="4" w:color="D9E1E8"/>
-              <w:right w:val="single" w:sz="4" w:color="D9E1E8"/>
-              <w:top w:val="single" w:sz="4" w:color="D9E1E8"/>
+              <w:left w:val="nil"/>
+              <w:right w:val="nil"/>
+              <w:top w:val="nil"/>
               <w:bottom w:val="single" w:sz="4" w:color="D9E1E8"/>
             </w:tcBorders>
           </w:tcPr>
@@ -2317,9 +2317,9 @@
         <w:tc>
           <w:tcPr>
             <w:tcBorders>
-              <w:left w:val="single" w:sz="4" w:color="D9E1E8"/>
-              <w:right w:val="single" w:sz="4" w:color="D9E1E8"/>
-              <w:top w:val="single" w:sz="4" w:color="D9E1E8"/>
+              <w:left w:val="nil"/>
+              <w:right w:val="nil"/>
+              <w:top w:val="nil"/>
               <w:bottom w:val="single" w:sz="4" w:color="D9E1E8"/>
             </w:tcBorders>
           </w:tcPr>
@@ -2344,9 +2344,9 @@
         <w:tc>
           <w:tcPr>
             <w:tcBorders>
-              <w:left w:val="single" w:sz="4" w:color="D9E1E8"/>
-              <w:right w:val="single" w:sz="4" w:color="D9E1E8"/>
-              <w:top w:val="single" w:sz="4" w:color="D9E1E8"/>
+              <w:left w:val="nil"/>
+              <w:right w:val="nil"/>
+              <w:top w:val="nil"/>
               <w:bottom w:val="single" w:sz="4" w:color="D9E1E8"/>
             </w:tcBorders>
           </w:tcPr>
@@ -2371,9 +2371,9 @@
         <w:tc>
           <w:tcPr>
             <w:tcBorders>
-              <w:left w:val="single" w:sz="4" w:color="D9E1E8"/>
-              <w:right w:val="single" w:sz="4" w:color="D9E1E8"/>
-              <w:top w:val="single" w:sz="4" w:color="D9E1E8"/>
+              <w:left w:val="nil"/>
+              <w:right w:val="nil"/>
+              <w:top w:val="nil"/>
               <w:bottom w:val="single" w:sz="4" w:color="D9E1E8"/>
             </w:tcBorders>
           </w:tcPr>
@@ -2398,9 +2398,9 @@
         <w:tc>
           <w:tcPr>
             <w:tcBorders>
-              <w:left w:val="single" w:sz="4" w:color="D9E1E8"/>
-              <w:right w:val="single" w:sz="4" w:color="D9E1E8"/>
-              <w:top w:val="single" w:sz="4" w:color="D9E1E8"/>
+              <w:left w:val="nil"/>
+              <w:right w:val="nil"/>
+              <w:top w:val="nil"/>
               <w:bottom w:val="single" w:sz="4" w:color="D9E1E8"/>
             </w:tcBorders>
           </w:tcPr>
@@ -2427,9 +2427,9 @@
         <w:tc>
           <w:tcPr>
             <w:tcBorders>
-              <w:left w:val="single" w:sz="4" w:color="D9E1E8"/>
-              <w:right w:val="single" w:sz="4" w:color="D9E1E8"/>
-              <w:top w:val="single" w:sz="4" w:color="D9E1E8"/>
+              <w:left w:val="nil"/>
+              <w:right w:val="nil"/>
+              <w:top w:val="nil"/>
               <w:bottom w:val="nil"/>
             </w:tcBorders>
           </w:tcPr>
@@ -2456,9 +2456,9 @@
         <w:tc>
           <w:tcPr>
             <w:tcBorders>
-              <w:left w:val="single" w:sz="4" w:color="D9E1E8"/>
-              <w:right w:val="single" w:sz="4" w:color="D9E1E8"/>
-              <w:top w:val="single" w:sz="4" w:color="D9E1E8"/>
+              <w:left w:val="nil"/>
+              <w:right w:val="nil"/>
+              <w:top w:val="nil"/>
               <w:bottom w:val="nil"/>
             </w:tcBorders>
           </w:tcPr>
@@ -2483,9 +2483,9 @@
         <w:tc>
           <w:tcPr>
             <w:tcBorders>
-              <w:left w:val="single" w:sz="4" w:color="D9E1E8"/>
-              <w:right w:val="single" w:sz="4" w:color="D9E1E8"/>
-              <w:top w:val="single" w:sz="4" w:color="D9E1E8"/>
+              <w:left w:val="nil"/>
+              <w:right w:val="nil"/>
+              <w:top w:val="nil"/>
               <w:bottom w:val="nil"/>
             </w:tcBorders>
           </w:tcPr>
@@ -2510,9 +2510,9 @@
         <w:tc>
           <w:tcPr>
             <w:tcBorders>
-              <w:left w:val="single" w:sz="4" w:color="D9E1E8"/>
-              <w:right w:val="single" w:sz="4" w:color="D9E1E8"/>
-              <w:top w:val="single" w:sz="4" w:color="D9E1E8"/>
+              <w:left w:val="nil"/>
+              <w:right w:val="nil"/>
+              <w:top w:val="nil"/>
               <w:bottom w:val="nil"/>
             </w:tcBorders>
           </w:tcPr>
@@ -2537,9 +2537,9 @@
         <w:tc>
           <w:tcPr>
             <w:tcBorders>
-              <w:left w:val="single" w:sz="4" w:color="D9E1E8"/>
-              <w:right w:val="single" w:sz="4" w:color="D9E1E8"/>
-              <w:top w:val="single" w:sz="4" w:color="D9E1E8"/>
+              <w:left w:val="nil"/>
+              <w:right w:val="nil"/>
+              <w:top w:val="nil"/>
               <w:bottom w:val="nil"/>
             </w:tcBorders>
           </w:tcPr>
@@ -13080,9 +13080,9 @@
           <w:tcPr>
             <w:shd w:fill="EEF3F7"/>
             <w:tcBorders>
-              <w:left w:val="single" w:sz="4" w:color="D9E1E8"/>
-              <w:right w:val="single" w:sz="4" w:color="D9E1E8"/>
-              <w:top w:val="single" w:sz="4" w:color="D9E1E8"/>
+              <w:left w:val="nil"/>
+              <w:right w:val="nil"/>
+              <w:top w:val="nil"/>
               <w:bottom w:val="single" w:sz="8" w:color="9FB0C2"/>
             </w:tcBorders>
           </w:tcPr>
@@ -13109,9 +13109,9 @@
           <w:tcPr>
             <w:shd w:fill="EEF3F7"/>
             <w:tcBorders>
-              <w:left w:val="single" w:sz="4" w:color="D9E1E8"/>
-              <w:right w:val="single" w:sz="4" w:color="D9E1E8"/>
-              <w:top w:val="single" w:sz="4" w:color="D9E1E8"/>
+              <w:left w:val="nil"/>
+              <w:right w:val="nil"/>
+              <w:top w:val="nil"/>
               <w:bottom w:val="single" w:sz="8" w:color="9FB0C2"/>
             </w:tcBorders>
           </w:tcPr>
@@ -13138,9 +13138,9 @@
           <w:tcPr>
             <w:shd w:fill="EEF3F7"/>
             <w:tcBorders>
-              <w:left w:val="single" w:sz="4" w:color="D9E1E8"/>
-              <w:right w:val="single" w:sz="4" w:color="D9E1E8"/>
-              <w:top w:val="single" w:sz="4" w:color="D9E1E8"/>
+              <w:left w:val="nil"/>
+              <w:right w:val="nil"/>
+              <w:top w:val="nil"/>
               <w:bottom w:val="single" w:sz="8" w:color="9FB0C2"/>
             </w:tcBorders>
           </w:tcPr>
@@ -13183,9 +13183,9 @@
           <w:tcPr>
             <w:shd w:fill="EEF3F7"/>
             <w:tcBorders>
-              <w:left w:val="single" w:sz="4" w:color="D9E1E8"/>
-              <w:right w:val="single" w:sz="4" w:color="D9E1E8"/>
-              <w:top w:val="single" w:sz="4" w:color="D9E1E8"/>
+              <w:left w:val="nil"/>
+              <w:right w:val="nil"/>
+              <w:top w:val="nil"/>
               <w:bottom w:val="single" w:sz="8" w:color="9FB0C2"/>
             </w:tcBorders>
           </w:tcPr>
@@ -13228,9 +13228,9 @@
           <w:tcPr>
             <w:shd w:fill="EEF3F7"/>
             <w:tcBorders>
-              <w:left w:val="single" w:sz="4" w:color="D9E1E8"/>
-              <w:right w:val="single" w:sz="4" w:color="D9E1E8"/>
-              <w:top w:val="single" w:sz="4" w:color="D9E1E8"/>
+              <w:left w:val="nil"/>
+              <w:right w:val="nil"/>
+              <w:top w:val="nil"/>
               <w:bottom w:val="single" w:sz="8" w:color="9FB0C2"/>
             </w:tcBorders>
           </w:tcPr>
@@ -13273,9 +13273,9 @@
           <w:tcPr>
             <w:shd w:fill="EEF3F7"/>
             <w:tcBorders>
-              <w:left w:val="single" w:sz="4" w:color="D9E1E8"/>
-              <w:right w:val="single" w:sz="4" w:color="D9E1E8"/>
-              <w:top w:val="single" w:sz="4" w:color="D9E1E8"/>
+              <w:left w:val="nil"/>
+              <w:right w:val="nil"/>
+              <w:top w:val="nil"/>
               <w:bottom w:val="single" w:sz="8" w:color="9FB0C2"/>
             </w:tcBorders>
           </w:tcPr>
@@ -13319,9 +13319,9 @@
         <w:tc>
           <w:tcPr>
             <w:tcBorders>
-              <w:left w:val="single" w:sz="4" w:color="D9E1E8"/>
-              <w:right w:val="single" w:sz="4" w:color="D9E1E8"/>
-              <w:top w:val="single" w:sz="4" w:color="D9E1E8"/>
+              <w:left w:val="nil"/>
+              <w:right w:val="nil"/>
+              <w:top w:val="nil"/>
               <w:bottom w:val="single" w:sz="4" w:color="D9E1E8"/>
             </w:tcBorders>
           </w:tcPr>
@@ -13348,9 +13348,9 @@
         <w:tc>
           <w:tcPr>
             <w:tcBorders>
-              <w:left w:val="single" w:sz="4" w:color="D9E1E8"/>
-              <w:right w:val="single" w:sz="4" w:color="D9E1E8"/>
-              <w:top w:val="single" w:sz="4" w:color="D9E1E8"/>
+              <w:left w:val="nil"/>
+              <w:right w:val="nil"/>
+              <w:top w:val="nil"/>
               <w:bottom w:val="single" w:sz="4" w:color="D9E1E8"/>
             </w:tcBorders>
           </w:tcPr>
@@ -13375,9 +13375,9 @@
         <w:tc>
           <w:tcPr>
             <w:tcBorders>
-              <w:left w:val="single" w:sz="4" w:color="D9E1E8"/>
-              <w:right w:val="single" w:sz="4" w:color="D9E1E8"/>
-              <w:top w:val="single" w:sz="4" w:color="D9E1E8"/>
+              <w:left w:val="nil"/>
+              <w:right w:val="nil"/>
+              <w:top w:val="nil"/>
               <w:bottom w:val="single" w:sz="4" w:color="D9E1E8"/>
             </w:tcBorders>
           </w:tcPr>
@@ -13404,9 +13404,9 @@
         <w:tc>
           <w:tcPr>
             <w:tcBorders>
-              <w:left w:val="single" w:sz="4" w:color="D9E1E8"/>
-              <w:right w:val="single" w:sz="4" w:color="D9E1E8"/>
-              <w:top w:val="single" w:sz="4" w:color="D9E1E8"/>
+              <w:left w:val="nil"/>
+              <w:right w:val="nil"/>
+              <w:top w:val="nil"/>
               <w:bottom w:val="single" w:sz="4" w:color="D9E1E8"/>
             </w:tcBorders>
           </w:tcPr>
@@ -13433,9 +13433,9 @@
         <w:tc>
           <w:tcPr>
             <w:tcBorders>
-              <w:left w:val="single" w:sz="4" w:color="D9E1E8"/>
-              <w:right w:val="single" w:sz="4" w:color="D9E1E8"/>
-              <w:top w:val="single" w:sz="4" w:color="D9E1E8"/>
+              <w:left w:val="nil"/>
+              <w:right w:val="nil"/>
+              <w:top w:val="nil"/>
               <w:bottom w:val="single" w:sz="4" w:color="D9E1E8"/>
             </w:tcBorders>
           </w:tcPr>
@@ -13462,9 +13462,9 @@
         <w:tc>
           <w:tcPr>
             <w:tcBorders>
-              <w:left w:val="single" w:sz="4" w:color="D9E1E8"/>
-              <w:right w:val="single" w:sz="4" w:color="D9E1E8"/>
-              <w:top w:val="single" w:sz="4" w:color="D9E1E8"/>
+              <w:left w:val="nil"/>
+              <w:right w:val="nil"/>
+              <w:top w:val="nil"/>
               <w:bottom w:val="single" w:sz="4" w:color="D9E1E8"/>
             </w:tcBorders>
           </w:tcPr>
@@ -13493,9 +13493,9 @@
         <w:tc>
           <w:tcPr>
             <w:tcBorders>
-              <w:left w:val="single" w:sz="4" w:color="D9E1E8"/>
-              <w:right w:val="single" w:sz="4" w:color="D9E1E8"/>
-              <w:top w:val="single" w:sz="4" w:color="D9E1E8"/>
+              <w:left w:val="nil"/>
+              <w:right w:val="nil"/>
+              <w:top w:val="nil"/>
               <w:bottom w:val="single" w:sz="4" w:color="D9E1E8"/>
             </w:tcBorders>
           </w:tcPr>
@@ -13522,9 +13522,9 @@
         <w:tc>
           <w:tcPr>
             <w:tcBorders>
-              <w:left w:val="single" w:sz="4" w:color="D9E1E8"/>
-              <w:right w:val="single" w:sz="4" w:color="D9E1E8"/>
-              <w:top w:val="single" w:sz="4" w:color="D9E1E8"/>
+              <w:left w:val="nil"/>
+              <w:right w:val="nil"/>
+              <w:top w:val="nil"/>
               <w:bottom w:val="single" w:sz="4" w:color="D9E1E8"/>
             </w:tcBorders>
           </w:tcPr>
@@ -13549,9 +13549,9 @@
         <w:tc>
           <w:tcPr>
             <w:tcBorders>
-              <w:left w:val="single" w:sz="4" w:color="D9E1E8"/>
-              <w:right w:val="single" w:sz="4" w:color="D9E1E8"/>
-              <w:top w:val="single" w:sz="4" w:color="D9E1E8"/>
+              <w:left w:val="nil"/>
+              <w:right w:val="nil"/>
+              <w:top w:val="nil"/>
               <w:bottom w:val="single" w:sz="4" w:color="D9E1E8"/>
             </w:tcBorders>
           </w:tcPr>
@@ -13576,9 +13576,9 @@
         <w:tc>
           <w:tcPr>
             <w:tcBorders>
-              <w:left w:val="single" w:sz="4" w:color="D9E1E8"/>
-              <w:right w:val="single" w:sz="4" w:color="D9E1E8"/>
-              <w:top w:val="single" w:sz="4" w:color="D9E1E8"/>
+              <w:left w:val="nil"/>
+              <w:right w:val="nil"/>
+              <w:top w:val="nil"/>
               <w:bottom w:val="single" w:sz="4" w:color="D9E1E8"/>
             </w:tcBorders>
           </w:tcPr>
@@ -13603,9 +13603,9 @@
         <w:tc>
           <w:tcPr>
             <w:tcBorders>
-              <w:left w:val="single" w:sz="4" w:color="D9E1E8"/>
-              <w:right w:val="single" w:sz="4" w:color="D9E1E8"/>
-              <w:top w:val="single" w:sz="4" w:color="D9E1E8"/>
+              <w:left w:val="nil"/>
+              <w:right w:val="nil"/>
+              <w:top w:val="nil"/>
               <w:bottom w:val="single" w:sz="4" w:color="D9E1E8"/>
             </w:tcBorders>
           </w:tcPr>
@@ -13630,9 +13630,9 @@
         <w:tc>
           <w:tcPr>
             <w:tcBorders>
-              <w:left w:val="single" w:sz="4" w:color="D9E1E8"/>
-              <w:right w:val="single" w:sz="4" w:color="D9E1E8"/>
-              <w:top w:val="single" w:sz="4" w:color="D9E1E8"/>
+              <w:left w:val="nil"/>
+              <w:right w:val="nil"/>
+              <w:top w:val="nil"/>
               <w:bottom w:val="single" w:sz="4" w:color="D9E1E8"/>
             </w:tcBorders>
           </w:tcPr>
@@ -13659,9 +13659,9 @@
         <w:tc>
           <w:tcPr>
             <w:tcBorders>
-              <w:left w:val="single" w:sz="4" w:color="D9E1E8"/>
-              <w:right w:val="single" w:sz="4" w:color="D9E1E8"/>
-              <w:top w:val="single" w:sz="4" w:color="D9E1E8"/>
+              <w:left w:val="nil"/>
+              <w:right w:val="nil"/>
+              <w:top w:val="nil"/>
               <w:bottom w:val="single" w:sz="4" w:color="D9E1E8"/>
             </w:tcBorders>
           </w:tcPr>
@@ -13686,9 +13686,9 @@
         <w:tc>
           <w:tcPr>
             <w:tcBorders>
-              <w:left w:val="single" w:sz="4" w:color="D9E1E8"/>
-              <w:right w:val="single" w:sz="4" w:color="D9E1E8"/>
-              <w:top w:val="single" w:sz="4" w:color="D9E1E8"/>
+              <w:left w:val="nil"/>
+              <w:right w:val="nil"/>
+              <w:top w:val="nil"/>
               <w:bottom w:val="single" w:sz="4" w:color="D9E1E8"/>
             </w:tcBorders>
           </w:tcPr>
@@ -13713,9 +13713,9 @@
         <w:tc>
           <w:tcPr>
             <w:tcBorders>
-              <w:left w:val="single" w:sz="4" w:color="D9E1E8"/>
-              <w:right w:val="single" w:sz="4" w:color="D9E1E8"/>
-              <w:top w:val="single" w:sz="4" w:color="D9E1E8"/>
+              <w:left w:val="nil"/>
+              <w:right w:val="nil"/>
+              <w:top w:val="nil"/>
               <w:bottom w:val="single" w:sz="4" w:color="D9E1E8"/>
             </w:tcBorders>
           </w:tcPr>
@@ -13740,9 +13740,9 @@
         <w:tc>
           <w:tcPr>
             <w:tcBorders>
-              <w:left w:val="single" w:sz="4" w:color="D9E1E8"/>
-              <w:right w:val="single" w:sz="4" w:color="D9E1E8"/>
-              <w:top w:val="single" w:sz="4" w:color="D9E1E8"/>
+              <w:left w:val="nil"/>
+              <w:right w:val="nil"/>
+              <w:top w:val="nil"/>
               <w:bottom w:val="single" w:sz="4" w:color="D9E1E8"/>
             </w:tcBorders>
           </w:tcPr>
@@ -13767,9 +13767,9 @@
         <w:tc>
           <w:tcPr>
             <w:tcBorders>
-              <w:left w:val="single" w:sz="4" w:color="D9E1E8"/>
-              <w:right w:val="single" w:sz="4" w:color="D9E1E8"/>
-              <w:top w:val="single" w:sz="4" w:color="D9E1E8"/>
+              <w:left w:val="nil"/>
+              <w:right w:val="nil"/>
+              <w:top w:val="nil"/>
               <w:bottom w:val="single" w:sz="4" w:color="D9E1E8"/>
             </w:tcBorders>
           </w:tcPr>
@@ -13794,9 +13794,9 @@
         <w:tc>
           <w:tcPr>
             <w:tcBorders>
-              <w:left w:val="single" w:sz="4" w:color="D9E1E8"/>
-              <w:right w:val="single" w:sz="4" w:color="D9E1E8"/>
-              <w:top w:val="single" w:sz="4" w:color="D9E1E8"/>
+              <w:left w:val="nil"/>
+              <w:right w:val="nil"/>
+              <w:top w:val="nil"/>
               <w:bottom w:val="single" w:sz="4" w:color="D9E1E8"/>
             </w:tcBorders>
           </w:tcPr>
@@ -13823,9 +13823,9 @@
         <w:tc>
           <w:tcPr>
             <w:tcBorders>
-              <w:left w:val="single" w:sz="4" w:color="D9E1E8"/>
-              <w:right w:val="single" w:sz="4" w:color="D9E1E8"/>
-              <w:top w:val="single" w:sz="4" w:color="D9E1E8"/>
+              <w:left w:val="nil"/>
+              <w:right w:val="nil"/>
+              <w:top w:val="nil"/>
               <w:bottom w:val="single" w:sz="4" w:color="D9E1E8"/>
             </w:tcBorders>
           </w:tcPr>
@@ -13850,9 +13850,9 @@
         <w:tc>
           <w:tcPr>
             <w:tcBorders>
-              <w:left w:val="single" w:sz="4" w:color="D9E1E8"/>
-              <w:right w:val="single" w:sz="4" w:color="D9E1E8"/>
-              <w:top w:val="single" w:sz="4" w:color="D9E1E8"/>
+              <w:left w:val="nil"/>
+              <w:right w:val="nil"/>
+              <w:top w:val="nil"/>
               <w:bottom w:val="single" w:sz="4" w:color="D9E1E8"/>
             </w:tcBorders>
           </w:tcPr>
@@ -13877,9 +13877,9 @@
         <w:tc>
           <w:tcPr>
             <w:tcBorders>
-              <w:left w:val="single" w:sz="4" w:color="D9E1E8"/>
-              <w:right w:val="single" w:sz="4" w:color="D9E1E8"/>
-              <w:top w:val="single" w:sz="4" w:color="D9E1E8"/>
+              <w:left w:val="nil"/>
+              <w:right w:val="nil"/>
+              <w:top w:val="nil"/>
               <w:bottom w:val="single" w:sz="4" w:color="D9E1E8"/>
             </w:tcBorders>
           </w:tcPr>
@@ -13904,9 +13904,9 @@
         <w:tc>
           <w:tcPr>
             <w:tcBorders>
-              <w:left w:val="single" w:sz="4" w:color="D9E1E8"/>
-              <w:right w:val="single" w:sz="4" w:color="D9E1E8"/>
-              <w:top w:val="single" w:sz="4" w:color="D9E1E8"/>
+              <w:left w:val="nil"/>
+              <w:right w:val="nil"/>
+              <w:top w:val="nil"/>
               <w:bottom w:val="single" w:sz="4" w:color="D9E1E8"/>
             </w:tcBorders>
           </w:tcPr>
@@ -13931,9 +13931,9 @@
         <w:tc>
           <w:tcPr>
             <w:tcBorders>
-              <w:left w:val="single" w:sz="4" w:color="D9E1E8"/>
-              <w:right w:val="single" w:sz="4" w:color="D9E1E8"/>
-              <w:top w:val="single" w:sz="4" w:color="D9E1E8"/>
+              <w:left w:val="nil"/>
+              <w:right w:val="nil"/>
+              <w:top w:val="nil"/>
               <w:bottom w:val="single" w:sz="4" w:color="D9E1E8"/>
             </w:tcBorders>
           </w:tcPr>
@@ -13958,9 +13958,9 @@
         <w:tc>
           <w:tcPr>
             <w:tcBorders>
-              <w:left w:val="single" w:sz="4" w:color="D9E1E8"/>
-              <w:right w:val="single" w:sz="4" w:color="D9E1E8"/>
-              <w:top w:val="single" w:sz="4" w:color="D9E1E8"/>
+              <w:left w:val="nil"/>
+              <w:right w:val="nil"/>
+              <w:top w:val="nil"/>
               <w:bottom w:val="single" w:sz="4" w:color="D9E1E8"/>
             </w:tcBorders>
           </w:tcPr>
@@ -13987,9 +13987,9 @@
         <w:tc>
           <w:tcPr>
             <w:tcBorders>
-              <w:left w:val="single" w:sz="4" w:color="D9E1E8"/>
-              <w:right w:val="single" w:sz="4" w:color="D9E1E8"/>
-              <w:top w:val="single" w:sz="4" w:color="D9E1E8"/>
+              <w:left w:val="nil"/>
+              <w:right w:val="nil"/>
+              <w:top w:val="nil"/>
               <w:bottom w:val="single" w:sz="4" w:color="D9E1E8"/>
             </w:tcBorders>
           </w:tcPr>
@@ -14014,9 +14014,9 @@
         <w:tc>
           <w:tcPr>
             <w:tcBorders>
-              <w:left w:val="single" w:sz="4" w:color="D9E1E8"/>
-              <w:right w:val="single" w:sz="4" w:color="D9E1E8"/>
-              <w:top w:val="single" w:sz="4" w:color="D9E1E8"/>
+              <w:left w:val="nil"/>
+              <w:right w:val="nil"/>
+              <w:top w:val="nil"/>
               <w:bottom w:val="single" w:sz="4" w:color="D9E1E8"/>
             </w:tcBorders>
           </w:tcPr>
@@ -14041,9 +14041,9 @@
         <w:tc>
           <w:tcPr>
             <w:tcBorders>
-              <w:left w:val="single" w:sz="4" w:color="D9E1E8"/>
-              <w:right w:val="single" w:sz="4" w:color="D9E1E8"/>
-              <w:top w:val="single" w:sz="4" w:color="D9E1E8"/>
+              <w:left w:val="nil"/>
+              <w:right w:val="nil"/>
+              <w:top w:val="nil"/>
               <w:bottom w:val="single" w:sz="4" w:color="D9E1E8"/>
             </w:tcBorders>
           </w:tcPr>
@@ -14068,9 +14068,9 @@
         <w:tc>
           <w:tcPr>
             <w:tcBorders>
-              <w:left w:val="single" w:sz="4" w:color="D9E1E8"/>
-              <w:right w:val="single" w:sz="4" w:color="D9E1E8"/>
-              <w:top w:val="single" w:sz="4" w:color="D9E1E8"/>
+              <w:left w:val="nil"/>
+              <w:right w:val="nil"/>
+              <w:top w:val="nil"/>
               <w:bottom w:val="single" w:sz="4" w:color="D9E1E8"/>
             </w:tcBorders>
           </w:tcPr>
@@ -14095,9 +14095,9 @@
         <w:tc>
           <w:tcPr>
             <w:tcBorders>
-              <w:left w:val="single" w:sz="4" w:color="D9E1E8"/>
-              <w:right w:val="single" w:sz="4" w:color="D9E1E8"/>
-              <w:top w:val="single" w:sz="4" w:color="D9E1E8"/>
+              <w:left w:val="nil"/>
+              <w:right w:val="nil"/>
+              <w:top w:val="nil"/>
               <w:bottom w:val="single" w:sz="4" w:color="D9E1E8"/>
             </w:tcBorders>
           </w:tcPr>
@@ -14122,9 +14122,9 @@
         <w:tc>
           <w:tcPr>
             <w:tcBorders>
-              <w:left w:val="single" w:sz="4" w:color="D9E1E8"/>
-              <w:right w:val="single" w:sz="4" w:color="D9E1E8"/>
-              <w:top w:val="single" w:sz="4" w:color="D9E1E8"/>
+              <w:left w:val="nil"/>
+              <w:right w:val="nil"/>
+              <w:top w:val="nil"/>
               <w:bottom w:val="single" w:sz="4" w:color="D9E1E8"/>
             </w:tcBorders>
           </w:tcPr>
@@ -14151,9 +14151,9 @@
         <w:tc>
           <w:tcPr>
             <w:tcBorders>
-              <w:left w:val="single" w:sz="4" w:color="D9E1E8"/>
-              <w:right w:val="single" w:sz="4" w:color="D9E1E8"/>
-              <w:top w:val="single" w:sz="4" w:color="D9E1E8"/>
+              <w:left w:val="nil"/>
+              <w:right w:val="nil"/>
+              <w:top w:val="nil"/>
               <w:bottom w:val="single" w:sz="4" w:color="D9E1E8"/>
             </w:tcBorders>
           </w:tcPr>
@@ -14178,9 +14178,9 @@
         <w:tc>
           <w:tcPr>
             <w:tcBorders>
-              <w:left w:val="single" w:sz="4" w:color="D9E1E8"/>
-              <w:right w:val="single" w:sz="4" w:color="D9E1E8"/>
-              <w:top w:val="single" w:sz="4" w:color="D9E1E8"/>
+              <w:left w:val="nil"/>
+              <w:right w:val="nil"/>
+              <w:top w:val="nil"/>
               <w:bottom w:val="single" w:sz="4" w:color="D9E1E8"/>
             </w:tcBorders>
           </w:tcPr>
@@ -14205,9 +14205,9 @@
         <w:tc>
           <w:tcPr>
             <w:tcBorders>
-              <w:left w:val="single" w:sz="4" w:color="D9E1E8"/>
-              <w:right w:val="single" w:sz="4" w:color="D9E1E8"/>
-              <w:top w:val="single" w:sz="4" w:color="D9E1E8"/>
+              <w:left w:val="nil"/>
+              <w:right w:val="nil"/>
+              <w:top w:val="nil"/>
               <w:bottom w:val="single" w:sz="4" w:color="D9E1E8"/>
             </w:tcBorders>
           </w:tcPr>
@@ -14232,9 +14232,9 @@
         <w:tc>
           <w:tcPr>
             <w:tcBorders>
-              <w:left w:val="single" w:sz="4" w:color="D9E1E8"/>
-              <w:right w:val="single" w:sz="4" w:color="D9E1E8"/>
-              <w:top w:val="single" w:sz="4" w:color="D9E1E8"/>
+              <w:left w:val="nil"/>
+              <w:right w:val="nil"/>
+              <w:top w:val="nil"/>
               <w:bottom w:val="single" w:sz="4" w:color="D9E1E8"/>
             </w:tcBorders>
           </w:tcPr>
@@ -14259,9 +14259,9 @@
         <w:tc>
           <w:tcPr>
             <w:tcBorders>
-              <w:left w:val="single" w:sz="4" w:color="D9E1E8"/>
-              <w:right w:val="single" w:sz="4" w:color="D9E1E8"/>
-              <w:top w:val="single" w:sz="4" w:color="D9E1E8"/>
+              <w:left w:val="nil"/>
+              <w:right w:val="nil"/>
+              <w:top w:val="nil"/>
               <w:bottom w:val="single" w:sz="4" w:color="D9E1E8"/>
             </w:tcBorders>
           </w:tcPr>
@@ -14286,9 +14286,9 @@
         <w:tc>
           <w:tcPr>
             <w:tcBorders>
-              <w:left w:val="single" w:sz="4" w:color="D9E1E8"/>
-              <w:right w:val="single" w:sz="4" w:color="D9E1E8"/>
-              <w:top w:val="single" w:sz="4" w:color="D9E1E8"/>
+              <w:left w:val="nil"/>
+              <w:right w:val="nil"/>
+              <w:top w:val="nil"/>
               <w:bottom w:val="single" w:sz="4" w:color="D9E1E8"/>
             </w:tcBorders>
           </w:tcPr>
@@ -14315,9 +14315,9 @@
         <w:tc>
           <w:tcPr>
             <w:tcBorders>
-              <w:left w:val="single" w:sz="4" w:color="D9E1E8"/>
-              <w:right w:val="single" w:sz="4" w:color="D9E1E8"/>
-              <w:top w:val="single" w:sz="4" w:color="D9E1E8"/>
+              <w:left w:val="nil"/>
+              <w:right w:val="nil"/>
+              <w:top w:val="nil"/>
               <w:bottom w:val="single" w:sz="4" w:color="D9E1E8"/>
             </w:tcBorders>
           </w:tcPr>
@@ -14342,9 +14342,9 @@
         <w:tc>
           <w:tcPr>
             <w:tcBorders>
-              <w:left w:val="single" w:sz="4" w:color="D9E1E8"/>
-              <w:right w:val="single" w:sz="4" w:color="D9E1E8"/>
-              <w:top w:val="single" w:sz="4" w:color="D9E1E8"/>
+              <w:left w:val="nil"/>
+              <w:right w:val="nil"/>
+              <w:top w:val="nil"/>
               <w:bottom w:val="single" w:sz="4" w:color="D9E1E8"/>
             </w:tcBorders>
           </w:tcPr>
@@ -14369,9 +14369,9 @@
         <w:tc>
           <w:tcPr>
             <w:tcBorders>
-              <w:left w:val="single" w:sz="4" w:color="D9E1E8"/>
-              <w:right w:val="single" w:sz="4" w:color="D9E1E8"/>
-              <w:top w:val="single" w:sz="4" w:color="D9E1E8"/>
+              <w:left w:val="nil"/>
+              <w:right w:val="nil"/>
+              <w:top w:val="nil"/>
               <w:bottom w:val="single" w:sz="4" w:color="D9E1E8"/>
             </w:tcBorders>
           </w:tcPr>
@@ -14396,9 +14396,9 @@
         <w:tc>
           <w:tcPr>
             <w:tcBorders>
-              <w:left w:val="single" w:sz="4" w:color="D9E1E8"/>
-              <w:right w:val="single" w:sz="4" w:color="D9E1E8"/>
-              <w:top w:val="single" w:sz="4" w:color="D9E1E8"/>
+              <w:left w:val="nil"/>
+              <w:right w:val="nil"/>
+              <w:top w:val="nil"/>
               <w:bottom w:val="single" w:sz="4" w:color="D9E1E8"/>
             </w:tcBorders>
           </w:tcPr>
@@ -14423,9 +14423,9 @@
         <w:tc>
           <w:tcPr>
             <w:tcBorders>
-              <w:left w:val="single" w:sz="4" w:color="D9E1E8"/>
-              <w:right w:val="single" w:sz="4" w:color="D9E1E8"/>
-              <w:top w:val="single" w:sz="4" w:color="D9E1E8"/>
+              <w:left w:val="nil"/>
+              <w:right w:val="nil"/>
+              <w:top w:val="nil"/>
               <w:bottom w:val="single" w:sz="4" w:color="D9E1E8"/>
             </w:tcBorders>
           </w:tcPr>
@@ -14450,9 +14450,9 @@
         <w:tc>
           <w:tcPr>
             <w:tcBorders>
-              <w:left w:val="single" w:sz="4" w:color="D9E1E8"/>
-              <w:right w:val="single" w:sz="4" w:color="D9E1E8"/>
-              <w:top w:val="single" w:sz="4" w:color="D9E1E8"/>
+              <w:left w:val="nil"/>
+              <w:right w:val="nil"/>
+              <w:top w:val="nil"/>
               <w:bottom w:val="single" w:sz="4" w:color="D9E1E8"/>
             </w:tcBorders>
           </w:tcPr>
@@ -14479,9 +14479,9 @@
         <w:tc>
           <w:tcPr>
             <w:tcBorders>
-              <w:left w:val="single" w:sz="4" w:color="D9E1E8"/>
-              <w:right w:val="single" w:sz="4" w:color="D9E1E8"/>
-              <w:top w:val="single" w:sz="4" w:color="D9E1E8"/>
+              <w:left w:val="nil"/>
+              <w:right w:val="nil"/>
+              <w:top w:val="nil"/>
               <w:bottom w:val="single" w:sz="4" w:color="D9E1E8"/>
             </w:tcBorders>
           </w:tcPr>
@@ -14506,9 +14506,9 @@
         <w:tc>
           <w:tcPr>
             <w:tcBorders>
-              <w:left w:val="single" w:sz="4" w:color="D9E1E8"/>
-              <w:right w:val="single" w:sz="4" w:color="D9E1E8"/>
-              <w:top w:val="single" w:sz="4" w:color="D9E1E8"/>
+              <w:left w:val="nil"/>
+              <w:right w:val="nil"/>
+              <w:top w:val="nil"/>
               <w:bottom w:val="single" w:sz="4" w:color="D9E1E8"/>
             </w:tcBorders>
           </w:tcPr>
@@ -14533,9 +14533,9 @@
         <w:tc>
           <w:tcPr>
             <w:tcBorders>
-              <w:left w:val="single" w:sz="4" w:color="D9E1E8"/>
-              <w:right w:val="single" w:sz="4" w:color="D9E1E8"/>
-              <w:top w:val="single" w:sz="4" w:color="D9E1E8"/>
+              <w:left w:val="nil"/>
+              <w:right w:val="nil"/>
+              <w:top w:val="nil"/>
               <w:bottom w:val="single" w:sz="4" w:color="D9E1E8"/>
             </w:tcBorders>
           </w:tcPr>
@@ -14560,9 +14560,9 @@
         <w:tc>
           <w:tcPr>
             <w:tcBorders>
-              <w:left w:val="single" w:sz="4" w:color="D9E1E8"/>
-              <w:right w:val="single" w:sz="4" w:color="D9E1E8"/>
-              <w:top w:val="single" w:sz="4" w:color="D9E1E8"/>
+              <w:left w:val="nil"/>
+              <w:right w:val="nil"/>
+              <w:top w:val="nil"/>
               <w:bottom w:val="single" w:sz="4" w:color="D9E1E8"/>
             </w:tcBorders>
           </w:tcPr>
@@ -14587,9 +14587,9 @@
         <w:tc>
           <w:tcPr>
             <w:tcBorders>
-              <w:left w:val="single" w:sz="4" w:color="D9E1E8"/>
-              <w:right w:val="single" w:sz="4" w:color="D9E1E8"/>
-              <w:top w:val="single" w:sz="4" w:color="D9E1E8"/>
+              <w:left w:val="nil"/>
+              <w:right w:val="nil"/>
+              <w:top w:val="nil"/>
               <w:bottom w:val="single" w:sz="4" w:color="D9E1E8"/>
             </w:tcBorders>
           </w:tcPr>
@@ -14614,9 +14614,9 @@
         <w:tc>
           <w:tcPr>
             <w:tcBorders>
-              <w:left w:val="single" w:sz="4" w:color="D9E1E8"/>
-              <w:right w:val="single" w:sz="4" w:color="D9E1E8"/>
-              <w:top w:val="single" w:sz="4" w:color="D9E1E8"/>
+              <w:left w:val="nil"/>
+              <w:right w:val="nil"/>
+              <w:top w:val="nil"/>
               <w:bottom w:val="single" w:sz="4" w:color="D9E1E8"/>
             </w:tcBorders>
           </w:tcPr>
@@ -14643,9 +14643,9 @@
         <w:tc>
           <w:tcPr>
             <w:tcBorders>
-              <w:left w:val="single" w:sz="4" w:color="D9E1E8"/>
-              <w:right w:val="single" w:sz="4" w:color="D9E1E8"/>
-              <w:top w:val="single" w:sz="4" w:color="D9E1E8"/>
+              <w:left w:val="nil"/>
+              <w:right w:val="nil"/>
+              <w:top w:val="nil"/>
               <w:bottom w:val="single" w:sz="4" w:color="D9E1E8"/>
             </w:tcBorders>
           </w:tcPr>
@@ -14670,9 +14670,9 @@
         <w:tc>
           <w:tcPr>
             <w:tcBorders>
-              <w:left w:val="single" w:sz="4" w:color="D9E1E8"/>
-              <w:right w:val="single" w:sz="4" w:color="D9E1E8"/>
-              <w:top w:val="single" w:sz="4" w:color="D9E1E8"/>
+              <w:left w:val="nil"/>
+              <w:right w:val="nil"/>
+              <w:top w:val="nil"/>
               <w:bottom w:val="single" w:sz="4" w:color="D9E1E8"/>
             </w:tcBorders>
           </w:tcPr>
@@ -14697,9 +14697,9 @@
         <w:tc>
           <w:tcPr>
             <w:tcBorders>
-              <w:left w:val="single" w:sz="4" w:color="D9E1E8"/>
-              <w:right w:val="single" w:sz="4" w:color="D9E1E8"/>
-              <w:top w:val="single" w:sz="4" w:color="D9E1E8"/>
+              <w:left w:val="nil"/>
+              <w:right w:val="nil"/>
+              <w:top w:val="nil"/>
               <w:bottom w:val="single" w:sz="4" w:color="D9E1E8"/>
             </w:tcBorders>
           </w:tcPr>
@@ -14724,9 +14724,9 @@
         <w:tc>
           <w:tcPr>
             <w:tcBorders>
-              <w:left w:val="single" w:sz="4" w:color="D9E1E8"/>
-              <w:right w:val="single" w:sz="4" w:color="D9E1E8"/>
-              <w:top w:val="single" w:sz="4" w:color="D9E1E8"/>
+              <w:left w:val="nil"/>
+              <w:right w:val="nil"/>
+              <w:top w:val="nil"/>
               <w:bottom w:val="single" w:sz="4" w:color="D9E1E8"/>
             </w:tcBorders>
           </w:tcPr>
@@ -14751,9 +14751,9 @@
         <w:tc>
           <w:tcPr>
             <w:tcBorders>
-              <w:left w:val="single" w:sz="4" w:color="D9E1E8"/>
-              <w:right w:val="single" w:sz="4" w:color="D9E1E8"/>
-              <w:top w:val="single" w:sz="4" w:color="D9E1E8"/>
+              <w:left w:val="nil"/>
+              <w:right w:val="nil"/>
+              <w:top w:val="nil"/>
               <w:bottom w:val="single" w:sz="4" w:color="D9E1E8"/>
             </w:tcBorders>
           </w:tcPr>
@@ -14778,9 +14778,9 @@
         <w:tc>
           <w:tcPr>
             <w:tcBorders>
-              <w:left w:val="single" w:sz="4" w:color="D9E1E8"/>
-              <w:right w:val="single" w:sz="4" w:color="D9E1E8"/>
-              <w:top w:val="single" w:sz="4" w:color="D9E1E8"/>
+              <w:left w:val="nil"/>
+              <w:right w:val="nil"/>
+              <w:top w:val="nil"/>
               <w:bottom w:val="single" w:sz="4" w:color="D9E1E8"/>
             </w:tcBorders>
           </w:tcPr>
@@ -14807,9 +14807,9 @@
         <w:tc>
           <w:tcPr>
             <w:tcBorders>
-              <w:left w:val="single" w:sz="4" w:color="D9E1E8"/>
-              <w:right w:val="single" w:sz="4" w:color="D9E1E8"/>
-              <w:top w:val="single" w:sz="4" w:color="D9E1E8"/>
+              <w:left w:val="nil"/>
+              <w:right w:val="nil"/>
+              <w:top w:val="nil"/>
               <w:bottom w:val="nil"/>
             </w:tcBorders>
           </w:tcPr>
@@ -14834,9 +14834,9 @@
         <w:tc>
           <w:tcPr>
             <w:tcBorders>
-              <w:left w:val="single" w:sz="4" w:color="D9E1E8"/>
-              <w:right w:val="single" w:sz="4" w:color="D9E1E8"/>
-              <w:top w:val="single" w:sz="4" w:color="D9E1E8"/>
+              <w:left w:val="nil"/>
+              <w:right w:val="nil"/>
+              <w:top w:val="nil"/>
               <w:bottom w:val="nil"/>
             </w:tcBorders>
           </w:tcPr>
@@ -14861,9 +14861,9 @@
         <w:tc>
           <w:tcPr>
             <w:tcBorders>
-              <w:left w:val="single" w:sz="4" w:color="D9E1E8"/>
-              <w:right w:val="single" w:sz="4" w:color="D9E1E8"/>
-              <w:top w:val="single" w:sz="4" w:color="D9E1E8"/>
+              <w:left w:val="nil"/>
+              <w:right w:val="nil"/>
+              <w:top w:val="nil"/>
               <w:bottom w:val="nil"/>
             </w:tcBorders>
           </w:tcPr>
@@ -14888,9 +14888,9 @@
         <w:tc>
           <w:tcPr>
             <w:tcBorders>
-              <w:left w:val="single" w:sz="4" w:color="D9E1E8"/>
-              <w:right w:val="single" w:sz="4" w:color="D9E1E8"/>
-              <w:top w:val="single" w:sz="4" w:color="D9E1E8"/>
+              <w:left w:val="nil"/>
+              <w:right w:val="nil"/>
+              <w:top w:val="nil"/>
               <w:bottom w:val="nil"/>
             </w:tcBorders>
           </w:tcPr>
@@ -14915,9 +14915,9 @@
         <w:tc>
           <w:tcPr>
             <w:tcBorders>
-              <w:left w:val="single" w:sz="4" w:color="D9E1E8"/>
-              <w:right w:val="single" w:sz="4" w:color="D9E1E8"/>
-              <w:top w:val="single" w:sz="4" w:color="D9E1E8"/>
+              <w:left w:val="nil"/>
+              <w:right w:val="nil"/>
+              <w:top w:val="nil"/>
               <w:bottom w:val="nil"/>
             </w:tcBorders>
           </w:tcPr>
@@ -14942,9 +14942,9 @@
         <w:tc>
           <w:tcPr>
             <w:tcBorders>
-              <w:left w:val="single" w:sz="4" w:color="D9E1E8"/>
-              <w:right w:val="single" w:sz="4" w:color="D9E1E8"/>
-              <w:top w:val="single" w:sz="4" w:color="D9E1E8"/>
+              <w:left w:val="nil"/>
+              <w:right w:val="nil"/>
+              <w:top w:val="nil"/>
               <w:bottom w:val="nil"/>
             </w:tcBorders>
           </w:tcPr>
@@ -16383,7 +16383,7 @@
       </w:r>
     </w:p>
     <w:bookmarkEnd w:id="48"/>
-    <w:bookmarkStart w:id="49" w:name="references"/>
+    <w:bookmarkStart w:id="50" w:name="references"/>
     <w:p>
       <w:pPr>
         <w:pStyle w:val="ReferencesHeading"/>
@@ -17901,7 +17901,21 @@
         <w:t xml:space="preserve">Proc. 5th Int. Conf. Computer and Information Technology</w:t>
       </w:r>
       <w:r>
-        <w:t xml:space="preserve">, 2002.</w:t>
+        <w:t xml:space="preserve">, 2002. URL:</w:t>
+      </w:r>
+      <w:r>
+        <w:t xml:space="preserve"> </w:t>
+      </w:r>
+      <w:hyperlink r:id="rId49">
+        <w:r>
+          <w:rPr>
+            <w:rStyle w:val="Hyperlink"/>
+          </w:rPr>
+          <w:t xml:space="preserve">files.grouplens.org/papers/sarwar_SVD.pdf</w:t>
+        </w:r>
+      </w:hyperlink>
+      <w:r>
+        <w:t xml:space="preserve">.</w:t>
       </w:r>
     </w:p>
     <w:p>
@@ -17962,8 +17976,8 @@
         <w:t xml:space="preserve">, 2(1–2):83–97, 1955.</w:t>
       </w:r>
     </w:p>
-    <w:bookmarkEnd w:id="49"/>
-    <w:bookmarkStart w:id="50" w:name="Xc4b77b9f289df85bfcd153174d89cf41c5737e9"/>
+    <w:bookmarkEnd w:id="50"/>
+    <w:bookmarkStart w:id="51" w:name="Xc4b77b9f289df85bfcd153174d89cf41c5737e9"/>
     <w:p>
       <w:pPr>
         <w:pStyle w:val="Heading2"/>
@@ -22159,8 +22173,8 @@
         <w:t xml:space="preserve">. The identifiability threshold is therefore exactly the spanning condition of Theorem 2.</w:t>
       </w:r>
     </w:p>
-    <w:bookmarkEnd w:id="50"/>
-    <w:bookmarkStart w:id="51" w:name="appendix-b.-the-fold-in-error-bound"/>
+    <w:bookmarkEnd w:id="51"/>
+    <w:bookmarkStart w:id="52" w:name="appendix-b.-the-fold-in-error-bound"/>
     <w:p>
       <w:pPr>
         <w:pStyle w:val="Heading2"/>
@@ -23090,8 +23104,8 @@
         </m:r>
       </m:oMath>
     </w:p>
-    <w:bookmarkEnd w:id="51"/>
-    <w:bookmarkStart w:id="52" w:name="X8bd459205fc61202df49baf61ff37ee1638d4ae"/>
+    <w:bookmarkEnd w:id="52"/>
+    <w:bookmarkStart w:id="53" w:name="X8bd459205fc61202df49baf61ff37ee1638d4ae"/>
     <w:p>
       <w:pPr>
         <w:pStyle w:val="Heading2"/>
@@ -23742,9 +23756,9 @@
           <w:tcPr>
             <w:shd w:fill="EEF3F7"/>
             <w:tcBorders>
-              <w:left w:val="single" w:sz="4" w:color="D9E1E8"/>
-              <w:right w:val="single" w:sz="4" w:color="D9E1E8"/>
-              <w:top w:val="single" w:sz="4" w:color="D9E1E8"/>
+              <w:left w:val="nil"/>
+              <w:right w:val="nil"/>
+              <w:top w:val="nil"/>
               <w:bottom w:val="single" w:sz="8" w:color="9FB0C2"/>
             </w:tcBorders>
           </w:tcPr>
@@ -23771,9 +23785,9 @@
           <w:tcPr>
             <w:shd w:fill="EEF3F7"/>
             <w:tcBorders>
-              <w:left w:val="single" w:sz="4" w:color="D9E1E8"/>
-              <w:right w:val="single" w:sz="4" w:color="D9E1E8"/>
-              <w:top w:val="single" w:sz="4" w:color="D9E1E8"/>
+              <w:left w:val="nil"/>
+              <w:right w:val="nil"/>
+              <w:top w:val="nil"/>
               <w:bottom w:val="single" w:sz="8" w:color="9FB0C2"/>
             </w:tcBorders>
           </w:tcPr>
@@ -23800,9 +23814,9 @@
           <w:tcPr>
             <w:shd w:fill="EEF3F7"/>
             <w:tcBorders>
-              <w:left w:val="single" w:sz="4" w:color="D9E1E8"/>
-              <w:right w:val="single" w:sz="4" w:color="D9E1E8"/>
-              <w:top w:val="single" w:sz="4" w:color="D9E1E8"/>
+              <w:left w:val="nil"/>
+              <w:right w:val="nil"/>
+              <w:top w:val="nil"/>
               <w:bottom w:val="single" w:sz="8" w:color="9FB0C2"/>
             </w:tcBorders>
           </w:tcPr>
@@ -23829,9 +23843,9 @@
           <w:tcPr>
             <w:shd w:fill="EEF3F7"/>
             <w:tcBorders>
-              <w:left w:val="single" w:sz="4" w:color="D9E1E8"/>
-              <w:right w:val="single" w:sz="4" w:color="D9E1E8"/>
-              <w:top w:val="single" w:sz="4" w:color="D9E1E8"/>
+              <w:left w:val="nil"/>
+              <w:right w:val="nil"/>
+              <w:top w:val="nil"/>
               <w:bottom w:val="single" w:sz="8" w:color="9FB0C2"/>
             </w:tcBorders>
           </w:tcPr>
@@ -23858,9 +23872,9 @@
           <w:tcPr>
             <w:shd w:fill="EEF3F7"/>
             <w:tcBorders>
-              <w:left w:val="single" w:sz="4" w:color="D9E1E8"/>
-              <w:right w:val="single" w:sz="4" w:color="D9E1E8"/>
-              <w:top w:val="single" w:sz="4" w:color="D9E1E8"/>
+              <w:left w:val="nil"/>
+              <w:right w:val="nil"/>
+              <w:top w:val="nil"/>
               <w:bottom w:val="single" w:sz="8" w:color="9FB0C2"/>
             </w:tcBorders>
           </w:tcPr>
@@ -23887,9 +23901,9 @@
           <w:tcPr>
             <w:shd w:fill="EEF3F7"/>
             <w:tcBorders>
-              <w:left w:val="single" w:sz="4" w:color="D9E1E8"/>
-              <w:right w:val="single" w:sz="4" w:color="D9E1E8"/>
-              <w:top w:val="single" w:sz="4" w:color="D9E1E8"/>
+              <w:left w:val="nil"/>
+              <w:right w:val="nil"/>
+              <w:top w:val="nil"/>
               <w:bottom w:val="single" w:sz="8" w:color="9FB0C2"/>
             </w:tcBorders>
           </w:tcPr>
@@ -23916,9 +23930,9 @@
           <w:tcPr>
             <w:shd w:fill="EEF3F7"/>
             <w:tcBorders>
-              <w:left w:val="single" w:sz="4" w:color="D9E1E8"/>
-              <w:right w:val="single" w:sz="4" w:color="D9E1E8"/>
-              <w:top w:val="single" w:sz="4" w:color="D9E1E8"/>
+              <w:left w:val="nil"/>
+              <w:right w:val="nil"/>
+              <w:top w:val="nil"/>
               <w:bottom w:val="single" w:sz="8" w:color="9FB0C2"/>
             </w:tcBorders>
           </w:tcPr>
@@ -23946,9 +23960,9 @@
         <w:tc>
           <w:tcPr>
             <w:tcBorders>
-              <w:left w:val="single" w:sz="4" w:color="D9E1E8"/>
-              <w:right w:val="single" w:sz="4" w:color="D9E1E8"/>
-              <w:top w:val="single" w:sz="4" w:color="D9E1E8"/>
+              <w:left w:val="nil"/>
+              <w:right w:val="nil"/>
+              <w:top w:val="nil"/>
               <w:bottom w:val="single" w:sz="4" w:color="D9E1E8"/>
             </w:tcBorders>
           </w:tcPr>
@@ -23975,9 +23989,9 @@
         <w:tc>
           <w:tcPr>
             <w:tcBorders>
-              <w:left w:val="single" w:sz="4" w:color="D9E1E8"/>
-              <w:right w:val="single" w:sz="4" w:color="D9E1E8"/>
-              <w:top w:val="single" w:sz="4" w:color="D9E1E8"/>
+              <w:left w:val="nil"/>
+              <w:right w:val="nil"/>
+              <w:top w:val="nil"/>
               <w:bottom w:val="single" w:sz="4" w:color="D9E1E8"/>
             </w:tcBorders>
           </w:tcPr>
@@ -24002,9 +24016,9 @@
         <w:tc>
           <w:tcPr>
             <w:tcBorders>
-              <w:left w:val="single" w:sz="4" w:color="D9E1E8"/>
-              <w:right w:val="single" w:sz="4" w:color="D9E1E8"/>
-              <w:top w:val="single" w:sz="4" w:color="D9E1E8"/>
+              <w:left w:val="nil"/>
+              <w:right w:val="nil"/>
+              <w:top w:val="nil"/>
               <w:bottom w:val="single" w:sz="4" w:color="D9E1E8"/>
             </w:tcBorders>
           </w:tcPr>
@@ -24029,9 +24043,9 @@
         <w:tc>
           <w:tcPr>
             <w:tcBorders>
-              <w:left w:val="single" w:sz="4" w:color="D9E1E8"/>
-              <w:right w:val="single" w:sz="4" w:color="D9E1E8"/>
-              <w:top w:val="single" w:sz="4" w:color="D9E1E8"/>
+              <w:left w:val="nil"/>
+              <w:right w:val="nil"/>
+              <w:top w:val="nil"/>
               <w:bottom w:val="single" w:sz="4" w:color="D9E1E8"/>
             </w:tcBorders>
           </w:tcPr>
@@ -24056,9 +24070,9 @@
         <w:tc>
           <w:tcPr>
             <w:tcBorders>
-              <w:left w:val="single" w:sz="4" w:color="D9E1E8"/>
-              <w:right w:val="single" w:sz="4" w:color="D9E1E8"/>
-              <w:top w:val="single" w:sz="4" w:color="D9E1E8"/>
+              <w:left w:val="nil"/>
+              <w:right w:val="nil"/>
+              <w:top w:val="nil"/>
               <w:bottom w:val="single" w:sz="4" w:color="D9E1E8"/>
             </w:tcBorders>
           </w:tcPr>
@@ -24083,9 +24097,9 @@
         <w:tc>
           <w:tcPr>
             <w:tcBorders>
-              <w:left w:val="single" w:sz="4" w:color="D9E1E8"/>
-              <w:right w:val="single" w:sz="4" w:color="D9E1E8"/>
-              <w:top w:val="single" w:sz="4" w:color="D9E1E8"/>
+              <w:left w:val="nil"/>
+              <w:right w:val="nil"/>
+              <w:top w:val="nil"/>
               <w:bottom w:val="single" w:sz="4" w:color="D9E1E8"/>
             </w:tcBorders>
           </w:tcPr>
@@ -24115,9 +24129,9 @@
         <w:tc>
           <w:tcPr>
             <w:tcBorders>
-              <w:left w:val="single" w:sz="4" w:color="D9E1E8"/>
-              <w:right w:val="single" w:sz="4" w:color="D9E1E8"/>
-              <w:top w:val="single" w:sz="4" w:color="D9E1E8"/>
+              <w:left w:val="nil"/>
+              <w:right w:val="nil"/>
+              <w:top w:val="nil"/>
               <w:bottom w:val="single" w:sz="4" w:color="D9E1E8"/>
             </w:tcBorders>
           </w:tcPr>
@@ -24144,9 +24158,9 @@
         <w:tc>
           <w:tcPr>
             <w:tcBorders>
-              <w:left w:val="single" w:sz="4" w:color="D9E1E8"/>
-              <w:right w:val="single" w:sz="4" w:color="D9E1E8"/>
-              <w:top w:val="single" w:sz="4" w:color="D9E1E8"/>
+              <w:left w:val="nil"/>
+              <w:right w:val="nil"/>
+              <w:top w:val="nil"/>
               <w:bottom w:val="single" w:sz="4" w:color="D9E1E8"/>
             </w:tcBorders>
           </w:tcPr>
@@ -24173,9 +24187,9 @@
         <w:tc>
           <w:tcPr>
             <w:tcBorders>
-              <w:left w:val="single" w:sz="4" w:color="D9E1E8"/>
-              <w:right w:val="single" w:sz="4" w:color="D9E1E8"/>
-              <w:top w:val="single" w:sz="4" w:color="D9E1E8"/>
+              <w:left w:val="nil"/>
+              <w:right w:val="nil"/>
+              <w:top w:val="nil"/>
               <w:bottom w:val="single" w:sz="4" w:color="D9E1E8"/>
             </w:tcBorders>
           </w:tcPr>
@@ -24200,9 +24214,9 @@
         <w:tc>
           <w:tcPr>
             <w:tcBorders>
-              <w:left w:val="single" w:sz="4" w:color="D9E1E8"/>
-              <w:right w:val="single" w:sz="4" w:color="D9E1E8"/>
-              <w:top w:val="single" w:sz="4" w:color="D9E1E8"/>
+              <w:left w:val="nil"/>
+              <w:right w:val="nil"/>
+              <w:top w:val="nil"/>
               <w:bottom w:val="single" w:sz="4" w:color="D9E1E8"/>
             </w:tcBorders>
           </w:tcPr>
@@ -24227,9 +24241,9 @@
         <w:tc>
           <w:tcPr>
             <w:tcBorders>
-              <w:left w:val="single" w:sz="4" w:color="D9E1E8"/>
-              <w:right w:val="single" w:sz="4" w:color="D9E1E8"/>
-              <w:top w:val="single" w:sz="4" w:color="D9E1E8"/>
+              <w:left w:val="nil"/>
+              <w:right w:val="nil"/>
+              <w:top w:val="nil"/>
               <w:bottom w:val="single" w:sz="4" w:color="D9E1E8"/>
             </w:tcBorders>
           </w:tcPr>
@@ -24254,9 +24268,9 @@
         <w:tc>
           <w:tcPr>
             <w:tcBorders>
-              <w:left w:val="single" w:sz="4" w:color="D9E1E8"/>
-              <w:right w:val="single" w:sz="4" w:color="D9E1E8"/>
-              <w:top w:val="single" w:sz="4" w:color="D9E1E8"/>
+              <w:left w:val="nil"/>
+              <w:right w:val="nil"/>
+              <w:top w:val="nil"/>
               <w:bottom w:val="single" w:sz="4" w:color="D9E1E8"/>
             </w:tcBorders>
           </w:tcPr>
@@ -24281,9 +24295,9 @@
         <w:tc>
           <w:tcPr>
             <w:tcBorders>
-              <w:left w:val="single" w:sz="4" w:color="D9E1E8"/>
-              <w:right w:val="single" w:sz="4" w:color="D9E1E8"/>
-              <w:top w:val="single" w:sz="4" w:color="D9E1E8"/>
+              <w:left w:val="nil"/>
+              <w:right w:val="nil"/>
+              <w:top w:val="nil"/>
               <w:bottom w:val="single" w:sz="4" w:color="D9E1E8"/>
             </w:tcBorders>
           </w:tcPr>
@@ -24313,9 +24327,9 @@
         <w:tc>
           <w:tcPr>
             <w:tcBorders>
-              <w:left w:val="single" w:sz="4" w:color="D9E1E8"/>
-              <w:right w:val="single" w:sz="4" w:color="D9E1E8"/>
-              <w:top w:val="single" w:sz="4" w:color="D9E1E8"/>
+              <w:left w:val="nil"/>
+              <w:right w:val="nil"/>
+              <w:top w:val="nil"/>
               <w:bottom w:val="single" w:sz="4" w:color="D9E1E8"/>
             </w:tcBorders>
           </w:tcPr>
@@ -24342,9 +24356,9 @@
         <w:tc>
           <w:tcPr>
             <w:tcBorders>
-              <w:left w:val="single" w:sz="4" w:color="D9E1E8"/>
-              <w:right w:val="single" w:sz="4" w:color="D9E1E8"/>
-              <w:top w:val="single" w:sz="4" w:color="D9E1E8"/>
+              <w:left w:val="nil"/>
+              <w:right w:val="nil"/>
+              <w:top w:val="nil"/>
               <w:bottom w:val="single" w:sz="4" w:color="D9E1E8"/>
             </w:tcBorders>
           </w:tcPr>
@@ -24369,9 +24383,9 @@
         <w:tc>
           <w:tcPr>
             <w:tcBorders>
-              <w:left w:val="single" w:sz="4" w:color="D9E1E8"/>
-              <w:right w:val="single" w:sz="4" w:color="D9E1E8"/>
-              <w:top w:val="single" w:sz="4" w:color="D9E1E8"/>
+              <w:left w:val="nil"/>
+              <w:right w:val="nil"/>
+              <w:top w:val="nil"/>
               <w:bottom w:val="single" w:sz="4" w:color="D9E1E8"/>
             </w:tcBorders>
           </w:tcPr>
@@ -24396,9 +24410,9 @@
         <w:tc>
           <w:tcPr>
             <w:tcBorders>
-              <w:left w:val="single" w:sz="4" w:color="D9E1E8"/>
-              <w:right w:val="single" w:sz="4" w:color="D9E1E8"/>
-              <w:top w:val="single" w:sz="4" w:color="D9E1E8"/>
+              <w:left w:val="nil"/>
+              <w:right w:val="nil"/>
+              <w:top w:val="nil"/>
               <w:bottom w:val="single" w:sz="4" w:color="D9E1E8"/>
             </w:tcBorders>
           </w:tcPr>
@@ -24423,9 +24437,9 @@
         <w:tc>
           <w:tcPr>
             <w:tcBorders>
-              <w:left w:val="single" w:sz="4" w:color="D9E1E8"/>
-              <w:right w:val="single" w:sz="4" w:color="D9E1E8"/>
-              <w:top w:val="single" w:sz="4" w:color="D9E1E8"/>
+              <w:left w:val="nil"/>
+              <w:right w:val="nil"/>
+              <w:top w:val="nil"/>
               <w:bottom w:val="single" w:sz="4" w:color="D9E1E8"/>
             </w:tcBorders>
           </w:tcPr>
@@ -24450,9 +24464,9 @@
         <w:tc>
           <w:tcPr>
             <w:tcBorders>
-              <w:left w:val="single" w:sz="4" w:color="D9E1E8"/>
-              <w:right w:val="single" w:sz="4" w:color="D9E1E8"/>
-              <w:top w:val="single" w:sz="4" w:color="D9E1E8"/>
+              <w:left w:val="nil"/>
+              <w:right w:val="nil"/>
+              <w:top w:val="nil"/>
               <w:bottom w:val="single" w:sz="4" w:color="D9E1E8"/>
             </w:tcBorders>
           </w:tcPr>
@@ -24477,9 +24491,9 @@
         <w:tc>
           <w:tcPr>
             <w:tcBorders>
-              <w:left w:val="single" w:sz="4" w:color="D9E1E8"/>
-              <w:right w:val="single" w:sz="4" w:color="D9E1E8"/>
-              <w:top w:val="single" w:sz="4" w:color="D9E1E8"/>
+              <w:left w:val="nil"/>
+              <w:right w:val="nil"/>
+              <w:top w:val="nil"/>
               <w:bottom w:val="single" w:sz="4" w:color="D9E1E8"/>
             </w:tcBorders>
           </w:tcPr>
@@ -24509,9 +24523,9 @@
         <w:tc>
           <w:tcPr>
             <w:tcBorders>
-              <w:left w:val="single" w:sz="4" w:color="D9E1E8"/>
-              <w:right w:val="single" w:sz="4" w:color="D9E1E8"/>
-              <w:top w:val="single" w:sz="4" w:color="D9E1E8"/>
+              <w:left w:val="nil"/>
+              <w:right w:val="nil"/>
+              <w:top w:val="nil"/>
               <w:bottom w:val="single" w:sz="4" w:color="D9E1E8"/>
             </w:tcBorders>
           </w:tcPr>
@@ -24538,9 +24552,9 @@
         <w:tc>
           <w:tcPr>
             <w:tcBorders>
-              <w:left w:val="single" w:sz="4" w:color="D9E1E8"/>
-              <w:right w:val="single" w:sz="4" w:color="D9E1E8"/>
-              <w:top w:val="single" w:sz="4" w:color="D9E1E8"/>
+              <w:left w:val="nil"/>
+              <w:right w:val="nil"/>
+              <w:top w:val="nil"/>
               <w:bottom w:val="single" w:sz="4" w:color="D9E1E8"/>
             </w:tcBorders>
           </w:tcPr>
@@ -24565,9 +24579,9 @@
         <w:tc>
           <w:tcPr>
             <w:tcBorders>
-              <w:left w:val="single" w:sz="4" w:color="D9E1E8"/>
-              <w:right w:val="single" w:sz="4" w:color="D9E1E8"/>
-              <w:top w:val="single" w:sz="4" w:color="D9E1E8"/>
+              <w:left w:val="nil"/>
+              <w:right w:val="nil"/>
+              <w:top w:val="nil"/>
               <w:bottom w:val="single" w:sz="4" w:color="D9E1E8"/>
             </w:tcBorders>
           </w:tcPr>
@@ -24592,9 +24606,9 @@
         <w:tc>
           <w:tcPr>
             <w:tcBorders>
-              <w:left w:val="single" w:sz="4" w:color="D9E1E8"/>
-              <w:right w:val="single" w:sz="4" w:color="D9E1E8"/>
-              <w:top w:val="single" w:sz="4" w:color="D9E1E8"/>
+              <w:left w:val="nil"/>
+              <w:right w:val="nil"/>
+              <w:top w:val="nil"/>
               <w:bottom w:val="single" w:sz="4" w:color="D9E1E8"/>
             </w:tcBorders>
           </w:tcPr>
@@ -24619,9 +24633,9 @@
         <w:tc>
           <w:tcPr>
             <w:tcBorders>
-              <w:left w:val="single" w:sz="4" w:color="D9E1E8"/>
-              <w:right w:val="single" w:sz="4" w:color="D9E1E8"/>
-              <w:top w:val="single" w:sz="4" w:color="D9E1E8"/>
+              <w:left w:val="nil"/>
+              <w:right w:val="nil"/>
+              <w:top w:val="nil"/>
               <w:bottom w:val="single" w:sz="4" w:color="D9E1E8"/>
             </w:tcBorders>
           </w:tcPr>
@@ -24646,9 +24660,9 @@
         <w:tc>
           <w:tcPr>
             <w:tcBorders>
-              <w:left w:val="single" w:sz="4" w:color="D9E1E8"/>
-              <w:right w:val="single" w:sz="4" w:color="D9E1E8"/>
-              <w:top w:val="single" w:sz="4" w:color="D9E1E8"/>
+              <w:left w:val="nil"/>
+              <w:right w:val="nil"/>
+              <w:top w:val="nil"/>
               <w:bottom w:val="single" w:sz="4" w:color="D9E1E8"/>
             </w:tcBorders>
           </w:tcPr>
@@ -24673,9 +24687,9 @@
         <w:tc>
           <w:tcPr>
             <w:tcBorders>
-              <w:left w:val="single" w:sz="4" w:color="D9E1E8"/>
-              <w:right w:val="single" w:sz="4" w:color="D9E1E8"/>
-              <w:top w:val="single" w:sz="4" w:color="D9E1E8"/>
+              <w:left w:val="nil"/>
+              <w:right w:val="nil"/>
+              <w:top w:val="nil"/>
               <w:bottom w:val="single" w:sz="4" w:color="D9E1E8"/>
             </w:tcBorders>
           </w:tcPr>
@@ -24700,9 +24714,9 @@
         <w:tc>
           <w:tcPr>
             <w:tcBorders>
-              <w:left w:val="single" w:sz="4" w:color="D9E1E8"/>
-              <w:right w:val="single" w:sz="4" w:color="D9E1E8"/>
-              <w:top w:val="single" w:sz="4" w:color="D9E1E8"/>
+              <w:left w:val="nil"/>
+              <w:right w:val="nil"/>
+              <w:top w:val="nil"/>
               <w:bottom w:val="single" w:sz="4" w:color="D9E1E8"/>
             </w:tcBorders>
           </w:tcPr>
@@ -24729,9 +24743,9 @@
         <w:tc>
           <w:tcPr>
             <w:tcBorders>
-              <w:left w:val="single" w:sz="4" w:color="D9E1E8"/>
-              <w:right w:val="single" w:sz="4" w:color="D9E1E8"/>
-              <w:top w:val="single" w:sz="4" w:color="D9E1E8"/>
+              <w:left w:val="nil"/>
+              <w:right w:val="nil"/>
+              <w:top w:val="nil"/>
               <w:bottom w:val="single" w:sz="4" w:color="D9E1E8"/>
             </w:tcBorders>
           </w:tcPr>
@@ -24756,9 +24770,9 @@
         <w:tc>
           <w:tcPr>
             <w:tcBorders>
-              <w:left w:val="single" w:sz="4" w:color="D9E1E8"/>
-              <w:right w:val="single" w:sz="4" w:color="D9E1E8"/>
-              <w:top w:val="single" w:sz="4" w:color="D9E1E8"/>
+              <w:left w:val="nil"/>
+              <w:right w:val="nil"/>
+              <w:top w:val="nil"/>
               <w:bottom w:val="single" w:sz="4" w:color="D9E1E8"/>
             </w:tcBorders>
           </w:tcPr>
@@ -24783,9 +24797,9 @@
         <w:tc>
           <w:tcPr>
             <w:tcBorders>
-              <w:left w:val="single" w:sz="4" w:color="D9E1E8"/>
-              <w:right w:val="single" w:sz="4" w:color="D9E1E8"/>
-              <w:top w:val="single" w:sz="4" w:color="D9E1E8"/>
+              <w:left w:val="nil"/>
+              <w:right w:val="nil"/>
+              <w:top w:val="nil"/>
               <w:bottom w:val="single" w:sz="4" w:color="D9E1E8"/>
             </w:tcBorders>
           </w:tcPr>
@@ -24810,9 +24824,9 @@
         <w:tc>
           <w:tcPr>
             <w:tcBorders>
-              <w:left w:val="single" w:sz="4" w:color="D9E1E8"/>
-              <w:right w:val="single" w:sz="4" w:color="D9E1E8"/>
-              <w:top w:val="single" w:sz="4" w:color="D9E1E8"/>
+              <w:left w:val="nil"/>
+              <w:right w:val="nil"/>
+              <w:top w:val="nil"/>
               <w:bottom w:val="single" w:sz="4" w:color="D9E1E8"/>
             </w:tcBorders>
           </w:tcPr>
@@ -24837,9 +24851,9 @@
         <w:tc>
           <w:tcPr>
             <w:tcBorders>
-              <w:left w:val="single" w:sz="4" w:color="D9E1E8"/>
-              <w:right w:val="single" w:sz="4" w:color="D9E1E8"/>
-              <w:top w:val="single" w:sz="4" w:color="D9E1E8"/>
+              <w:left w:val="nil"/>
+              <w:right w:val="nil"/>
+              <w:top w:val="nil"/>
               <w:bottom w:val="single" w:sz="4" w:color="D9E1E8"/>
             </w:tcBorders>
           </w:tcPr>
@@ -24864,9 +24878,9 @@
         <w:tc>
           <w:tcPr>
             <w:tcBorders>
-              <w:left w:val="single" w:sz="4" w:color="D9E1E8"/>
-              <w:right w:val="single" w:sz="4" w:color="D9E1E8"/>
-              <w:top w:val="single" w:sz="4" w:color="D9E1E8"/>
+              <w:left w:val="nil"/>
+              <w:right w:val="nil"/>
+              <w:top w:val="nil"/>
               <w:bottom w:val="single" w:sz="4" w:color="D9E1E8"/>
             </w:tcBorders>
           </w:tcPr>
@@ -24896,9 +24910,9 @@
         <w:tc>
           <w:tcPr>
             <w:tcBorders>
-              <w:left w:val="single" w:sz="4" w:color="D9E1E8"/>
-              <w:right w:val="single" w:sz="4" w:color="D9E1E8"/>
-              <w:top w:val="single" w:sz="4" w:color="D9E1E8"/>
+              <w:left w:val="nil"/>
+              <w:right w:val="nil"/>
+              <w:top w:val="nil"/>
               <w:bottom w:val="single" w:sz="4" w:color="D9E1E8"/>
             </w:tcBorders>
           </w:tcPr>
@@ -24925,9 +24939,9 @@
         <w:tc>
           <w:tcPr>
             <w:tcBorders>
-              <w:left w:val="single" w:sz="4" w:color="D9E1E8"/>
-              <w:right w:val="single" w:sz="4" w:color="D9E1E8"/>
-              <w:top w:val="single" w:sz="4" w:color="D9E1E8"/>
+              <w:left w:val="nil"/>
+              <w:right w:val="nil"/>
+              <w:top w:val="nil"/>
               <w:bottom w:val="single" w:sz="4" w:color="D9E1E8"/>
             </w:tcBorders>
           </w:tcPr>
@@ -24952,9 +24966,9 @@
         <w:tc>
           <w:tcPr>
             <w:tcBorders>
-              <w:left w:val="single" w:sz="4" w:color="D9E1E8"/>
-              <w:right w:val="single" w:sz="4" w:color="D9E1E8"/>
-              <w:top w:val="single" w:sz="4" w:color="D9E1E8"/>
+              <w:left w:val="nil"/>
+              <w:right w:val="nil"/>
+              <w:top w:val="nil"/>
               <w:bottom w:val="single" w:sz="4" w:color="D9E1E8"/>
             </w:tcBorders>
           </w:tcPr>
@@ -24979,9 +24993,9 @@
         <w:tc>
           <w:tcPr>
             <w:tcBorders>
-              <w:left w:val="single" w:sz="4" w:color="D9E1E8"/>
-              <w:right w:val="single" w:sz="4" w:color="D9E1E8"/>
-              <w:top w:val="single" w:sz="4" w:color="D9E1E8"/>
+              <w:left w:val="nil"/>
+              <w:right w:val="nil"/>
+              <w:top w:val="nil"/>
               <w:bottom w:val="single" w:sz="4" w:color="D9E1E8"/>
             </w:tcBorders>
           </w:tcPr>
@@ -25006,9 +25020,9 @@
         <w:tc>
           <w:tcPr>
             <w:tcBorders>
-              <w:left w:val="single" w:sz="4" w:color="D9E1E8"/>
-              <w:right w:val="single" w:sz="4" w:color="D9E1E8"/>
-              <w:top w:val="single" w:sz="4" w:color="D9E1E8"/>
+              <w:left w:val="nil"/>
+              <w:right w:val="nil"/>
+              <w:top w:val="nil"/>
               <w:bottom w:val="single" w:sz="4" w:color="D9E1E8"/>
             </w:tcBorders>
           </w:tcPr>
@@ -25033,9 +25047,9 @@
         <w:tc>
           <w:tcPr>
             <w:tcBorders>
-              <w:left w:val="single" w:sz="4" w:color="D9E1E8"/>
-              <w:right w:val="single" w:sz="4" w:color="D9E1E8"/>
-              <w:top w:val="single" w:sz="4" w:color="D9E1E8"/>
+              <w:left w:val="nil"/>
+              <w:right w:val="nil"/>
+              <w:top w:val="nil"/>
               <w:bottom w:val="single" w:sz="4" w:color="D9E1E8"/>
             </w:tcBorders>
           </w:tcPr>
@@ -25060,9 +25074,9 @@
         <w:tc>
           <w:tcPr>
             <w:tcBorders>
-              <w:left w:val="single" w:sz="4" w:color="D9E1E8"/>
-              <w:right w:val="single" w:sz="4" w:color="D9E1E8"/>
-              <w:top w:val="single" w:sz="4" w:color="D9E1E8"/>
+              <w:left w:val="nil"/>
+              <w:right w:val="nil"/>
+              <w:top w:val="nil"/>
               <w:bottom w:val="single" w:sz="4" w:color="D9E1E8"/>
             </w:tcBorders>
           </w:tcPr>
@@ -25087,9 +25101,9 @@
         <w:tc>
           <w:tcPr>
             <w:tcBorders>
-              <w:left w:val="single" w:sz="4" w:color="D9E1E8"/>
-              <w:right w:val="single" w:sz="4" w:color="D9E1E8"/>
-              <w:top w:val="single" w:sz="4" w:color="D9E1E8"/>
+              <w:left w:val="nil"/>
+              <w:right w:val="nil"/>
+              <w:top w:val="nil"/>
               <w:bottom w:val="single" w:sz="4" w:color="D9E1E8"/>
             </w:tcBorders>
           </w:tcPr>
@@ -25116,9 +25130,9 @@
         <w:tc>
           <w:tcPr>
             <w:tcBorders>
-              <w:left w:val="single" w:sz="4" w:color="D9E1E8"/>
-              <w:right w:val="single" w:sz="4" w:color="D9E1E8"/>
-              <w:top w:val="single" w:sz="4" w:color="D9E1E8"/>
+              <w:left w:val="nil"/>
+              <w:right w:val="nil"/>
+              <w:top w:val="nil"/>
               <w:bottom w:val="single" w:sz="4" w:color="D9E1E8"/>
             </w:tcBorders>
           </w:tcPr>
@@ -25143,9 +25157,9 @@
         <w:tc>
           <w:tcPr>
             <w:tcBorders>
-              <w:left w:val="single" w:sz="4" w:color="D9E1E8"/>
-              <w:right w:val="single" w:sz="4" w:color="D9E1E8"/>
-              <w:top w:val="single" w:sz="4" w:color="D9E1E8"/>
+              <w:left w:val="nil"/>
+              <w:right w:val="nil"/>
+              <w:top w:val="nil"/>
               <w:bottom w:val="single" w:sz="4" w:color="D9E1E8"/>
             </w:tcBorders>
           </w:tcPr>
@@ -25170,9 +25184,9 @@
         <w:tc>
           <w:tcPr>
             <w:tcBorders>
-              <w:left w:val="single" w:sz="4" w:color="D9E1E8"/>
-              <w:right w:val="single" w:sz="4" w:color="D9E1E8"/>
-              <w:top w:val="single" w:sz="4" w:color="D9E1E8"/>
+              <w:left w:val="nil"/>
+              <w:right w:val="nil"/>
+              <w:top w:val="nil"/>
               <w:bottom w:val="single" w:sz="4" w:color="D9E1E8"/>
             </w:tcBorders>
           </w:tcPr>
@@ -25197,9 +25211,9 @@
         <w:tc>
           <w:tcPr>
             <w:tcBorders>
-              <w:left w:val="single" w:sz="4" w:color="D9E1E8"/>
-              <w:right w:val="single" w:sz="4" w:color="D9E1E8"/>
-              <w:top w:val="single" w:sz="4" w:color="D9E1E8"/>
+              <w:left w:val="nil"/>
+              <w:right w:val="nil"/>
+              <w:top w:val="nil"/>
               <w:bottom w:val="single" w:sz="4" w:color="D9E1E8"/>
             </w:tcBorders>
           </w:tcPr>
@@ -25224,9 +25238,9 @@
         <w:tc>
           <w:tcPr>
             <w:tcBorders>
-              <w:left w:val="single" w:sz="4" w:color="D9E1E8"/>
-              <w:right w:val="single" w:sz="4" w:color="D9E1E8"/>
-              <w:top w:val="single" w:sz="4" w:color="D9E1E8"/>
+              <w:left w:val="nil"/>
+              <w:right w:val="nil"/>
+              <w:top w:val="nil"/>
               <w:bottom w:val="single" w:sz="4" w:color="D9E1E8"/>
             </w:tcBorders>
           </w:tcPr>
@@ -25251,9 +25265,9 @@
         <w:tc>
           <w:tcPr>
             <w:tcBorders>
-              <w:left w:val="single" w:sz="4" w:color="D9E1E8"/>
-              <w:right w:val="single" w:sz="4" w:color="D9E1E8"/>
-              <w:top w:val="single" w:sz="4" w:color="D9E1E8"/>
+              <w:left w:val="nil"/>
+              <w:right w:val="nil"/>
+              <w:top w:val="nil"/>
               <w:bottom w:val="single" w:sz="4" w:color="D9E1E8"/>
             </w:tcBorders>
           </w:tcPr>
@@ -25283,9 +25297,9 @@
         <w:tc>
           <w:tcPr>
             <w:tcBorders>
-              <w:left w:val="single" w:sz="4" w:color="D9E1E8"/>
-              <w:right w:val="single" w:sz="4" w:color="D9E1E8"/>
-              <w:top w:val="single" w:sz="4" w:color="D9E1E8"/>
+              <w:left w:val="nil"/>
+              <w:right w:val="nil"/>
+              <w:top w:val="nil"/>
               <w:bottom w:val="single" w:sz="4" w:color="D9E1E8"/>
             </w:tcBorders>
           </w:tcPr>
@@ -25312,9 +25326,9 @@
         <w:tc>
           <w:tcPr>
             <w:tcBorders>
-              <w:left w:val="single" w:sz="4" w:color="D9E1E8"/>
-              <w:right w:val="single" w:sz="4" w:color="D9E1E8"/>
-              <w:top w:val="single" w:sz="4" w:color="D9E1E8"/>
+              <w:left w:val="nil"/>
+              <w:right w:val="nil"/>
+              <w:top w:val="nil"/>
               <w:bottom w:val="single" w:sz="4" w:color="D9E1E8"/>
             </w:tcBorders>
           </w:tcPr>
@@ -25339,9 +25353,9 @@
         <w:tc>
           <w:tcPr>
             <w:tcBorders>
-              <w:left w:val="single" w:sz="4" w:color="D9E1E8"/>
-              <w:right w:val="single" w:sz="4" w:color="D9E1E8"/>
-              <w:top w:val="single" w:sz="4" w:color="D9E1E8"/>
+              <w:left w:val="nil"/>
+              <w:right w:val="nil"/>
+              <w:top w:val="nil"/>
               <w:bottom w:val="single" w:sz="4" w:color="D9E1E8"/>
             </w:tcBorders>
           </w:tcPr>
@@ -25366,9 +25380,9 @@
         <w:tc>
           <w:tcPr>
             <w:tcBorders>
-              <w:left w:val="single" w:sz="4" w:color="D9E1E8"/>
-              <w:right w:val="single" w:sz="4" w:color="D9E1E8"/>
-              <w:top w:val="single" w:sz="4" w:color="D9E1E8"/>
+              <w:left w:val="nil"/>
+              <w:right w:val="nil"/>
+              <w:top w:val="nil"/>
               <w:bottom w:val="single" w:sz="4" w:color="D9E1E8"/>
             </w:tcBorders>
           </w:tcPr>
@@ -25393,9 +25407,9 @@
         <w:tc>
           <w:tcPr>
             <w:tcBorders>
-              <w:left w:val="single" w:sz="4" w:color="D9E1E8"/>
-              <w:right w:val="single" w:sz="4" w:color="D9E1E8"/>
-              <w:top w:val="single" w:sz="4" w:color="D9E1E8"/>
+              <w:left w:val="nil"/>
+              <w:right w:val="nil"/>
+              <w:top w:val="nil"/>
               <w:bottom w:val="single" w:sz="4" w:color="D9E1E8"/>
             </w:tcBorders>
           </w:tcPr>
@@ -25420,9 +25434,9 @@
         <w:tc>
           <w:tcPr>
             <w:tcBorders>
-              <w:left w:val="single" w:sz="4" w:color="D9E1E8"/>
-              <w:right w:val="single" w:sz="4" w:color="D9E1E8"/>
-              <w:top w:val="single" w:sz="4" w:color="D9E1E8"/>
+              <w:left w:val="nil"/>
+              <w:right w:val="nil"/>
+              <w:top w:val="nil"/>
               <w:bottom w:val="single" w:sz="4" w:color="D9E1E8"/>
             </w:tcBorders>
           </w:tcPr>
@@ -25447,9 +25461,9 @@
         <w:tc>
           <w:tcPr>
             <w:tcBorders>
-              <w:left w:val="single" w:sz="4" w:color="D9E1E8"/>
-              <w:right w:val="single" w:sz="4" w:color="D9E1E8"/>
-              <w:top w:val="single" w:sz="4" w:color="D9E1E8"/>
+              <w:left w:val="nil"/>
+              <w:right w:val="nil"/>
+              <w:top w:val="nil"/>
               <w:bottom w:val="single" w:sz="4" w:color="D9E1E8"/>
             </w:tcBorders>
           </w:tcPr>
@@ -25474,9 +25488,9 @@
         <w:tc>
           <w:tcPr>
             <w:tcBorders>
-              <w:left w:val="single" w:sz="4" w:color="D9E1E8"/>
-              <w:right w:val="single" w:sz="4" w:color="D9E1E8"/>
-              <w:top w:val="single" w:sz="4" w:color="D9E1E8"/>
+              <w:left w:val="nil"/>
+              <w:right w:val="nil"/>
+              <w:top w:val="nil"/>
               <w:bottom w:val="single" w:sz="4" w:color="D9E1E8"/>
             </w:tcBorders>
           </w:tcPr>
@@ -25503,9 +25517,9 @@
         <w:tc>
           <w:tcPr>
             <w:tcBorders>
-              <w:left w:val="single" w:sz="4" w:color="D9E1E8"/>
-              <w:right w:val="single" w:sz="4" w:color="D9E1E8"/>
-              <w:top w:val="single" w:sz="4" w:color="D9E1E8"/>
+              <w:left w:val="nil"/>
+              <w:right w:val="nil"/>
+              <w:top w:val="nil"/>
               <w:bottom w:val="single" w:sz="4" w:color="D9E1E8"/>
             </w:tcBorders>
           </w:tcPr>
@@ -25530,9 +25544,9 @@
         <w:tc>
           <w:tcPr>
             <w:tcBorders>
-              <w:left w:val="single" w:sz="4" w:color="D9E1E8"/>
-              <w:right w:val="single" w:sz="4" w:color="D9E1E8"/>
-              <w:top w:val="single" w:sz="4" w:color="D9E1E8"/>
+              <w:left w:val="nil"/>
+              <w:right w:val="nil"/>
+              <w:top w:val="nil"/>
               <w:bottom w:val="single" w:sz="4" w:color="D9E1E8"/>
             </w:tcBorders>
           </w:tcPr>
@@ -25557,9 +25571,9 @@
         <w:tc>
           <w:tcPr>
             <w:tcBorders>
-              <w:left w:val="single" w:sz="4" w:color="D9E1E8"/>
-              <w:right w:val="single" w:sz="4" w:color="D9E1E8"/>
-              <w:top w:val="single" w:sz="4" w:color="D9E1E8"/>
+              <w:left w:val="nil"/>
+              <w:right w:val="nil"/>
+              <w:top w:val="nil"/>
               <w:bottom w:val="single" w:sz="4" w:color="D9E1E8"/>
             </w:tcBorders>
           </w:tcPr>
@@ -25584,9 +25598,9 @@
         <w:tc>
           <w:tcPr>
             <w:tcBorders>
-              <w:left w:val="single" w:sz="4" w:color="D9E1E8"/>
-              <w:right w:val="single" w:sz="4" w:color="D9E1E8"/>
-              <w:top w:val="single" w:sz="4" w:color="D9E1E8"/>
+              <w:left w:val="nil"/>
+              <w:right w:val="nil"/>
+              <w:top w:val="nil"/>
               <w:bottom w:val="single" w:sz="4" w:color="D9E1E8"/>
             </w:tcBorders>
           </w:tcPr>
@@ -25611,9 +25625,9 @@
         <w:tc>
           <w:tcPr>
             <w:tcBorders>
-              <w:left w:val="single" w:sz="4" w:color="D9E1E8"/>
-              <w:right w:val="single" w:sz="4" w:color="D9E1E8"/>
-              <w:top w:val="single" w:sz="4" w:color="D9E1E8"/>
+              <w:left w:val="nil"/>
+              <w:right w:val="nil"/>
+              <w:top w:val="nil"/>
               <w:bottom w:val="single" w:sz="4" w:color="D9E1E8"/>
             </w:tcBorders>
           </w:tcPr>
@@ -25638,9 +25652,9 @@
         <w:tc>
           <w:tcPr>
             <w:tcBorders>
-              <w:left w:val="single" w:sz="4" w:color="D9E1E8"/>
-              <w:right w:val="single" w:sz="4" w:color="D9E1E8"/>
-              <w:top w:val="single" w:sz="4" w:color="D9E1E8"/>
+              <w:left w:val="nil"/>
+              <w:right w:val="nil"/>
+              <w:top w:val="nil"/>
               <w:bottom w:val="single" w:sz="4" w:color="D9E1E8"/>
             </w:tcBorders>
           </w:tcPr>
@@ -25665,9 +25679,9 @@
         <w:tc>
           <w:tcPr>
             <w:tcBorders>
-              <w:left w:val="single" w:sz="4" w:color="D9E1E8"/>
-              <w:right w:val="single" w:sz="4" w:color="D9E1E8"/>
-              <w:top w:val="single" w:sz="4" w:color="D9E1E8"/>
+              <w:left w:val="nil"/>
+              <w:right w:val="nil"/>
+              <w:top w:val="nil"/>
               <w:bottom w:val="single" w:sz="4" w:color="D9E1E8"/>
             </w:tcBorders>
           </w:tcPr>
@@ -25694,9 +25708,9 @@
         <w:tc>
           <w:tcPr>
             <w:tcBorders>
-              <w:left w:val="single" w:sz="4" w:color="D9E1E8"/>
-              <w:right w:val="single" w:sz="4" w:color="D9E1E8"/>
-              <w:top w:val="single" w:sz="4" w:color="D9E1E8"/>
+              <w:left w:val="nil"/>
+              <w:right w:val="nil"/>
+              <w:top w:val="nil"/>
               <w:bottom w:val="single" w:sz="4" w:color="D9E1E8"/>
             </w:tcBorders>
           </w:tcPr>
@@ -25721,9 +25735,9 @@
         <w:tc>
           <w:tcPr>
             <w:tcBorders>
-              <w:left w:val="single" w:sz="4" w:color="D9E1E8"/>
-              <w:right w:val="single" w:sz="4" w:color="D9E1E8"/>
-              <w:top w:val="single" w:sz="4" w:color="D9E1E8"/>
+              <w:left w:val="nil"/>
+              <w:right w:val="nil"/>
+              <w:top w:val="nil"/>
               <w:bottom w:val="single" w:sz="4" w:color="D9E1E8"/>
             </w:tcBorders>
           </w:tcPr>
@@ -25748,9 +25762,9 @@
         <w:tc>
           <w:tcPr>
             <w:tcBorders>
-              <w:left w:val="single" w:sz="4" w:color="D9E1E8"/>
-              <w:right w:val="single" w:sz="4" w:color="D9E1E8"/>
-              <w:top w:val="single" w:sz="4" w:color="D9E1E8"/>
+              <w:left w:val="nil"/>
+              <w:right w:val="nil"/>
+              <w:top w:val="nil"/>
               <w:bottom w:val="single" w:sz="4" w:color="D9E1E8"/>
             </w:tcBorders>
           </w:tcPr>
@@ -25775,9 +25789,9 @@
         <w:tc>
           <w:tcPr>
             <w:tcBorders>
-              <w:left w:val="single" w:sz="4" w:color="D9E1E8"/>
-              <w:right w:val="single" w:sz="4" w:color="D9E1E8"/>
-              <w:top w:val="single" w:sz="4" w:color="D9E1E8"/>
+              <w:left w:val="nil"/>
+              <w:right w:val="nil"/>
+              <w:top w:val="nil"/>
               <w:bottom w:val="single" w:sz="4" w:color="D9E1E8"/>
             </w:tcBorders>
           </w:tcPr>
@@ -25802,9 +25816,9 @@
         <w:tc>
           <w:tcPr>
             <w:tcBorders>
-              <w:left w:val="single" w:sz="4" w:color="D9E1E8"/>
-              <w:right w:val="single" w:sz="4" w:color="D9E1E8"/>
-              <w:top w:val="single" w:sz="4" w:color="D9E1E8"/>
+              <w:left w:val="nil"/>
+              <w:right w:val="nil"/>
+              <w:top w:val="nil"/>
               <w:bottom w:val="single" w:sz="4" w:color="D9E1E8"/>
             </w:tcBorders>
           </w:tcPr>
@@ -25829,9 +25843,9 @@
         <w:tc>
           <w:tcPr>
             <w:tcBorders>
-              <w:left w:val="single" w:sz="4" w:color="D9E1E8"/>
-              <w:right w:val="single" w:sz="4" w:color="D9E1E8"/>
-              <w:top w:val="single" w:sz="4" w:color="D9E1E8"/>
+              <w:left w:val="nil"/>
+              <w:right w:val="nil"/>
+              <w:top w:val="nil"/>
               <w:bottom w:val="single" w:sz="4" w:color="D9E1E8"/>
             </w:tcBorders>
           </w:tcPr>
@@ -25856,9 +25870,9 @@
         <w:tc>
           <w:tcPr>
             <w:tcBorders>
-              <w:left w:val="single" w:sz="4" w:color="D9E1E8"/>
-              <w:right w:val="single" w:sz="4" w:color="D9E1E8"/>
-              <w:top w:val="single" w:sz="4" w:color="D9E1E8"/>
+              <w:left w:val="nil"/>
+              <w:right w:val="nil"/>
+              <w:top w:val="nil"/>
               <w:bottom w:val="single" w:sz="4" w:color="D9E1E8"/>
             </w:tcBorders>
           </w:tcPr>
@@ -25885,9 +25899,9 @@
         <w:tc>
           <w:tcPr>
             <w:tcBorders>
-              <w:left w:val="single" w:sz="4" w:color="D9E1E8"/>
-              <w:right w:val="single" w:sz="4" w:color="D9E1E8"/>
-              <w:top w:val="single" w:sz="4" w:color="D9E1E8"/>
+              <w:left w:val="nil"/>
+              <w:right w:val="nil"/>
+              <w:top w:val="nil"/>
               <w:bottom w:val="single" w:sz="4" w:color="D9E1E8"/>
             </w:tcBorders>
           </w:tcPr>
@@ -25912,9 +25926,9 @@
         <w:tc>
           <w:tcPr>
             <w:tcBorders>
-              <w:left w:val="single" w:sz="4" w:color="D9E1E8"/>
-              <w:right w:val="single" w:sz="4" w:color="D9E1E8"/>
-              <w:top w:val="single" w:sz="4" w:color="D9E1E8"/>
+              <w:left w:val="nil"/>
+              <w:right w:val="nil"/>
+              <w:top w:val="nil"/>
               <w:bottom w:val="single" w:sz="4" w:color="D9E1E8"/>
             </w:tcBorders>
           </w:tcPr>
@@ -25939,9 +25953,9 @@
         <w:tc>
           <w:tcPr>
             <w:tcBorders>
-              <w:left w:val="single" w:sz="4" w:color="D9E1E8"/>
-              <w:right w:val="single" w:sz="4" w:color="D9E1E8"/>
-              <w:top w:val="single" w:sz="4" w:color="D9E1E8"/>
+              <w:left w:val="nil"/>
+              <w:right w:val="nil"/>
+              <w:top w:val="nil"/>
               <w:bottom w:val="single" w:sz="4" w:color="D9E1E8"/>
             </w:tcBorders>
           </w:tcPr>
@@ -25966,9 +25980,9 @@
         <w:tc>
           <w:tcPr>
             <w:tcBorders>
-              <w:left w:val="single" w:sz="4" w:color="D9E1E8"/>
-              <w:right w:val="single" w:sz="4" w:color="D9E1E8"/>
-              <w:top w:val="single" w:sz="4" w:color="D9E1E8"/>
+              <w:left w:val="nil"/>
+              <w:right w:val="nil"/>
+              <w:top w:val="nil"/>
               <w:bottom w:val="single" w:sz="4" w:color="D9E1E8"/>
             </w:tcBorders>
           </w:tcPr>
@@ -25993,9 +26007,9 @@
         <w:tc>
           <w:tcPr>
             <w:tcBorders>
-              <w:left w:val="single" w:sz="4" w:color="D9E1E8"/>
-              <w:right w:val="single" w:sz="4" w:color="D9E1E8"/>
-              <w:top w:val="single" w:sz="4" w:color="D9E1E8"/>
+              <w:left w:val="nil"/>
+              <w:right w:val="nil"/>
+              <w:top w:val="nil"/>
               <w:bottom w:val="single" w:sz="4" w:color="D9E1E8"/>
             </w:tcBorders>
           </w:tcPr>
@@ -26020,9 +26034,9 @@
         <w:tc>
           <w:tcPr>
             <w:tcBorders>
-              <w:left w:val="single" w:sz="4" w:color="D9E1E8"/>
-              <w:right w:val="single" w:sz="4" w:color="D9E1E8"/>
-              <w:top w:val="single" w:sz="4" w:color="D9E1E8"/>
+              <w:left w:val="nil"/>
+              <w:right w:val="nil"/>
+              <w:top w:val="nil"/>
               <w:bottom w:val="single" w:sz="4" w:color="D9E1E8"/>
             </w:tcBorders>
           </w:tcPr>
@@ -26052,9 +26066,9 @@
         <w:tc>
           <w:tcPr>
             <w:tcBorders>
-              <w:left w:val="single" w:sz="4" w:color="D9E1E8"/>
-              <w:right w:val="single" w:sz="4" w:color="D9E1E8"/>
-              <w:top w:val="single" w:sz="4" w:color="D9E1E8"/>
+              <w:left w:val="nil"/>
+              <w:right w:val="nil"/>
+              <w:top w:val="nil"/>
               <w:bottom w:val="single" w:sz="4" w:color="D9E1E8"/>
             </w:tcBorders>
           </w:tcPr>
@@ -26081,9 +26095,9 @@
         <w:tc>
           <w:tcPr>
             <w:tcBorders>
-              <w:left w:val="single" w:sz="4" w:color="D9E1E8"/>
-              <w:right w:val="single" w:sz="4" w:color="D9E1E8"/>
-              <w:top w:val="single" w:sz="4" w:color="D9E1E8"/>
+              <w:left w:val="nil"/>
+              <w:right w:val="nil"/>
+              <w:top w:val="nil"/>
               <w:bottom w:val="single" w:sz="4" w:color="D9E1E8"/>
             </w:tcBorders>
           </w:tcPr>
@@ -26108,9 +26122,9 @@
         <w:tc>
           <w:tcPr>
             <w:tcBorders>
-              <w:left w:val="single" w:sz="4" w:color="D9E1E8"/>
-              <w:right w:val="single" w:sz="4" w:color="D9E1E8"/>
-              <w:top w:val="single" w:sz="4" w:color="D9E1E8"/>
+              <w:left w:val="nil"/>
+              <w:right w:val="nil"/>
+              <w:top w:val="nil"/>
               <w:bottom w:val="single" w:sz="4" w:color="D9E1E8"/>
             </w:tcBorders>
           </w:tcPr>
@@ -26135,9 +26149,9 @@
         <w:tc>
           <w:tcPr>
             <w:tcBorders>
-              <w:left w:val="single" w:sz="4" w:color="D9E1E8"/>
-              <w:right w:val="single" w:sz="4" w:color="D9E1E8"/>
-              <w:top w:val="single" w:sz="4" w:color="D9E1E8"/>
+              <w:left w:val="nil"/>
+              <w:right w:val="nil"/>
+              <w:top w:val="nil"/>
               <w:bottom w:val="single" w:sz="4" w:color="D9E1E8"/>
             </w:tcBorders>
           </w:tcPr>
@@ -26162,9 +26176,9 @@
         <w:tc>
           <w:tcPr>
             <w:tcBorders>
-              <w:left w:val="single" w:sz="4" w:color="D9E1E8"/>
-              <w:right w:val="single" w:sz="4" w:color="D9E1E8"/>
-              <w:top w:val="single" w:sz="4" w:color="D9E1E8"/>
+              <w:left w:val="nil"/>
+              <w:right w:val="nil"/>
+              <w:top w:val="nil"/>
               <w:bottom w:val="single" w:sz="4" w:color="D9E1E8"/>
             </w:tcBorders>
           </w:tcPr>
@@ -26189,9 +26203,9 @@
         <w:tc>
           <w:tcPr>
             <w:tcBorders>
-              <w:left w:val="single" w:sz="4" w:color="D9E1E8"/>
-              <w:right w:val="single" w:sz="4" w:color="D9E1E8"/>
-              <w:top w:val="single" w:sz="4" w:color="D9E1E8"/>
+              <w:left w:val="nil"/>
+              <w:right w:val="nil"/>
+              <w:top w:val="nil"/>
               <w:bottom w:val="single" w:sz="4" w:color="D9E1E8"/>
             </w:tcBorders>
           </w:tcPr>
@@ -26216,9 +26230,9 @@
         <w:tc>
           <w:tcPr>
             <w:tcBorders>
-              <w:left w:val="single" w:sz="4" w:color="D9E1E8"/>
-              <w:right w:val="single" w:sz="4" w:color="D9E1E8"/>
-              <w:top w:val="single" w:sz="4" w:color="D9E1E8"/>
+              <w:left w:val="nil"/>
+              <w:right w:val="nil"/>
+              <w:top w:val="nil"/>
               <w:bottom w:val="single" w:sz="4" w:color="D9E1E8"/>
             </w:tcBorders>
           </w:tcPr>
@@ -26248,9 +26262,9 @@
         <w:tc>
           <w:tcPr>
             <w:tcBorders>
-              <w:left w:val="single" w:sz="4" w:color="D9E1E8"/>
-              <w:right w:val="single" w:sz="4" w:color="D9E1E8"/>
-              <w:top w:val="single" w:sz="4" w:color="D9E1E8"/>
+              <w:left w:val="nil"/>
+              <w:right w:val="nil"/>
+              <w:top w:val="nil"/>
               <w:bottom w:val="single" w:sz="4" w:color="D9E1E8"/>
             </w:tcBorders>
           </w:tcPr>
@@ -26277,9 +26291,9 @@
         <w:tc>
           <w:tcPr>
             <w:tcBorders>
-              <w:left w:val="single" w:sz="4" w:color="D9E1E8"/>
-              <w:right w:val="single" w:sz="4" w:color="D9E1E8"/>
-              <w:top w:val="single" w:sz="4" w:color="D9E1E8"/>
+              <w:left w:val="nil"/>
+              <w:right w:val="nil"/>
+              <w:top w:val="nil"/>
               <w:bottom w:val="nil"/>
             </w:tcBorders>
           </w:tcPr>
@@ -26304,9 +26318,9 @@
         <w:tc>
           <w:tcPr>
             <w:tcBorders>
-              <w:left w:val="single" w:sz="4" w:color="D9E1E8"/>
-              <w:right w:val="single" w:sz="4" w:color="D9E1E8"/>
-              <w:top w:val="single" w:sz="4" w:color="D9E1E8"/>
+              <w:left w:val="nil"/>
+              <w:right w:val="nil"/>
+              <w:top w:val="nil"/>
               <w:bottom w:val="nil"/>
             </w:tcBorders>
           </w:tcPr>
@@ -26331,9 +26345,9 @@
         <w:tc>
           <w:tcPr>
             <w:tcBorders>
-              <w:left w:val="single" w:sz="4" w:color="D9E1E8"/>
-              <w:right w:val="single" w:sz="4" w:color="D9E1E8"/>
-              <w:top w:val="single" w:sz="4" w:color="D9E1E8"/>
+              <w:left w:val="nil"/>
+              <w:right w:val="nil"/>
+              <w:top w:val="nil"/>
               <w:bottom w:val="nil"/>
             </w:tcBorders>
           </w:tcPr>
@@ -26358,9 +26372,9 @@
         <w:tc>
           <w:tcPr>
             <w:tcBorders>
-              <w:left w:val="single" w:sz="4" w:color="D9E1E8"/>
-              <w:right w:val="single" w:sz="4" w:color="D9E1E8"/>
-              <w:top w:val="single" w:sz="4" w:color="D9E1E8"/>
+              <w:left w:val="nil"/>
+              <w:right w:val="nil"/>
+              <w:top w:val="nil"/>
               <w:bottom w:val="nil"/>
             </w:tcBorders>
           </w:tcPr>
@@ -26385,9 +26399,9 @@
         <w:tc>
           <w:tcPr>
             <w:tcBorders>
-              <w:left w:val="single" w:sz="4" w:color="D9E1E8"/>
-              <w:right w:val="single" w:sz="4" w:color="D9E1E8"/>
-              <w:top w:val="single" w:sz="4" w:color="D9E1E8"/>
+              <w:left w:val="nil"/>
+              <w:right w:val="nil"/>
+              <w:top w:val="nil"/>
               <w:bottom w:val="nil"/>
             </w:tcBorders>
           </w:tcPr>
@@ -26412,9 +26426,9 @@
         <w:tc>
           <w:tcPr>
             <w:tcBorders>
-              <w:left w:val="single" w:sz="4" w:color="D9E1E8"/>
-              <w:right w:val="single" w:sz="4" w:color="D9E1E8"/>
-              <w:top w:val="single" w:sz="4" w:color="D9E1E8"/>
+              <w:left w:val="nil"/>
+              <w:right w:val="nil"/>
+              <w:top w:val="nil"/>
               <w:bottom w:val="nil"/>
             </w:tcBorders>
           </w:tcPr>
@@ -26439,9 +26453,9 @@
         <w:tc>
           <w:tcPr>
             <w:tcBorders>
-              <w:left w:val="single" w:sz="4" w:color="D9E1E8"/>
-              <w:right w:val="single" w:sz="4" w:color="D9E1E8"/>
-              <w:top w:val="single" w:sz="4" w:color="D9E1E8"/>
+              <w:left w:val="nil"/>
+              <w:right w:val="nil"/>
+              <w:top w:val="nil"/>
               <w:bottom w:val="nil"/>
             </w:tcBorders>
           </w:tcPr>
@@ -26465,8 +26479,8 @@
         </w:tc>
       </w:tr>
     </w:tbl>
-    <w:bookmarkEnd w:id="52"/>
-    <w:bookmarkStart w:id="53" w:name="appendix-d.-the-latentswarm-environment"/>
+    <w:bookmarkEnd w:id="53"/>
+    <w:bookmarkStart w:id="54" w:name="appendix-d.-the-latentswarm-environment"/>
     <w:p>
       <w:pPr>
         <w:pStyle w:val="Heading2"/>
@@ -28299,8 +28313,8 @@
         <w:t xml:space="preserve">score: earned skill vs random / Hungarian oracle; unseen-pair skill on never-engaged tasks</w:t>
       </w:r>
     </w:p>
-    <w:bookmarkEnd w:id="53"/>
-    <w:bookmarkStart w:id="75" w:name="Xfb5c0374fbe4b046648dbebaecd6d725ff79941"/>
+    <w:bookmarkEnd w:id="54"/>
+    <w:bookmarkStart w:id="76" w:name="Xfb5c0374fbe4b046648dbebaecd6d725ff79941"/>
     <w:p>
       <w:pPr>
         <w:pStyle w:val="Heading2"/>
@@ -28562,18 +28576,18 @@
           <wp:inline>
             <wp:extent cx="5943600" cy="3629468"/>
             <wp:effectExtent b="0" l="0" r="0" t="0"/>
-            <wp:docPr descr="offer-size and masking-model robustness" title="" id="55" name="Picture"/>
+            <wp:docPr descr="offer-size and masking-model robustness" title="" id="56" name="Picture"/>
             <a:graphic>
               <a:graphicData uri="http://schemas.openxmlformats.org/drawingml/2006/picture">
                 <pic:pic>
                   <pic:nvPicPr>
-                    <pic:cNvPr descr="figures/F22F8_robustness.png" id="56" name="Picture"/>
+                    <pic:cNvPr descr="figures/F22F8_robustness.png" id="57" name="Picture"/>
                     <pic:cNvPicPr>
                       <a:picLocks noChangeArrowheads="1" noChangeAspect="1"/>
                     </pic:cNvPicPr>
                   </pic:nvPicPr>
                   <pic:blipFill>
-                    <a:blip r:embed="rId54"/>
+                    <a:blip r:embed="rId55"/>
                     <a:stretch>
                       <a:fillRect/>
                     </a:stretch>
@@ -28978,18 +28992,18 @@
           <wp:inline>
             <wp:extent cx="5943600" cy="2109723"/>
             <wp:effectExtent b="0" l="0" r="0" t="0"/>
-            <wp:docPr descr="rank-guess robustness" title="" id="58" name="Picture"/>
+            <wp:docPr descr="rank-guess robustness" title="" id="59" name="Picture"/>
             <a:graphic>
               <a:graphicData uri="http://schemas.openxmlformats.org/drawingml/2006/picture">
                 <pic:pic>
                   <pic:nvPicPr>
-                    <pic:cNvPr descr="figures/F21_ranksweep.png" id="59" name="Picture"/>
+                    <pic:cNvPr descr="figures/F21_ranksweep.png" id="60" name="Picture"/>
                     <pic:cNvPicPr>
                       <a:picLocks noChangeArrowheads="1" noChangeAspect="1"/>
                     </pic:cNvPicPr>
                   </pic:nvPicPr>
                   <pic:blipFill>
-                    <a:blip r:embed="rId57"/>
+                    <a:blip r:embed="rId58"/>
                     <a:stretch>
                       <a:fillRect/>
                     </a:stretch>
@@ -29355,18 +29369,18 @@
           <wp:inline>
             <wp:extent cx="5943600" cy="2113360"/>
             <wp:effectExtent b="0" l="0" r="0" t="0"/>
-            <wp:docPr descr="Appendix-F ablations: strict regime and probe-restores" title="" id="61" name="Picture"/>
+            <wp:docPr descr="Appendix-F ablations: strict regime and probe-restores" title="" id="62" name="Picture"/>
             <a:graphic>
               <a:graphicData uri="http://schemas.openxmlformats.org/drawingml/2006/picture">
                 <pic:pic>
                   <pic:nvPicPr>
-                    <pic:cNvPr descr="figures/F28_appF_ablations.png" id="62" name="Picture"/>
+                    <pic:cNvPr descr="figures/F28_appF_ablations.png" id="63" name="Picture"/>
                     <pic:cNvPicPr>
                       <a:picLocks noChangeArrowheads="1" noChangeAspect="1"/>
                     </pic:cNvPicPr>
                   </pic:nvPicPr>
                   <pic:blipFill>
-                    <a:blip r:embed="rId60"/>
+                    <a:blip r:embed="rId61"/>
                     <a:stretch>
                       <a:fillRect/>
                     </a:stretch>
@@ -30092,18 +30106,18 @@
           <wp:inline>
             <wp:extent cx="5388864" cy="3547872"/>
             <wp:effectExtent b="0" l="0" r="0" t="0"/>
-            <wp:docPr descr="approximate low-rank robustness" title="" id="64" name="Picture"/>
+            <wp:docPr descr="approximate low-rank robustness" title="" id="65" name="Picture"/>
             <a:graphic>
               <a:graphicData uri="http://schemas.openxmlformats.org/drawingml/2006/picture">
                 <pic:pic>
                   <pic:nvPicPr>
-                    <pic:cNvPr descr="figures/F27_approxrank.png" id="65" name="Picture"/>
+                    <pic:cNvPr descr="figures/F27_approxrank.png" id="66" name="Picture"/>
                     <pic:cNvPicPr>
                       <a:picLocks noChangeArrowheads="1" noChangeAspect="1"/>
                     </pic:cNvPicPr>
                   </pic:nvPicPr>
                   <pic:blipFill>
-                    <a:blip r:embed="rId63"/>
+                    <a:blip r:embed="rId64"/>
                     <a:stretch>
                       <a:fillRect/>
                     </a:stretch>
@@ -30572,18 +30586,18 @@
           <wp:inline>
             <wp:extent cx="5943600" cy="2112308"/>
             <wp:effectExtent b="0" l="0" r="0" t="0"/>
-            <wp:docPr descr="emergent low-rank spectrum" title="" id="67" name="Picture"/>
+            <wp:docPr descr="emergent low-rank spectrum" title="" id="68" name="Picture"/>
             <a:graphic>
               <a:graphicData uri="http://schemas.openxmlformats.org/drawingml/2006/picture">
                 <pic:pic>
                   <pic:nvPicPr>
-                    <pic:cNvPr descr="figures/F_emergent_rank.png" id="68" name="Picture"/>
+                    <pic:cNvPr descr="figures/F_emergent_rank.png" id="69" name="Picture"/>
                     <pic:cNvPicPr>
                       <a:picLocks noChangeArrowheads="1" noChangeAspect="1"/>
                     </pic:cNvPicPr>
                   </pic:nvPicPr>
                   <pic:blipFill>
-                    <a:blip r:embed="rId66"/>
+                    <a:blip r:embed="rId67"/>
                     <a:stretch>
                       <a:fillRect/>
                     </a:stretch>
@@ -30995,18 +31009,18 @@
           <wp:inline>
             <wp:extent cx="5943600" cy="1923833"/>
             <wp:effectExtent b="0" l="0" r="0" t="0"/>
-            <wp:docPr descr="emergent-reward bake-off" title="" id="70" name="Picture"/>
+            <wp:docPr descr="emergent-reward bake-off" title="" id="71" name="Picture"/>
             <a:graphic>
               <a:graphicData uri="http://schemas.openxmlformats.org/drawingml/2006/picture">
                 <pic:pic>
                   <pic:nvPicPr>
-                    <pic:cNvPr descr="figures/F_emergent_bakeoff.png" id="71" name="Picture"/>
+                    <pic:cNvPr descr="figures/F_emergent_bakeoff.png" id="72" name="Picture"/>
                     <pic:cNvPicPr>
                       <a:picLocks noChangeArrowheads="1" noChangeAspect="1"/>
                     </pic:cNvPicPr>
                   </pic:nvPicPr>
                   <pic:blipFill>
-                    <a:blip r:embed="rId69"/>
+                    <a:blip r:embed="rId70"/>
                     <a:stretch>
                       <a:fillRect/>
                     </a:stretch>
@@ -31364,9 +31378,9 @@
           <w:tcPr>
             <w:shd w:fill="EEF3F7"/>
             <w:tcBorders>
-              <w:left w:val="single" w:sz="4" w:color="D9E1E8"/>
-              <w:right w:val="single" w:sz="4" w:color="D9E1E8"/>
-              <w:top w:val="single" w:sz="4" w:color="D9E1E8"/>
+              <w:left w:val="nil"/>
+              <w:right w:val="nil"/>
+              <w:top w:val="nil"/>
               <w:bottom w:val="single" w:sz="8" w:color="9FB0C2"/>
             </w:tcBorders>
           </w:tcPr>
@@ -31393,9 +31407,9 @@
           <w:tcPr>
             <w:shd w:fill="EEF3F7"/>
             <w:tcBorders>
-              <w:left w:val="single" w:sz="4" w:color="D9E1E8"/>
-              <w:right w:val="single" w:sz="4" w:color="D9E1E8"/>
-              <w:top w:val="single" w:sz="4" w:color="D9E1E8"/>
+              <w:left w:val="nil"/>
+              <w:right w:val="nil"/>
+              <w:top w:val="nil"/>
               <w:bottom w:val="single" w:sz="8" w:color="9FB0C2"/>
             </w:tcBorders>
           </w:tcPr>
@@ -31438,9 +31452,9 @@
           <w:tcPr>
             <w:shd w:fill="EEF3F7"/>
             <w:tcBorders>
-              <w:left w:val="single" w:sz="4" w:color="D9E1E8"/>
-              <w:right w:val="single" w:sz="4" w:color="D9E1E8"/>
-              <w:top w:val="single" w:sz="4" w:color="D9E1E8"/>
+              <w:left w:val="nil"/>
+              <w:right w:val="nil"/>
+              <w:top w:val="nil"/>
               <w:bottom w:val="single" w:sz="8" w:color="9FB0C2"/>
             </w:tcBorders>
           </w:tcPr>
@@ -31483,9 +31497,9 @@
           <w:tcPr>
             <w:shd w:fill="EEF3F7"/>
             <w:tcBorders>
-              <w:left w:val="single" w:sz="4" w:color="D9E1E8"/>
-              <w:right w:val="single" w:sz="4" w:color="D9E1E8"/>
-              <w:top w:val="single" w:sz="4" w:color="D9E1E8"/>
+              <w:left w:val="nil"/>
+              <w:right w:val="nil"/>
+              <w:top w:val="nil"/>
               <w:bottom w:val="single" w:sz="8" w:color="9FB0C2"/>
             </w:tcBorders>
           </w:tcPr>
@@ -31529,9 +31543,9 @@
         <w:tc>
           <w:tcPr>
             <w:tcBorders>
-              <w:left w:val="single" w:sz="4" w:color="D9E1E8"/>
-              <w:right w:val="single" w:sz="4" w:color="D9E1E8"/>
-              <w:top w:val="single" w:sz="4" w:color="D9E1E8"/>
+              <w:left w:val="nil"/>
+              <w:right w:val="nil"/>
+              <w:top w:val="nil"/>
               <w:bottom w:val="single" w:sz="4" w:color="D9E1E8"/>
             </w:tcBorders>
           </w:tcPr>
@@ -31556,9 +31570,9 @@
         <w:tc>
           <w:tcPr>
             <w:tcBorders>
-              <w:left w:val="single" w:sz="4" w:color="D9E1E8"/>
-              <w:right w:val="single" w:sz="4" w:color="D9E1E8"/>
-              <w:top w:val="single" w:sz="4" w:color="D9E1E8"/>
+              <w:left w:val="nil"/>
+              <w:right w:val="nil"/>
+              <w:top w:val="nil"/>
               <w:bottom w:val="single" w:sz="4" w:color="D9E1E8"/>
             </w:tcBorders>
           </w:tcPr>
@@ -31583,9 +31597,9 @@
         <w:tc>
           <w:tcPr>
             <w:tcBorders>
-              <w:left w:val="single" w:sz="4" w:color="D9E1E8"/>
-              <w:right w:val="single" w:sz="4" w:color="D9E1E8"/>
-              <w:top w:val="single" w:sz="4" w:color="D9E1E8"/>
+              <w:left w:val="nil"/>
+              <w:right w:val="nil"/>
+              <w:top w:val="nil"/>
               <w:bottom w:val="single" w:sz="4" w:color="D9E1E8"/>
             </w:tcBorders>
           </w:tcPr>
@@ -31610,9 +31624,9 @@
         <w:tc>
           <w:tcPr>
             <w:tcBorders>
-              <w:left w:val="single" w:sz="4" w:color="D9E1E8"/>
-              <w:right w:val="single" w:sz="4" w:color="D9E1E8"/>
-              <w:top w:val="single" w:sz="4" w:color="D9E1E8"/>
+              <w:left w:val="nil"/>
+              <w:right w:val="nil"/>
+              <w:top w:val="nil"/>
               <w:bottom w:val="single" w:sz="4" w:color="D9E1E8"/>
             </w:tcBorders>
           </w:tcPr>
@@ -31639,9 +31653,9 @@
         <w:tc>
           <w:tcPr>
             <w:tcBorders>
-              <w:left w:val="single" w:sz="4" w:color="D9E1E8"/>
-              <w:right w:val="single" w:sz="4" w:color="D9E1E8"/>
-              <w:top w:val="single" w:sz="4" w:color="D9E1E8"/>
+              <w:left w:val="nil"/>
+              <w:right w:val="nil"/>
+              <w:top w:val="nil"/>
               <w:bottom w:val="single" w:sz="4" w:color="D9E1E8"/>
             </w:tcBorders>
           </w:tcPr>
@@ -31666,9 +31680,9 @@
         <w:tc>
           <w:tcPr>
             <w:tcBorders>
-              <w:left w:val="single" w:sz="4" w:color="D9E1E8"/>
-              <w:right w:val="single" w:sz="4" w:color="D9E1E8"/>
-              <w:top w:val="single" w:sz="4" w:color="D9E1E8"/>
+              <w:left w:val="nil"/>
+              <w:right w:val="nil"/>
+              <w:top w:val="nil"/>
               <w:bottom w:val="single" w:sz="4" w:color="D9E1E8"/>
             </w:tcBorders>
           </w:tcPr>
@@ -31693,9 +31707,9 @@
         <w:tc>
           <w:tcPr>
             <w:tcBorders>
-              <w:left w:val="single" w:sz="4" w:color="D9E1E8"/>
-              <w:right w:val="single" w:sz="4" w:color="D9E1E8"/>
-              <w:top w:val="single" w:sz="4" w:color="D9E1E8"/>
+              <w:left w:val="nil"/>
+              <w:right w:val="nil"/>
+              <w:top w:val="nil"/>
               <w:bottom w:val="single" w:sz="4" w:color="D9E1E8"/>
             </w:tcBorders>
           </w:tcPr>
@@ -31720,9 +31734,9 @@
         <w:tc>
           <w:tcPr>
             <w:tcBorders>
-              <w:left w:val="single" w:sz="4" w:color="D9E1E8"/>
-              <w:right w:val="single" w:sz="4" w:color="D9E1E8"/>
-              <w:top w:val="single" w:sz="4" w:color="D9E1E8"/>
+              <w:left w:val="nil"/>
+              <w:right w:val="nil"/>
+              <w:top w:val="nil"/>
               <w:bottom w:val="single" w:sz="4" w:color="D9E1E8"/>
             </w:tcBorders>
           </w:tcPr>
@@ -31749,9 +31763,9 @@
         <w:tc>
           <w:tcPr>
             <w:tcBorders>
-              <w:left w:val="single" w:sz="4" w:color="D9E1E8"/>
-              <w:right w:val="single" w:sz="4" w:color="D9E1E8"/>
-              <w:top w:val="single" w:sz="4" w:color="D9E1E8"/>
+              <w:left w:val="nil"/>
+              <w:right w:val="nil"/>
+              <w:top w:val="nil"/>
               <w:bottom w:val="single" w:sz="4" w:color="D9E1E8"/>
             </w:tcBorders>
           </w:tcPr>
@@ -31776,9 +31790,9 @@
         <w:tc>
           <w:tcPr>
             <w:tcBorders>
-              <w:left w:val="single" w:sz="4" w:color="D9E1E8"/>
-              <w:right w:val="single" w:sz="4" w:color="D9E1E8"/>
-              <w:top w:val="single" w:sz="4" w:color="D9E1E8"/>
+              <w:left w:val="nil"/>
+              <w:right w:val="nil"/>
+              <w:top w:val="nil"/>
               <w:bottom w:val="single" w:sz="4" w:color="D9E1E8"/>
             </w:tcBorders>
           </w:tcPr>
@@ -31803,9 +31817,9 @@
         <w:tc>
           <w:tcPr>
             <w:tcBorders>
-              <w:left w:val="single" w:sz="4" w:color="D9E1E8"/>
-              <w:right w:val="single" w:sz="4" w:color="D9E1E8"/>
-              <w:top w:val="single" w:sz="4" w:color="D9E1E8"/>
+              <w:left w:val="nil"/>
+              <w:right w:val="nil"/>
+              <w:top w:val="nil"/>
               <w:bottom w:val="single" w:sz="4" w:color="D9E1E8"/>
             </w:tcBorders>
           </w:tcPr>
@@ -31830,9 +31844,9 @@
         <w:tc>
           <w:tcPr>
             <w:tcBorders>
-              <w:left w:val="single" w:sz="4" w:color="D9E1E8"/>
-              <w:right w:val="single" w:sz="4" w:color="D9E1E8"/>
-              <w:top w:val="single" w:sz="4" w:color="D9E1E8"/>
+              <w:left w:val="nil"/>
+              <w:right w:val="nil"/>
+              <w:top w:val="nil"/>
               <w:bottom w:val="single" w:sz="4" w:color="D9E1E8"/>
             </w:tcBorders>
           </w:tcPr>
@@ -31859,9 +31873,9 @@
         <w:tc>
           <w:tcPr>
             <w:tcBorders>
-              <w:left w:val="single" w:sz="4" w:color="D9E1E8"/>
-              <w:right w:val="single" w:sz="4" w:color="D9E1E8"/>
-              <w:top w:val="single" w:sz="4" w:color="D9E1E8"/>
+              <w:left w:val="nil"/>
+              <w:right w:val="nil"/>
+              <w:top w:val="nil"/>
               <w:bottom w:val="single" w:sz="4" w:color="D9E1E8"/>
             </w:tcBorders>
           </w:tcPr>
@@ -31886,9 +31900,9 @@
         <w:tc>
           <w:tcPr>
             <w:tcBorders>
-              <w:left w:val="single" w:sz="4" w:color="D9E1E8"/>
-              <w:right w:val="single" w:sz="4" w:color="D9E1E8"/>
-              <w:top w:val="single" w:sz="4" w:color="D9E1E8"/>
+              <w:left w:val="nil"/>
+              <w:right w:val="nil"/>
+              <w:top w:val="nil"/>
               <w:bottom w:val="single" w:sz="4" w:color="D9E1E8"/>
             </w:tcBorders>
           </w:tcPr>
@@ -31913,9 +31927,9 @@
         <w:tc>
           <w:tcPr>
             <w:tcBorders>
-              <w:left w:val="single" w:sz="4" w:color="D9E1E8"/>
-              <w:right w:val="single" w:sz="4" w:color="D9E1E8"/>
-              <w:top w:val="single" w:sz="4" w:color="D9E1E8"/>
+              <w:left w:val="nil"/>
+              <w:right w:val="nil"/>
+              <w:top w:val="nil"/>
               <w:bottom w:val="single" w:sz="4" w:color="D9E1E8"/>
             </w:tcBorders>
           </w:tcPr>
@@ -31940,9 +31954,9 @@
         <w:tc>
           <w:tcPr>
             <w:tcBorders>
-              <w:left w:val="single" w:sz="4" w:color="D9E1E8"/>
-              <w:right w:val="single" w:sz="4" w:color="D9E1E8"/>
-              <w:top w:val="single" w:sz="4" w:color="D9E1E8"/>
+              <w:left w:val="nil"/>
+              <w:right w:val="nil"/>
+              <w:top w:val="nil"/>
               <w:bottom w:val="single" w:sz="4" w:color="D9E1E8"/>
             </w:tcBorders>
           </w:tcPr>
@@ -31969,9 +31983,9 @@
         <w:tc>
           <w:tcPr>
             <w:tcBorders>
-              <w:left w:val="single" w:sz="4" w:color="D9E1E8"/>
-              <w:right w:val="single" w:sz="4" w:color="D9E1E8"/>
-              <w:top w:val="single" w:sz="4" w:color="D9E1E8"/>
+              <w:left w:val="nil"/>
+              <w:right w:val="nil"/>
+              <w:top w:val="nil"/>
               <w:bottom w:val="single" w:sz="4" w:color="D9E1E8"/>
             </w:tcBorders>
           </w:tcPr>
@@ -31996,9 +32010,9 @@
         <w:tc>
           <w:tcPr>
             <w:tcBorders>
-              <w:left w:val="single" w:sz="4" w:color="D9E1E8"/>
-              <w:right w:val="single" w:sz="4" w:color="D9E1E8"/>
-              <w:top w:val="single" w:sz="4" w:color="D9E1E8"/>
+              <w:left w:val="nil"/>
+              <w:right w:val="nil"/>
+              <w:top w:val="nil"/>
               <w:bottom w:val="single" w:sz="4" w:color="D9E1E8"/>
             </w:tcBorders>
           </w:tcPr>
@@ -32023,9 +32037,9 @@
         <w:tc>
           <w:tcPr>
             <w:tcBorders>
-              <w:left w:val="single" w:sz="4" w:color="D9E1E8"/>
-              <w:right w:val="single" w:sz="4" w:color="D9E1E8"/>
-              <w:top w:val="single" w:sz="4" w:color="D9E1E8"/>
+              <w:left w:val="nil"/>
+              <w:right w:val="nil"/>
+              <w:top w:val="nil"/>
               <w:bottom w:val="single" w:sz="4" w:color="D9E1E8"/>
             </w:tcBorders>
           </w:tcPr>
@@ -32050,9 +32064,9 @@
         <w:tc>
           <w:tcPr>
             <w:tcBorders>
-              <w:left w:val="single" w:sz="4" w:color="D9E1E8"/>
-              <w:right w:val="single" w:sz="4" w:color="D9E1E8"/>
-              <w:top w:val="single" w:sz="4" w:color="D9E1E8"/>
+              <w:left w:val="nil"/>
+              <w:right w:val="nil"/>
+              <w:top w:val="nil"/>
               <w:bottom w:val="single" w:sz="4" w:color="D9E1E8"/>
             </w:tcBorders>
           </w:tcPr>
@@ -32079,9 +32093,9 @@
         <w:tc>
           <w:tcPr>
             <w:tcBorders>
-              <w:left w:val="single" w:sz="4" w:color="D9E1E8"/>
-              <w:right w:val="single" w:sz="4" w:color="D9E1E8"/>
-              <w:top w:val="single" w:sz="4" w:color="D9E1E8"/>
+              <w:left w:val="nil"/>
+              <w:right w:val="nil"/>
+              <w:top w:val="nil"/>
               <w:bottom w:val="single" w:sz="4" w:color="D9E1E8"/>
             </w:tcBorders>
           </w:tcPr>
@@ -32106,9 +32120,9 @@
         <w:tc>
           <w:tcPr>
             <w:tcBorders>
-              <w:left w:val="single" w:sz="4" w:color="D9E1E8"/>
-              <w:right w:val="single" w:sz="4" w:color="D9E1E8"/>
-              <w:top w:val="single" w:sz="4" w:color="D9E1E8"/>
+              <w:left w:val="nil"/>
+              <w:right w:val="nil"/>
+              <w:top w:val="nil"/>
               <w:bottom w:val="single" w:sz="4" w:color="D9E1E8"/>
             </w:tcBorders>
           </w:tcPr>
@@ -32133,9 +32147,9 @@
         <w:tc>
           <w:tcPr>
             <w:tcBorders>
-              <w:left w:val="single" w:sz="4" w:color="D9E1E8"/>
-              <w:right w:val="single" w:sz="4" w:color="D9E1E8"/>
-              <w:top w:val="single" w:sz="4" w:color="D9E1E8"/>
+              <w:left w:val="nil"/>
+              <w:right w:val="nil"/>
+              <w:top w:val="nil"/>
               <w:bottom w:val="single" w:sz="4" w:color="D9E1E8"/>
             </w:tcBorders>
           </w:tcPr>
@@ -32160,9 +32174,9 @@
         <w:tc>
           <w:tcPr>
             <w:tcBorders>
-              <w:left w:val="single" w:sz="4" w:color="D9E1E8"/>
-              <w:right w:val="single" w:sz="4" w:color="D9E1E8"/>
-              <w:top w:val="single" w:sz="4" w:color="D9E1E8"/>
+              <w:left w:val="nil"/>
+              <w:right w:val="nil"/>
+              <w:top w:val="nil"/>
               <w:bottom w:val="single" w:sz="4" w:color="D9E1E8"/>
             </w:tcBorders>
           </w:tcPr>
@@ -32189,9 +32203,9 @@
         <w:tc>
           <w:tcPr>
             <w:tcBorders>
-              <w:left w:val="single" w:sz="4" w:color="D9E1E8"/>
-              <w:right w:val="single" w:sz="4" w:color="D9E1E8"/>
-              <w:top w:val="single" w:sz="4" w:color="D9E1E8"/>
+              <w:left w:val="nil"/>
+              <w:right w:val="nil"/>
+              <w:top w:val="nil"/>
               <w:bottom w:val="single" w:sz="4" w:color="D9E1E8"/>
             </w:tcBorders>
           </w:tcPr>
@@ -32216,9 +32230,9 @@
         <w:tc>
           <w:tcPr>
             <w:tcBorders>
-              <w:left w:val="single" w:sz="4" w:color="D9E1E8"/>
-              <w:right w:val="single" w:sz="4" w:color="D9E1E8"/>
-              <w:top w:val="single" w:sz="4" w:color="D9E1E8"/>
+              <w:left w:val="nil"/>
+              <w:right w:val="nil"/>
+              <w:top w:val="nil"/>
               <w:bottom w:val="single" w:sz="4" w:color="D9E1E8"/>
             </w:tcBorders>
           </w:tcPr>
@@ -32243,9 +32257,9 @@
         <w:tc>
           <w:tcPr>
             <w:tcBorders>
-              <w:left w:val="single" w:sz="4" w:color="D9E1E8"/>
-              <w:right w:val="single" w:sz="4" w:color="D9E1E8"/>
-              <w:top w:val="single" w:sz="4" w:color="D9E1E8"/>
+              <w:left w:val="nil"/>
+              <w:right w:val="nil"/>
+              <w:top w:val="nil"/>
               <w:bottom w:val="single" w:sz="4" w:color="D9E1E8"/>
             </w:tcBorders>
           </w:tcPr>
@@ -32270,9 +32284,9 @@
         <w:tc>
           <w:tcPr>
             <w:tcBorders>
-              <w:left w:val="single" w:sz="4" w:color="D9E1E8"/>
-              <w:right w:val="single" w:sz="4" w:color="D9E1E8"/>
-              <w:top w:val="single" w:sz="4" w:color="D9E1E8"/>
+              <w:left w:val="nil"/>
+              <w:right w:val="nil"/>
+              <w:top w:val="nil"/>
               <w:bottom w:val="single" w:sz="4" w:color="D9E1E8"/>
             </w:tcBorders>
           </w:tcPr>
@@ -32299,9 +32313,9 @@
         <w:tc>
           <w:tcPr>
             <w:tcBorders>
-              <w:left w:val="single" w:sz="4" w:color="D9E1E8"/>
-              <w:right w:val="single" w:sz="4" w:color="D9E1E8"/>
-              <w:top w:val="single" w:sz="4" w:color="D9E1E8"/>
+              <w:left w:val="nil"/>
+              <w:right w:val="nil"/>
+              <w:top w:val="nil"/>
               <w:bottom w:val="nil"/>
             </w:tcBorders>
           </w:tcPr>
@@ -32342,9 +32356,9 @@
         <w:tc>
           <w:tcPr>
             <w:tcBorders>
-              <w:left w:val="single" w:sz="4" w:color="D9E1E8"/>
-              <w:right w:val="single" w:sz="4" w:color="D9E1E8"/>
-              <w:top w:val="single" w:sz="4" w:color="D9E1E8"/>
+              <w:left w:val="nil"/>
+              <w:right w:val="nil"/>
+              <w:top w:val="nil"/>
               <w:bottom w:val="nil"/>
             </w:tcBorders>
           </w:tcPr>
@@ -32371,9 +32385,9 @@
         <w:tc>
           <w:tcPr>
             <w:tcBorders>
-              <w:left w:val="single" w:sz="4" w:color="D9E1E8"/>
-              <w:right w:val="single" w:sz="4" w:color="D9E1E8"/>
-              <w:top w:val="single" w:sz="4" w:color="D9E1E8"/>
+              <w:left w:val="nil"/>
+              <w:right w:val="nil"/>
+              <w:top w:val="nil"/>
               <w:bottom w:val="nil"/>
             </w:tcBorders>
           </w:tcPr>
@@ -32400,9 +32414,9 @@
         <w:tc>
           <w:tcPr>
             <w:tcBorders>
-              <w:left w:val="single" w:sz="4" w:color="D9E1E8"/>
-              <w:right w:val="single" w:sz="4" w:color="D9E1E8"/>
-              <w:top w:val="single" w:sz="4" w:color="D9E1E8"/>
+              <w:left w:val="nil"/>
+              <w:right w:val="nil"/>
+              <w:top w:val="nil"/>
               <w:bottom w:val="nil"/>
             </w:tcBorders>
           </w:tcPr>
@@ -33039,18 +33053,18 @@
           <wp:inline>
             <wp:extent cx="5937504" cy="3846576"/>
             <wp:effectExtent b="0" l="0" r="0" t="0"/>
-            <wp:docPr descr="recovery versus horizon" title="" id="73" name="Picture"/>
+            <wp:docPr descr="recovery versus horizon" title="" id="74" name="Picture"/>
             <a:graphic>
               <a:graphicData uri="http://schemas.openxmlformats.org/drawingml/2006/picture">
                 <pic:pic>
                   <pic:nvPicPr>
-                    <pic:cNvPr descr="figures/F_recoveryT.png" id="74" name="Picture"/>
+                    <pic:cNvPr descr="figures/F_recoveryT.png" id="75" name="Picture"/>
                     <pic:cNvPicPr>
                       <a:picLocks noChangeArrowheads="1" noChangeAspect="1"/>
                     </pic:cNvPicPr>
                   </pic:nvPicPr>
                   <pic:blipFill>
-                    <a:blip r:embed="rId72"/>
+                    <a:blip r:embed="rId73"/>
                     <a:stretch>
                       <a:fillRect/>
                     </a:stretch>
@@ -33294,8 +33308,8 @@
         <w:t xml:space="preserve">(dotted), where graded recovery already yields accurate ranking. Means with bootstrap 95% CIs over 16 seeds.</w:t>
       </w:r>
     </w:p>
-    <w:bookmarkEnd w:id="75"/>
     <w:bookmarkEnd w:id="76"/>
+    <w:bookmarkEnd w:id="77"/>
     <w:sectPr>
       <w:footerReference w:type="default" r:id="rId11"/>
       <w:pgSz w:h="15840" w:w="12240"/>

</xml_diff>